<commit_message>
mise à jour publications et ajout contexte dans rapport
</commit_message>
<xml_diff>
--- a/reports/presentation_Covid_Liora.docx
+++ b/reports/presentation_Covid_Liora.docx
@@ -7,6 +7,7 @@
         <w:tabs>
           <w:tab w:val="left" w:pos="1318"/>
         </w:tabs>
+        <w:spacing w:line="360" w:lineRule="auto"/>
         <w:rPr>
           <w:rFonts w:eastAsia="MS Mincho"/>
         </w:rPr>
@@ -49,6 +50,7 @@
           </w:tcPr>
           <w:p>
             <w:pPr>
+              <w:spacing w:line="360" w:lineRule="auto"/>
               <w:ind w:left="209" w:firstLine="209"/>
             </w:pPr>
           </w:p>
@@ -65,6 +67,7 @@
           <w:p>
             <w:pPr>
               <w:pStyle w:val="Paragraphe"/>
+              <w:spacing w:line="360" w:lineRule="auto"/>
               <w:jc w:val="center"/>
               <w:rPr>
                 <w:b/>
@@ -82,7 +85,7 @@
                 <w:color w:val="FFFFFF" w:themeColor="background1"/>
               </w:rPr>
               <w:drawing>
-                <wp:anchor distT="0" distB="0" distL="114300" distR="114300" simplePos="0" relativeHeight="251660288" behindDoc="1" locked="0" layoutInCell="1" allowOverlap="1" wp14:anchorId="4D60BEFB" wp14:editId="4886A654">
+                <wp:anchor distT="0" distB="0" distL="114300" distR="114300" simplePos="0" relativeHeight="251660288" behindDoc="1" locked="0" layoutInCell="1" allowOverlap="1" wp14:anchorId="4D60BEFB" wp14:editId="1123247C">
                   <wp:simplePos x="0" y="0"/>
                   <wp:positionH relativeFrom="column">
                     <wp:posOffset>-57149</wp:posOffset>
@@ -168,6 +171,7 @@
           <w:p>
             <w:pPr>
               <w:pStyle w:val="Paragraphe18ptsGras"/>
+              <w:spacing w:line="360" w:lineRule="auto"/>
               <w:rPr>
                 <w:bCs/>
                 <w:color w:val="FFFFFF" w:themeColor="background1"/>
@@ -188,6 +192,7 @@
           <w:p>
             <w:pPr>
               <w:pStyle w:val="Paragraphe18ptsGras"/>
+              <w:spacing w:line="360" w:lineRule="auto"/>
               <w:rPr>
                 <w:bCs/>
                 <w:color w:val="FFFFFF" w:themeColor="background1"/>
@@ -199,6 +204,7 @@
           <w:p>
             <w:pPr>
               <w:pStyle w:val="Paragraphe18ptsGras"/>
+              <w:spacing w:line="360" w:lineRule="auto"/>
               <w:rPr>
                 <w:bCs/>
                 <w:color w:val="FFFFFF" w:themeColor="background1"/>
@@ -229,6 +235,7 @@
           <w:p>
             <w:pPr>
               <w:pStyle w:val="Paragraphe18ptsGras"/>
+              <w:spacing w:line="360" w:lineRule="auto"/>
               <w:jc w:val="both"/>
               <w:rPr>
                 <w:sz w:val="28"/>
@@ -242,11 +249,13 @@
     <w:p>
       <w:pPr>
         <w:pStyle w:val="Paragraphe14ptGras"/>
+        <w:spacing w:line="360" w:lineRule="auto"/>
       </w:pPr>
     </w:p>
     <w:p>
       <w:pPr>
         <w:pStyle w:val="Paragraphe14ptGras"/>
+        <w:spacing w:line="360" w:lineRule="auto"/>
       </w:pPr>
       <w:r>
         <w:br w:type="textWrapping" w:clear="all"/>
@@ -289,6 +298,7 @@
           <w:p>
             <w:pPr>
               <w:pStyle w:val="ColumnCellCentered"/>
+              <w:spacing w:line="360" w:lineRule="auto"/>
               <w:ind w:left="82" w:hanging="82"/>
             </w:pPr>
             <w:r>
@@ -309,6 +319,7 @@
           <w:p>
             <w:pPr>
               <w:pStyle w:val="ColumnCellCentered"/>
+              <w:spacing w:line="360" w:lineRule="auto"/>
             </w:pPr>
           </w:p>
         </w:tc>
@@ -325,6 +336,7 @@
           <w:p>
             <w:pPr>
               <w:pStyle w:val="ColumnCellCentered"/>
+              <w:spacing w:line="360" w:lineRule="auto"/>
             </w:pPr>
           </w:p>
         </w:tc>
@@ -341,6 +353,7 @@
           <w:p>
             <w:pPr>
               <w:pStyle w:val="ColumnCellCentered"/>
+              <w:spacing w:line="360" w:lineRule="auto"/>
             </w:pPr>
           </w:p>
         </w:tc>
@@ -363,6 +376,7 @@
           <w:p>
             <w:pPr>
               <w:pStyle w:val="ColumnCellCentered"/>
+              <w:spacing w:line="360" w:lineRule="auto"/>
               <w:ind w:left="82" w:hanging="82"/>
             </w:pPr>
           </w:p>
@@ -380,6 +394,7 @@
           <w:p>
             <w:pPr>
               <w:pStyle w:val="ColumnCellCentered"/>
+              <w:spacing w:line="360" w:lineRule="auto"/>
             </w:pPr>
           </w:p>
         </w:tc>
@@ -396,6 +411,7 @@
           <w:p>
             <w:pPr>
               <w:pStyle w:val="ColumnCellCentered"/>
+              <w:spacing w:line="360" w:lineRule="auto"/>
             </w:pPr>
           </w:p>
         </w:tc>
@@ -412,6 +428,7 @@
           <w:p>
             <w:pPr>
               <w:pStyle w:val="ColumnCell"/>
+              <w:spacing w:line="360" w:lineRule="auto"/>
             </w:pPr>
           </w:p>
         </w:tc>
@@ -434,6 +451,7 @@
           <w:p>
             <w:pPr>
               <w:pStyle w:val="ColumnCellCentered"/>
+              <w:spacing w:line="360" w:lineRule="auto"/>
               <w:ind w:left="82" w:hanging="82"/>
             </w:pPr>
           </w:p>
@@ -451,6 +469,7 @@
           <w:p>
             <w:pPr>
               <w:pStyle w:val="ColumnCellCentered"/>
+              <w:spacing w:line="360" w:lineRule="auto"/>
             </w:pPr>
           </w:p>
         </w:tc>
@@ -467,6 +486,7 @@
           <w:p>
             <w:pPr>
               <w:pStyle w:val="ColumnCellCentered"/>
+              <w:spacing w:line="360" w:lineRule="auto"/>
             </w:pPr>
           </w:p>
         </w:tc>
@@ -483,6 +503,7 @@
           <w:p>
             <w:pPr>
               <w:pStyle w:val="ColumnCell"/>
+              <w:spacing w:line="360" w:lineRule="auto"/>
             </w:pPr>
           </w:p>
         </w:tc>
@@ -505,6 +526,7 @@
           <w:p>
             <w:pPr>
               <w:pStyle w:val="ColumnCellCentered"/>
+              <w:spacing w:line="360" w:lineRule="auto"/>
               <w:ind w:left="82" w:hanging="82"/>
             </w:pPr>
           </w:p>
@@ -522,6 +544,7 @@
           <w:p>
             <w:pPr>
               <w:pStyle w:val="ColumnCellCentered"/>
+              <w:spacing w:line="360" w:lineRule="auto"/>
             </w:pPr>
           </w:p>
         </w:tc>
@@ -538,6 +561,7 @@
           <w:p>
             <w:pPr>
               <w:pStyle w:val="ColumnCellCentered"/>
+              <w:spacing w:line="360" w:lineRule="auto"/>
             </w:pPr>
           </w:p>
         </w:tc>
@@ -554,6 +578,7 @@
           <w:p>
             <w:pPr>
               <w:pStyle w:val="ColumnCell"/>
+              <w:spacing w:line="360" w:lineRule="auto"/>
             </w:pPr>
           </w:p>
         </w:tc>
@@ -576,6 +601,7 @@
           <w:p>
             <w:pPr>
               <w:pStyle w:val="ColumnCellCentered"/>
+              <w:spacing w:line="360" w:lineRule="auto"/>
               <w:ind w:left="82" w:hanging="82"/>
             </w:pPr>
           </w:p>
@@ -593,6 +619,7 @@
           <w:p>
             <w:pPr>
               <w:pStyle w:val="ColumnCellCentered"/>
+              <w:spacing w:line="360" w:lineRule="auto"/>
             </w:pPr>
           </w:p>
         </w:tc>
@@ -609,6 +636,7 @@
           <w:p>
             <w:pPr>
               <w:pStyle w:val="ColumnCellCentered"/>
+              <w:spacing w:line="360" w:lineRule="auto"/>
             </w:pPr>
           </w:p>
         </w:tc>
@@ -625,6 +653,7 @@
           <w:p>
             <w:pPr>
               <w:pStyle w:val="ColumnCell"/>
+              <w:spacing w:line="360" w:lineRule="auto"/>
             </w:pPr>
           </w:p>
         </w:tc>
@@ -647,6 +676,7 @@
           <w:p>
             <w:pPr>
               <w:pStyle w:val="ColumnCellCentered"/>
+              <w:spacing w:line="360" w:lineRule="auto"/>
               <w:ind w:left="82" w:hanging="82"/>
             </w:pPr>
           </w:p>
@@ -664,6 +694,7 @@
           <w:p>
             <w:pPr>
               <w:pStyle w:val="ColumnCellCentered"/>
+              <w:spacing w:line="360" w:lineRule="auto"/>
             </w:pPr>
           </w:p>
         </w:tc>
@@ -680,6 +711,7 @@
           <w:p>
             <w:pPr>
               <w:pStyle w:val="ColumnCellCentered"/>
+              <w:spacing w:line="360" w:lineRule="auto"/>
             </w:pPr>
           </w:p>
         </w:tc>
@@ -696,6 +728,7 @@
           <w:p>
             <w:pPr>
               <w:pStyle w:val="ColumnCell"/>
+              <w:spacing w:line="360" w:lineRule="auto"/>
             </w:pPr>
           </w:p>
         </w:tc>
@@ -704,16 +737,18 @@
     <w:p>
       <w:pPr>
         <w:pStyle w:val="Paragraphe"/>
+        <w:spacing w:line="360" w:lineRule="auto"/>
       </w:pPr>
     </w:p>
     <w:p>
       <w:pPr>
         <w:pStyle w:val="Paragraphe"/>
+        <w:spacing w:line="360" w:lineRule="auto"/>
       </w:pPr>
     </w:p>
     <w:p>
       <w:pPr>
-        <w:spacing w:before="120" w:after="0"/>
+        <w:spacing w:before="120" w:after="0" w:line="360" w:lineRule="auto"/>
         <w:ind w:firstLine="0"/>
       </w:pPr>
       <w:r>
@@ -723,6 +758,7 @@
     <w:p>
       <w:pPr>
         <w:pStyle w:val="ColumnTitle"/>
+        <w:spacing w:line="360" w:lineRule="auto"/>
         <w:outlineLvl w:val="0"/>
       </w:pPr>
     </w:p>
@@ -763,6 +799,7 @@
           <w:p>
             <w:pPr>
               <w:pStyle w:val="ColumnCellCentered"/>
+              <w:spacing w:line="360" w:lineRule="auto"/>
             </w:pPr>
             <w:r>
               <w:t>Version</w:t>
@@ -782,6 +819,7 @@
           <w:p>
             <w:pPr>
               <w:pStyle w:val="ColumnCellCentered"/>
+              <w:spacing w:line="360" w:lineRule="auto"/>
             </w:pPr>
             <w:r>
               <w:t>Date</w:t>
@@ -801,14 +839,10 @@
           <w:p>
             <w:pPr>
               <w:pStyle w:val="ColumnCellCentered"/>
+              <w:spacing w:line="360" w:lineRule="auto"/>
             </w:pPr>
-            <w:proofErr w:type="gramStart"/>
             <w:r>
-              <w:t>n</w:t>
-            </w:r>
-            <w:proofErr w:type="gramEnd"/>
-            <w:r>
-              <w:t>° page</w:t>
+              <w:t>n° page</w:t>
             </w:r>
           </w:p>
         </w:tc>
@@ -825,6 +859,7 @@
           <w:p>
             <w:pPr>
               <w:pStyle w:val="ColumnCellCentered"/>
+              <w:spacing w:line="360" w:lineRule="auto"/>
             </w:pPr>
             <w:r>
               <w:t>Description de la modification</w:t>
@@ -850,6 +885,7 @@
           <w:p>
             <w:pPr>
               <w:pStyle w:val="ColumnCellCentered"/>
+              <w:spacing w:line="360" w:lineRule="auto"/>
             </w:pPr>
             <w:r>
               <w:t>001</w:t>
@@ -869,6 +905,7 @@
           <w:p>
             <w:pPr>
               <w:pStyle w:val="ColumnCellCentered"/>
+              <w:spacing w:line="360" w:lineRule="auto"/>
             </w:pPr>
           </w:p>
         </w:tc>
@@ -885,6 +922,7 @@
           <w:p>
             <w:pPr>
               <w:pStyle w:val="ColumnCellCentered"/>
+              <w:spacing w:line="360" w:lineRule="auto"/>
             </w:pPr>
           </w:p>
         </w:tc>
@@ -901,6 +939,7 @@
           <w:p>
             <w:pPr>
               <w:pStyle w:val="ColumnCell"/>
+              <w:spacing w:line="360" w:lineRule="auto"/>
             </w:pPr>
           </w:p>
         </w:tc>
@@ -923,6 +962,7 @@
           <w:p>
             <w:pPr>
               <w:pStyle w:val="ColumnCellCentered"/>
+              <w:spacing w:line="360" w:lineRule="auto"/>
             </w:pPr>
           </w:p>
         </w:tc>
@@ -939,6 +979,7 @@
           <w:p>
             <w:pPr>
               <w:pStyle w:val="ColumnCellCentered"/>
+              <w:spacing w:line="360" w:lineRule="auto"/>
             </w:pPr>
           </w:p>
         </w:tc>
@@ -955,6 +996,7 @@
           <w:p>
             <w:pPr>
               <w:pStyle w:val="ColumnCellCentered"/>
+              <w:spacing w:line="360" w:lineRule="auto"/>
             </w:pPr>
           </w:p>
         </w:tc>
@@ -971,6 +1013,7 @@
           <w:p>
             <w:pPr>
               <w:pStyle w:val="ColumnCell"/>
+              <w:spacing w:line="360" w:lineRule="auto"/>
             </w:pPr>
           </w:p>
         </w:tc>
@@ -993,6 +1036,7 @@
           <w:p>
             <w:pPr>
               <w:pStyle w:val="ColumnCellCentered"/>
+              <w:spacing w:line="360" w:lineRule="auto"/>
             </w:pPr>
           </w:p>
         </w:tc>
@@ -1009,6 +1053,7 @@
           <w:p>
             <w:pPr>
               <w:pStyle w:val="ColumnCellCentered"/>
+              <w:spacing w:line="360" w:lineRule="auto"/>
             </w:pPr>
           </w:p>
         </w:tc>
@@ -1025,6 +1070,7 @@
           <w:p>
             <w:pPr>
               <w:pStyle w:val="ColumnCellCentered"/>
+              <w:spacing w:line="360" w:lineRule="auto"/>
             </w:pPr>
           </w:p>
         </w:tc>
@@ -1041,6 +1087,7 @@
           <w:p>
             <w:pPr>
               <w:pStyle w:val="ColumnCell"/>
+              <w:spacing w:line="360" w:lineRule="auto"/>
             </w:pPr>
           </w:p>
         </w:tc>
@@ -1063,6 +1110,7 @@
           <w:p>
             <w:pPr>
               <w:pStyle w:val="ColumnCellCentered"/>
+              <w:spacing w:line="360" w:lineRule="auto"/>
             </w:pPr>
           </w:p>
         </w:tc>
@@ -1079,6 +1127,7 @@
           <w:p>
             <w:pPr>
               <w:pStyle w:val="ColumnCellCentered"/>
+              <w:spacing w:line="360" w:lineRule="auto"/>
             </w:pPr>
           </w:p>
         </w:tc>
@@ -1095,6 +1144,7 @@
           <w:p>
             <w:pPr>
               <w:pStyle w:val="ColumnCellCentered"/>
+              <w:spacing w:line="360" w:lineRule="auto"/>
             </w:pPr>
           </w:p>
         </w:tc>
@@ -1111,6 +1161,7 @@
           <w:p>
             <w:pPr>
               <w:pStyle w:val="ColumnCell"/>
+              <w:spacing w:line="360" w:lineRule="auto"/>
             </w:pPr>
           </w:p>
         </w:tc>
@@ -1133,6 +1184,7 @@
           <w:p>
             <w:pPr>
               <w:pStyle w:val="ColumnCellCentered"/>
+              <w:spacing w:line="360" w:lineRule="auto"/>
             </w:pPr>
           </w:p>
         </w:tc>
@@ -1149,6 +1201,7 @@
           <w:p>
             <w:pPr>
               <w:pStyle w:val="ColumnCellCentered"/>
+              <w:spacing w:line="360" w:lineRule="auto"/>
             </w:pPr>
           </w:p>
         </w:tc>
@@ -1165,6 +1218,7 @@
           <w:p>
             <w:pPr>
               <w:pStyle w:val="ColumnCellCentered"/>
+              <w:spacing w:line="360" w:lineRule="auto"/>
             </w:pPr>
           </w:p>
         </w:tc>
@@ -1181,6 +1235,7 @@
           <w:p>
             <w:pPr>
               <w:pStyle w:val="ColumnCell"/>
+              <w:spacing w:line="360" w:lineRule="auto"/>
             </w:pPr>
           </w:p>
         </w:tc>
@@ -1189,10 +1244,12 @@
     <w:p>
       <w:pPr>
         <w:pStyle w:val="Paragraphe"/>
+        <w:spacing w:line="360" w:lineRule="auto"/>
       </w:pPr>
     </w:p>
     <w:p>
       <w:pPr>
+        <w:spacing w:line="360" w:lineRule="auto"/>
         <w:ind w:firstLine="0"/>
         <w:sectPr>
           <w:headerReference w:type="even" r:id="rId9"/>
@@ -1238,6 +1295,7 @@
         <w:p>
           <w:pPr>
             <w:pStyle w:val="TM1"/>
+            <w:spacing w:line="360" w:lineRule="auto"/>
             <w:rPr>
               <w:rFonts w:asciiTheme="minorHAnsi" w:eastAsiaTheme="minorEastAsia" w:hAnsiTheme="minorHAnsi" w:cstheme="minorBidi"/>
               <w:b w:val="0"/>
@@ -1331,6 +1389,7 @@
         <w:p>
           <w:pPr>
             <w:pStyle w:val="TM2"/>
+            <w:spacing w:line="360" w:lineRule="auto"/>
             <w:rPr>
               <w:rFonts w:asciiTheme="minorHAnsi" w:eastAsiaTheme="minorEastAsia" w:hAnsiTheme="minorHAnsi" w:cstheme="minorBidi"/>
               <w:smallCaps w:val="0"/>
@@ -1410,6 +1469,7 @@
         <w:p>
           <w:pPr>
             <w:pStyle w:val="TM2"/>
+            <w:spacing w:line="360" w:lineRule="auto"/>
             <w:rPr>
               <w:rFonts w:asciiTheme="minorHAnsi" w:eastAsiaTheme="minorEastAsia" w:hAnsiTheme="minorHAnsi" w:cstheme="minorBidi"/>
               <w:smallCaps w:val="0"/>
@@ -1489,6 +1549,7 @@
         <w:p>
           <w:pPr>
             <w:pStyle w:val="TM2"/>
+            <w:spacing w:line="360" w:lineRule="auto"/>
             <w:rPr>
               <w:rFonts w:asciiTheme="minorHAnsi" w:eastAsiaTheme="minorEastAsia" w:hAnsiTheme="minorHAnsi" w:cstheme="minorBidi"/>
               <w:smallCaps w:val="0"/>
@@ -1572,6 +1633,7 @@
               <w:tab w:val="left" w:pos="1540"/>
               <w:tab w:val="right" w:leader="dot" w:pos="9912"/>
             </w:tabs>
+            <w:spacing w:line="360" w:lineRule="auto"/>
             <w:rPr>
               <w:rFonts w:eastAsiaTheme="minorEastAsia" w:cstheme="minorBidi"/>
               <w:i w:val="0"/>
@@ -1668,6 +1730,9 @@
           </w:hyperlink>
         </w:p>
         <w:p>
+          <w:pPr>
+            <w:spacing w:line="360" w:lineRule="auto"/>
+          </w:pPr>
           <w:r>
             <w:rPr>
               <w:b/>
@@ -1680,7 +1745,7 @@
     </w:sdt>
     <w:p>
       <w:pPr>
-        <w:spacing w:before="120" w:after="0"/>
+        <w:spacing w:before="120" w:after="0" w:line="360" w:lineRule="auto"/>
         <w:ind w:firstLine="0"/>
         <w:rPr>
           <w:rFonts w:eastAsiaTheme="majorEastAsia" w:cstheme="majorBidi"/>
@@ -1700,6 +1765,7 @@
     <w:p>
       <w:pPr>
         <w:pStyle w:val="En-ttetablesFR"/>
+        <w:spacing w:line="360" w:lineRule="auto"/>
         <w:jc w:val="left"/>
         <w:rPr>
           <w:rFonts w:asciiTheme="majorHAnsi" w:hAnsiTheme="majorHAnsi"/>
@@ -1727,6 +1793,7 @@
         <w:tabs>
           <w:tab w:val="right" w:leader="dot" w:pos="9912"/>
         </w:tabs>
+        <w:spacing w:line="360" w:lineRule="auto"/>
         <w:rPr>
           <w:rFonts w:eastAsiaTheme="minorEastAsia" w:cstheme="minorBidi"/>
           <w:smallCaps w:val="0"/>
@@ -1809,6 +1876,7 @@
     <w:p>
       <w:pPr>
         <w:pStyle w:val="En-ttetablesFR"/>
+        <w:spacing w:line="360" w:lineRule="auto"/>
       </w:pPr>
       <w:r>
         <w:rPr>
@@ -1853,7 +1921,7 @@
     </w:p>
     <w:p>
       <w:pPr>
-        <w:spacing w:before="120" w:after="0"/>
+        <w:spacing w:before="120" w:after="0" w:line="360" w:lineRule="auto"/>
         <w:ind w:firstLine="0"/>
       </w:pPr>
       <w:bookmarkStart w:id="3" w:name="_Toc408749389"/>
@@ -1876,18 +1944,447 @@
       <w:bookmarkStart w:id="20" w:name="_Toc204483506"/>
       <w:bookmarkStart w:id="21" w:name="_Toc304214571"/>
       <w:bookmarkStart w:id="22" w:name="_Toc522805193"/>
+      <w:r>
+        <w:t>L</w:t>
+      </w:r>
+      <w:r>
+        <w:t>a pandémie de COVID-19, causée par le virus SARS-CoV-2, a représenté l'une des plus importantes crises sanitaires mondiales du XXIᵉ siècle. Depuis son apparition fin 2019, la maladie a entraîné des centaines de millions de cas et plus</w:t>
+      </w:r>
+      <w:r>
+        <w:t xml:space="preserve"> de sept</w:t>
+      </w:r>
+      <w:r>
+        <w:t xml:space="preserve"> millions de décès</w:t>
+      </w:r>
+      <w:r>
+        <w:t xml:space="preserve"> directs</w:t>
+      </w:r>
+      <w:r>
+        <w:t xml:space="preserve"> à travers le monde</w:t>
+      </w:r>
+      <w:r>
+        <w:t xml:space="preserve"> [7]</w:t>
+      </w:r>
+      <w:r>
+        <w:t>, mettant sous tension les systèmes de santé et soulignant l'importance cruciale d'un diagnostic rapide et fiable [1,2]. Le COVID-19 affecte principalement l'appareil respiratoire et peut provoquer des pneumonies sévères, parfois associées à une détresse respiratoire aiguë nécessitant une prise en charge en soins intensifs [2].</w:t>
+      </w:r>
     </w:p>
     <w:p>
       <w:pPr>
-        <w:spacing w:before="120" w:after="0"/>
+        <w:spacing w:before="120" w:after="0" w:line="360" w:lineRule="auto"/>
         <w:ind w:firstLine="0"/>
       </w:pPr>
+      <w:r>
+        <w:t xml:space="preserve">Le diagnostic de référence repose sur la technique RT-PCR (Reverse Transcription Polymerase Chain Reaction), qui permet de détecter le matériel génétique viral. Toutefois, plusieurs études ont mis en évidence certaines limites de cette approche, notamment des délais d'obtention des résultats, une dépendance à la disponibilité des réactifs et une sensibilité parfois insuffisante, particulièrement au début de l'infection [1,2,6]. Des sensibilités comprises entre 60 et 82 % ont notamment été rapportées dans la littérature, exposant au risque </w:t>
+      </w:r>
+      <w:r>
+        <w:t xml:space="preserve">critique </w:t>
+      </w:r>
+      <w:r>
+        <w:t>de faux négatifs [2,6</w:t>
+      </w:r>
+      <w:r>
+        <w:t>,8</w:t>
+      </w:r>
+      <w:r>
+        <w:t>].</w:t>
+      </w:r>
+    </w:p>
+    <w:p>
+      <w:pPr>
+        <w:spacing w:before="120" w:after="0" w:line="360" w:lineRule="auto"/>
+        <w:ind w:firstLine="0"/>
+      </w:pPr>
+      <w:r>
+        <w:t>Dans ce contexte, l'imagerie médicale thoracique s'est imposée comme un outil complémentaire particulièrement intéressant. Les radiographies pulmonaires (Chest X-Ray, CXR) permettent d'observer des anomalies caractéristiques de l'infection telles que les opacités, les consolidations pulmonaires ou encore les atteintes bilatérales des poumons [1,6].</w:t>
+      </w:r>
+    </w:p>
+    <w:p>
+      <w:pPr>
+        <w:spacing w:before="120" w:after="0" w:line="360" w:lineRule="auto"/>
+        <w:ind w:firstLine="0"/>
+      </w:pPr>
+      <w:r>
+        <w:rPr>
+          <w:noProof/>
+        </w:rPr>
+        <mc:AlternateContent>
+          <mc:Choice Requires="wps">
+            <w:drawing>
+              <wp:anchor distT="0" distB="0" distL="114300" distR="114300" simplePos="0" relativeHeight="251663360" behindDoc="1" locked="0" layoutInCell="1" allowOverlap="1" wp14:anchorId="5418A3BE" wp14:editId="67AD710C">
+                <wp:simplePos x="0" y="0"/>
+                <wp:positionH relativeFrom="column">
+                  <wp:posOffset>2779395</wp:posOffset>
+                </wp:positionH>
+                <wp:positionV relativeFrom="paragraph">
+                  <wp:posOffset>146920</wp:posOffset>
+                </wp:positionV>
+                <wp:extent cx="3418840" cy="635"/>
+                <wp:effectExtent l="0" t="0" r="0" b="0"/>
+                <wp:wrapNone/>
+                <wp:docPr id="1508416669" name="Zone de texte 1"/>
+                <wp:cNvGraphicFramePr/>
+                <a:graphic xmlns:a="http://schemas.openxmlformats.org/drawingml/2006/main">
+                  <a:graphicData uri="http://schemas.microsoft.com/office/word/2010/wordprocessingShape">
+                    <wps:wsp>
+                      <wps:cNvSpPr txBox="1"/>
+                      <wps:spPr>
+                        <a:xfrm>
+                          <a:off x="0" y="0"/>
+                          <a:ext cx="3418840" cy="635"/>
+                        </a:xfrm>
+                        <a:prstGeom prst="rect">
+                          <a:avLst/>
+                        </a:prstGeom>
+                        <a:solidFill>
+                          <a:prstClr val="white"/>
+                        </a:solidFill>
+                        <a:ln>
+                          <a:noFill/>
+                        </a:ln>
+                      </wps:spPr>
+                      <wps:txbx>
+                        <w:txbxContent>
+                          <w:p>
+                            <w:pPr>
+                              <w:pStyle w:val="Lgende"/>
+                              <w:jc w:val="both"/>
+                              <w:rPr>
+                                <w:b w:val="0"/>
+                                <w:bCs w:val="0"/>
+                                <w:sz w:val="22"/>
+                              </w:rPr>
+                            </w:pPr>
+                            <w:r>
+                              <w:t xml:space="preserve">Figure </w:t>
+                            </w:r>
+                            <w:fldSimple w:instr=" SEQ Figure \* ARABIC ">
+                              <w:r>
+                                <w:rPr>
+                                  <w:noProof/>
+                                </w:rPr>
+                                <w:t>1</w:t>
+                              </w:r>
+                            </w:fldSimple>
+                            <w:r>
+                              <w:t xml:space="preserve"> : </w:t>
+                            </w:r>
+                            <w:r>
+                              <w:rPr>
+                                <w:b w:val="0"/>
+                                <w:bCs w:val="0"/>
+                              </w:rPr>
+                              <w:t>Exemple de radiographies thoraciques utilisées pour le diagnostic de la COVID-19</w:t>
+                            </w:r>
+                            <w:r>
+                              <w:rPr>
+                                <w:b w:val="0"/>
+                                <w:bCs w:val="0"/>
+                              </w:rPr>
+                              <w:t> :</w:t>
+                            </w:r>
+                            <w:r>
+                              <w:rPr>
+                                <w:b w:val="0"/>
+                                <w:bCs w:val="0"/>
+                              </w:rPr>
+                              <w:t xml:space="preserve"> (A) patient non atteint</w:t>
+                            </w:r>
+                            <w:r>
+                              <w:rPr>
+                                <w:b w:val="0"/>
+                                <w:bCs w:val="0"/>
+                              </w:rPr>
+                              <w:t xml:space="preserve">, </w:t>
+                            </w:r>
+                            <w:r>
+                              <w:rPr>
+                                <w:b w:val="0"/>
+                                <w:bCs w:val="0"/>
+                              </w:rPr>
+                              <w:t>(B) patient atteint présentant des opacités pulmonaires compatibles avec une i</w:t>
+                            </w:r>
+                            <w:r>
+                              <w:rPr>
+                                <w:b w:val="0"/>
+                                <w:bCs w:val="0"/>
+                              </w:rPr>
+                              <w:t>nfection COVID-19 [1].</w:t>
+                            </w:r>
+                          </w:p>
+                        </w:txbxContent>
+                      </wps:txbx>
+                      <wps:bodyPr rot="0" spcFirstLastPara="0" vertOverflow="overflow" horzOverflow="overflow" vert="horz" wrap="square" lIns="0" tIns="0" rIns="0" bIns="0" numCol="1" spcCol="0" rtlCol="0" fromWordArt="0" anchor="t" anchorCtr="0" forceAA="0" compatLnSpc="1">
+                        <a:prstTxWarp prst="textNoShape">
+                          <a:avLst/>
+                        </a:prstTxWarp>
+                        <a:spAutoFit/>
+                      </wps:bodyPr>
+                    </wps:wsp>
+                  </a:graphicData>
+                </a:graphic>
+              </wp:anchor>
+            </w:drawing>
+          </mc:Choice>
+          <mc:Fallback>
+            <w:pict>
+              <v:shapetype w14:anchorId="5418A3BE" id="_x0000_t202" coordsize="21600,21600" o:spt="202" path="m,l,21600r21600,l21600,xe">
+                <v:stroke joinstyle="miter"/>
+                <v:path gradientshapeok="t" o:connecttype="rect"/>
+              </v:shapetype>
+              <v:shape id="Zone de texte 1" o:spid="_x0000_s1026" type="#_x0000_t202" style="position:absolute;left:0;text-align:left;margin-left:218.85pt;margin-top:11.55pt;width:269.2pt;height:.05pt;z-index:-251653120;visibility:visible;mso-wrap-style:square;mso-wrap-distance-left:9pt;mso-wrap-distance-top:0;mso-wrap-distance-right:9pt;mso-wrap-distance-bottom:0;mso-position-horizontal:absolute;mso-position-horizontal-relative:text;mso-position-vertical:absolute;mso-position-vertical-relative:text;v-text-anchor:top" o:gfxdata="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" stroked="f">
+                <v:textbox style="mso-fit-shape-to-text:t" inset="0,0,0,0">
+                  <w:txbxContent>
+                    <w:p>
+                      <w:pPr>
+                        <w:pStyle w:val="Lgende"/>
+                        <w:jc w:val="both"/>
+                        <w:rPr>
+                          <w:b w:val="0"/>
+                          <w:bCs w:val="0"/>
+                          <w:sz w:val="22"/>
+                        </w:rPr>
+                      </w:pPr>
+                      <w:r>
+                        <w:t xml:space="preserve">Figure </w:t>
+                      </w:r>
+                      <w:fldSimple w:instr=" SEQ Figure \* ARABIC ">
+                        <w:r>
+                          <w:rPr>
+                            <w:noProof/>
+                          </w:rPr>
+                          <w:t>1</w:t>
+                        </w:r>
+                      </w:fldSimple>
+                      <w:r>
+                        <w:t xml:space="preserve"> : </w:t>
+                      </w:r>
+                      <w:r>
+                        <w:rPr>
+                          <w:b w:val="0"/>
+                          <w:bCs w:val="0"/>
+                        </w:rPr>
+                        <w:t>Exemple de radiographies thoraciques utilisées pour le diagnostic de la COVID-19</w:t>
+                      </w:r>
+                      <w:r>
+                        <w:rPr>
+                          <w:b w:val="0"/>
+                          <w:bCs w:val="0"/>
+                        </w:rPr>
+                        <w:t> :</w:t>
+                      </w:r>
+                      <w:r>
+                        <w:rPr>
+                          <w:b w:val="0"/>
+                          <w:bCs w:val="0"/>
+                        </w:rPr>
+                        <w:t xml:space="preserve"> (A) patient non atteint</w:t>
+                      </w:r>
+                      <w:r>
+                        <w:rPr>
+                          <w:b w:val="0"/>
+                          <w:bCs w:val="0"/>
+                        </w:rPr>
+                        <w:t xml:space="preserve">, </w:t>
+                      </w:r>
+                      <w:r>
+                        <w:rPr>
+                          <w:b w:val="0"/>
+                          <w:bCs w:val="0"/>
+                        </w:rPr>
+                        <w:t>(B) patient atteint présentant des opacités pulmonaires compatibles avec une i</w:t>
+                      </w:r>
+                      <w:r>
+                        <w:rPr>
+                          <w:b w:val="0"/>
+                          <w:bCs w:val="0"/>
+                        </w:rPr>
+                        <w:t>nfection COVID-19 [1].</w:t>
+                      </w:r>
+                    </w:p>
+                  </w:txbxContent>
+                </v:textbox>
+              </v:shape>
+            </w:pict>
+          </mc:Fallback>
+        </mc:AlternateContent>
+      </w:r>
       <w:r>
         <w:rPr>
           <w:noProof/>
         </w:rPr>
         <w:drawing>
-          <wp:inline distT="0" distB="0" distL="0" distR="0" wp14:anchorId="5309626B" wp14:editId="383E26F3">
+          <wp:anchor distT="0" distB="0" distL="114300" distR="114300" simplePos="0" relativeHeight="251661312" behindDoc="1" locked="0" layoutInCell="1" allowOverlap="1" wp14:anchorId="0AF1C000" wp14:editId="21C8300A">
+            <wp:simplePos x="0" y="0"/>
+            <wp:positionH relativeFrom="margin">
+              <wp:posOffset>885602</wp:posOffset>
+            </wp:positionH>
+            <wp:positionV relativeFrom="paragraph">
+              <wp:posOffset>67322</wp:posOffset>
+            </wp:positionV>
+            <wp:extent cx="3419249" cy="3550344"/>
+            <wp:effectExtent l="0" t="0" r="0" b="0"/>
+            <wp:wrapNone/>
+            <wp:docPr id="137502964" name="Image 1"/>
+            <wp:cNvGraphicFramePr>
+              <a:graphicFrameLocks xmlns:a="http://schemas.openxmlformats.org/drawingml/2006/main" noChangeAspect="1"/>
+            </wp:cNvGraphicFramePr>
+            <a:graphic xmlns:a="http://schemas.openxmlformats.org/drawingml/2006/main">
+              <a:graphicData uri="http://schemas.openxmlformats.org/drawingml/2006/picture">
+                <pic:pic xmlns:pic="http://schemas.openxmlformats.org/drawingml/2006/picture">
+                  <pic:nvPicPr>
+                    <pic:cNvPr id="137502964" name=""/>
+                    <pic:cNvPicPr/>
+                  </pic:nvPicPr>
+                  <pic:blipFill>
+                    <a:blip r:embed="rId15" cstate="print">
+                      <a:extLst>
+                        <a:ext uri="{28A0092B-C50C-407E-A947-70E740481C1C}">
+                          <a14:useLocalDpi xmlns:a14="http://schemas.microsoft.com/office/drawing/2010/main" val="0"/>
+                        </a:ext>
+                      </a:extLst>
+                    </a:blip>
+                    <a:stretch>
+                      <a:fillRect/>
+                    </a:stretch>
+                  </pic:blipFill>
+                  <pic:spPr>
+                    <a:xfrm>
+                      <a:off x="0" y="0"/>
+                      <a:ext cx="3419249" cy="3550344"/>
+                    </a:xfrm>
+                    <a:prstGeom prst="rect">
+                      <a:avLst/>
+                    </a:prstGeom>
+                  </pic:spPr>
+                </pic:pic>
+              </a:graphicData>
+            </a:graphic>
+            <wp14:sizeRelH relativeFrom="margin">
+              <wp14:pctWidth>0</wp14:pctWidth>
+            </wp14:sizeRelH>
+            <wp14:sizeRelV relativeFrom="margin">
+              <wp14:pctHeight>0</wp14:pctHeight>
+            </wp14:sizeRelV>
+          </wp:anchor>
+        </w:drawing>
+      </w:r>
+    </w:p>
+    <w:p>
+      <w:pPr>
+        <w:spacing w:before="120" w:after="0" w:line="360" w:lineRule="auto"/>
+        <w:ind w:firstLine="0"/>
+      </w:pPr>
+    </w:p>
+    <w:p>
+      <w:pPr>
+        <w:spacing w:before="120" w:after="0" w:line="360" w:lineRule="auto"/>
+        <w:ind w:firstLine="0"/>
+      </w:pPr>
+    </w:p>
+    <w:p>
+      <w:pPr>
+        <w:spacing w:before="120" w:after="0" w:line="360" w:lineRule="auto"/>
+        <w:ind w:firstLine="0"/>
+      </w:pPr>
+    </w:p>
+    <w:p>
+      <w:pPr>
+        <w:spacing w:before="120" w:after="0" w:line="360" w:lineRule="auto"/>
+        <w:ind w:firstLine="0"/>
+      </w:pPr>
+    </w:p>
+    <w:p>
+      <w:pPr>
+        <w:spacing w:before="120" w:after="0" w:line="360" w:lineRule="auto"/>
+        <w:ind w:firstLine="0"/>
+      </w:pPr>
+    </w:p>
+    <w:p>
+      <w:pPr>
+        <w:spacing w:before="120" w:after="0" w:line="360" w:lineRule="auto"/>
+        <w:ind w:firstLine="0"/>
+      </w:pPr>
+    </w:p>
+    <w:p>
+      <w:pPr>
+        <w:spacing w:before="120" w:after="0" w:line="360" w:lineRule="auto"/>
+        <w:ind w:firstLine="0"/>
+      </w:pPr>
+    </w:p>
+    <w:p>
+      <w:pPr>
+        <w:spacing w:before="120" w:after="0" w:line="360" w:lineRule="auto"/>
+        <w:ind w:firstLine="0"/>
+      </w:pPr>
+    </w:p>
+    <w:p>
+      <w:pPr>
+        <w:spacing w:before="120" w:after="0" w:line="360" w:lineRule="auto"/>
+        <w:ind w:firstLine="0"/>
+      </w:pPr>
+    </w:p>
+    <w:p>
+      <w:pPr>
+        <w:spacing w:before="120" w:after="0" w:line="360" w:lineRule="auto"/>
+        <w:ind w:firstLine="0"/>
+      </w:pPr>
+      <w:r>
+        <w:lastRenderedPageBreak/>
+        <w:t>Comparativement au scanner thoracique (CT Scan), la radiographie présente plusieurs avantages : elle est rapide, peu coûteuse, largement disponible dans les établissements de santé et peut être réalisée grâce à des appareils portables limitant les risques de contamination croisée [1]. Ces caractéristiques en font un outil particulièrement pertinent dans les situations d'urgence sanitaire, dans les régions à ressources limitées ou lorsque les capacités de dépistage biologique sont saturées [1,5].</w:t>
+      </w:r>
+    </w:p>
+    <w:p>
+      <w:pPr>
+        <w:spacing w:before="120" w:after="0" w:line="360" w:lineRule="auto"/>
+        <w:ind w:firstLine="0"/>
+      </w:pPr>
+      <w:r>
+        <w:t>Cependant, l'interprétation des radiographies thoraciques demeure une tâche complexe nécessitant l'expertise de radiologues expérimentés. De plus, certaines manifestations radiologiques du COVID-19 peuvent être très similaires à celles observées dans d'autres pathologies pulmonaires, notamment les pneumonies virales ou bactériennes [5]. Face à l'augmentation massive du nombre d'examens à analyser durant la pandémie, la nécessité d'automatiser une partie du processus diagnostique est rapidement apparue [6].</w:t>
+      </w:r>
+    </w:p>
+    <w:p>
+      <w:pPr>
+        <w:spacing w:before="120" w:after="0" w:line="360" w:lineRule="auto"/>
+        <w:ind w:firstLine="0"/>
+      </w:pPr>
+      <w:r>
+        <w:t>Les progrès récents de l'intelligence artificielle, et plus particulièrement du Deep Learning, ont ouvert de nouvelles perspectives dans ce domaine. Les réseaux de neurones convolutifs (CNN) ont démontré leur capacité à extraire automatiquement des caractéristiques complexes à partir d'images médicales et à atteindre des performances comparables, voire supérieures, à celles obtenues par des méthodes traditionnelles d'analyse d'image [2,4]. Plusieurs travaux ont ainsi proposé des architectures dédiées à la détection du COVID-19 sur radiographies pulmonaires. Wang et al. ont notamment développé COVID-Net, l'un des premiers réseaux neuronaux spécifiquement conçus pour le dépistage du COVID-19 à partir d'images radiographiques [1]. D'autres études ont comparé de nombreuses architectures de référence telles que VGG16, ResNet50, DenseNet121 ou EfficientNet, certaines atteignant des taux de classification supérieurs à 95 % [2,3,5].</w:t>
+      </w:r>
+    </w:p>
+    <w:p>
+      <w:pPr>
+        <w:spacing w:before="120" w:after="0" w:line="360" w:lineRule="auto"/>
+        <w:ind w:firstLine="0"/>
+      </w:pPr>
+      <w:r>
+        <w:t>Au-delà de la simple performance prédictive, les recherches récentes s'orientent également vers le développement d'approches explicables (Explainable AI - XAI) permettant de comprendre les régions pulmonaires ayant conduit à la décision du modèle [3,4]. Cette dimension est essentielle dans le domaine médical afin de renforcer la confiance des cliniciens, d'améliorer l'interprétabilité des résultats et de favoriser l'intégration de ces outils dans la pratique clinique [3].</w:t>
+      </w:r>
+    </w:p>
+    <w:p>
+      <w:pPr>
+        <w:spacing w:before="120" w:after="0" w:line="360" w:lineRule="auto"/>
+        <w:ind w:firstLine="0"/>
+      </w:pPr>
+      <w:r>
+        <w:t>Dans ce contexte, le présent projet vise à explorer le potentiel des techniques de Deep Learning appliquées à l'analyse automatisée de radiographies pulmonaires pour la détection du COVID-19. L'objectif est d'évaluer la capacité de différents modèles à distinguer les cas de COVID-19 des autres pathologies pulmonaires et des patients sains</w:t>
+      </w:r>
+      <w:r>
+        <w:t>.</w:t>
+      </w:r>
+    </w:p>
+    <w:p>
+      <w:pPr>
+        <w:spacing w:before="120" w:after="0" w:line="360" w:lineRule="auto"/>
+        <w:ind w:firstLine="0"/>
+      </w:pPr>
+      <w:r>
+        <w:rPr>
+          <w:noProof/>
+        </w:rPr>
+        <w:lastRenderedPageBreak/>
+        <w:drawing>
+          <wp:inline distT="0" distB="0" distL="0" distR="0" wp14:anchorId="5309626B" wp14:editId="5ED5053D">
             <wp:extent cx="3646359" cy="5534025"/>
             <wp:effectExtent l="0" t="0" r="0" b="0"/>
             <wp:docPr id="80983977" name="Image 1" descr="Covid-19 : je suis cas contact, que dois-je faire ? - Le Parisien"/>
@@ -1904,7 +2401,7 @@
                     </pic:cNvPicPr>
                   </pic:nvPicPr>
                   <pic:blipFill>
-                    <a:blip r:embed="rId15">
+                    <a:blip r:embed="rId16">
                       <a:extLst>
                         <a:ext uri="{28A0092B-C50C-407E-A947-70E740481C1C}">
                           <a14:useLocalDpi xmlns:a14="http://schemas.microsoft.com/office/drawing/2010/main" val="0"/>
@@ -1919,7 +2416,7 @@
                   <pic:spPr bwMode="auto">
                     <a:xfrm>
                       <a:off x="0" y="0"/>
-                      <a:ext cx="3649919" cy="5539428"/>
+                      <a:ext cx="3646359" cy="5534025"/>
                     </a:xfrm>
                     <a:prstGeom prst="rect">
                       <a:avLst/>
@@ -1938,7 +2435,7 @@
     </w:p>
     <w:p>
       <w:pPr>
-        <w:spacing w:before="120" w:after="0"/>
+        <w:spacing w:before="120" w:after="0" w:line="360" w:lineRule="auto"/>
         <w:ind w:firstLine="0"/>
         <w:rPr>
           <w:b/>
@@ -1979,8 +2476,9 @@
         <w:rPr>
           <w:b/>
           <w:bCs/>
+          <w:noProof/>
         </w:rPr>
-        <w:t>1</w:t>
+        <w:t>2</w:t>
       </w:r>
       <w:r>
         <w:fldChar w:fldCharType="end"/>
@@ -1993,6 +2491,7 @@
         <w:t xml:space="preserve"> : </w:t>
       </w:r>
       <w:bookmarkEnd w:id="23"/>
+      <w:commentRangeStart w:id="25"/>
       <w:r>
         <w:rPr>
           <w:b/>
@@ -2001,10 +2500,21 @@
         <w:t>Contexte</w:t>
       </w:r>
       <w:bookmarkEnd w:id="24"/>
+      <w:commentRangeEnd w:id="25"/>
+      <w:r>
+        <w:rPr>
+          <w:rStyle w:val="Marquedecommentaire"/>
+          <w:b/>
+          <w:bCs/>
+          <w:sz w:val="22"/>
+          <w:szCs w:val="24"/>
+        </w:rPr>
+        <w:commentReference w:id="25"/>
+      </w:r>
     </w:p>
     <w:p>
       <w:pPr>
-        <w:spacing w:before="120" w:after="0"/>
+        <w:spacing w:before="120" w:after="0" w:line="360" w:lineRule="auto"/>
         <w:ind w:firstLine="0"/>
       </w:pPr>
       <w:r>
@@ -2043,31 +2553,31 @@
     <w:p>
       <w:pPr>
         <w:pStyle w:val="Titre3"/>
-      </w:pPr>
-      <w:bookmarkStart w:id="25" w:name="_Toc408749390"/>
-      <w:bookmarkStart w:id="26" w:name="_Toc413214121"/>
-      <w:bookmarkStart w:id="27" w:name="_Toc427073282"/>
-      <w:bookmarkStart w:id="28" w:name="_Toc475752934"/>
-      <w:bookmarkStart w:id="29" w:name="_Toc475753473"/>
-      <w:bookmarkStart w:id="30" w:name="_Toc475767442"/>
-      <w:bookmarkStart w:id="31" w:name="_Toc475782536"/>
-      <w:bookmarkStart w:id="32" w:name="_Toc475785303"/>
-      <w:bookmarkStart w:id="33" w:name="_Toc475785529"/>
-      <w:bookmarkStart w:id="34" w:name="_Toc475785669"/>
-      <w:bookmarkStart w:id="35" w:name="_Toc475841807"/>
-      <w:bookmarkStart w:id="36" w:name="_Toc476457665"/>
-      <w:bookmarkStart w:id="37" w:name="_Toc476548251"/>
-      <w:bookmarkStart w:id="38" w:name="_Toc477773123"/>
-      <w:bookmarkStart w:id="39" w:name="_Toc107894974"/>
-      <w:bookmarkStart w:id="40" w:name="_Toc107912861"/>
-      <w:bookmarkStart w:id="41" w:name="_Toc182878908"/>
-      <w:bookmarkStart w:id="42" w:name="_Toc204483507"/>
-      <w:bookmarkStart w:id="43" w:name="_Toc304214572"/>
-      <w:bookmarkStart w:id="44" w:name="_Toc511458432"/>
+        <w:spacing w:line="360" w:lineRule="auto"/>
+      </w:pPr>
+      <w:bookmarkStart w:id="26" w:name="_Toc408749390"/>
+      <w:bookmarkStart w:id="27" w:name="_Toc413214121"/>
+      <w:bookmarkStart w:id="28" w:name="_Toc427073282"/>
+      <w:bookmarkStart w:id="29" w:name="_Toc475752934"/>
+      <w:bookmarkStart w:id="30" w:name="_Toc475753473"/>
+      <w:bookmarkStart w:id="31" w:name="_Toc475767442"/>
+      <w:bookmarkStart w:id="32" w:name="_Toc475782536"/>
+      <w:bookmarkStart w:id="33" w:name="_Toc475785303"/>
+      <w:bookmarkStart w:id="34" w:name="_Toc475785529"/>
+      <w:bookmarkStart w:id="35" w:name="_Toc475785669"/>
+      <w:bookmarkStart w:id="36" w:name="_Toc475841807"/>
+      <w:bookmarkStart w:id="37" w:name="_Toc476457665"/>
+      <w:bookmarkStart w:id="38" w:name="_Toc476548251"/>
+      <w:bookmarkStart w:id="39" w:name="_Toc477773123"/>
+      <w:bookmarkStart w:id="40" w:name="_Toc107894974"/>
+      <w:bookmarkStart w:id="41" w:name="_Toc107912861"/>
+      <w:bookmarkStart w:id="42" w:name="_Toc182878908"/>
+      <w:bookmarkStart w:id="43" w:name="_Toc204483507"/>
+      <w:bookmarkStart w:id="44" w:name="_Toc304214572"/>
+      <w:bookmarkStart w:id="45" w:name="_Toc511458432"/>
       <w:r>
         <w:t>Présentation</w:t>
       </w:r>
-      <w:bookmarkEnd w:id="25"/>
       <w:bookmarkEnd w:id="26"/>
       <w:bookmarkEnd w:id="27"/>
       <w:bookmarkEnd w:id="28"/>
@@ -2087,6 +2597,400 @@
       <w:bookmarkEnd w:id="42"/>
       <w:bookmarkEnd w:id="43"/>
       <w:bookmarkEnd w:id="44"/>
+      <w:bookmarkEnd w:id="45"/>
+    </w:p>
+    <w:p>
+      <w:pPr>
+        <w:spacing w:before="120" w:after="0" w:line="360" w:lineRule="auto"/>
+        <w:ind w:firstLine="0"/>
+        <w:rPr>
+          <w:lang w:val="en-GB"/>
+        </w:rPr>
+      </w:pPr>
+      <w:r>
+        <w:rPr>
+          <w:lang w:val="en-GB"/>
+        </w:rPr>
+        <w:br w:type="page"/>
+      </w:r>
+    </w:p>
+    <w:p>
+      <w:pPr>
+        <w:pStyle w:val="Titre1"/>
+      </w:pPr>
+      <w:r>
+        <w:lastRenderedPageBreak/>
+        <w:t>REFERENCES (à mettre en derniere place du sommaire)</w:t>
+      </w:r>
+    </w:p>
+    <w:p>
+      <w:pPr>
+        <w:spacing w:before="120" w:after="0" w:line="360" w:lineRule="auto"/>
+        <w:ind w:firstLine="0"/>
+      </w:pPr>
+    </w:p>
+    <w:p>
+      <w:pPr>
+        <w:spacing w:before="120" w:after="0" w:line="360" w:lineRule="auto"/>
+        <w:ind w:firstLine="0"/>
+        <w:rPr>
+          <w:lang w:val="en-GB"/>
+        </w:rPr>
+      </w:pPr>
+      <w:r>
+        <w:rPr>
+          <w:b/>
+          <w:bCs/>
+          <w:lang w:val="en-GB"/>
+        </w:rPr>
+        <w:t>[1]</w:t>
+      </w:r>
+      <w:r>
+        <w:rPr>
+          <w:lang w:val="en-GB"/>
+        </w:rPr>
+        <w:t xml:space="preserve"> Wang L., Lin Z.Q., Wong A. </w:t>
+      </w:r>
+      <w:r>
+        <w:rPr>
+          <w:i/>
+          <w:iCs/>
+          <w:lang w:val="en-GB"/>
+        </w:rPr>
+        <w:t>COVID-Net: A tailored deep convolutional neural network design for detection of COVID-19 cases from chest X-ray images</w:t>
+      </w:r>
+      <w:r>
+        <w:rPr>
+          <w:lang w:val="en-GB"/>
+        </w:rPr>
+        <w:t>. Scientific Reports, 2020.</w:t>
+      </w:r>
+    </w:p>
+    <w:p>
+      <w:pPr>
+        <w:spacing w:before="120" w:after="0" w:line="360" w:lineRule="auto"/>
+        <w:ind w:firstLine="0"/>
+        <w:rPr>
+          <w:lang w:val="en-GB"/>
+        </w:rPr>
+      </w:pPr>
+      <w:r>
+        <w:rPr>
+          <w:b/>
+          <w:bCs/>
+          <w:lang w:val="en-GB"/>
+        </w:rPr>
+        <w:t>[2]</w:t>
+      </w:r>
+      <w:r>
+        <w:rPr>
+          <w:lang w:val="en-GB"/>
+        </w:rPr>
+        <w:t xml:space="preserve"> Akter S. et al. </w:t>
+      </w:r>
+      <w:r>
+        <w:rPr>
+          <w:i/>
+          <w:iCs/>
+          <w:lang w:val="en-GB"/>
+        </w:rPr>
+        <w:t>COVID-19 Detection Using Deep Learning Algorithm on Chest X-ray Images</w:t>
+      </w:r>
+      <w:r>
+        <w:rPr>
+          <w:lang w:val="en-GB"/>
+        </w:rPr>
+        <w:t xml:space="preserve">. </w:t>
+      </w:r>
+      <w:r>
+        <w:rPr>
+          <w:lang w:val="en-GB"/>
+        </w:rPr>
+        <w:t>Biology, 2021.</w:t>
+      </w:r>
+    </w:p>
+    <w:p>
+      <w:pPr>
+        <w:spacing w:before="120" w:after="0" w:line="360" w:lineRule="auto"/>
+        <w:ind w:firstLine="0"/>
+        <w:rPr>
+          <w:lang w:val="en-GB"/>
+        </w:rPr>
+      </w:pPr>
+      <w:r>
+        <w:rPr>
+          <w:b/>
+          <w:bCs/>
+          <w:lang w:val="en-GB"/>
+        </w:rPr>
+        <w:t>[3]</w:t>
+      </w:r>
+      <w:r>
+        <w:rPr>
+          <w:lang w:val="en-GB"/>
+        </w:rPr>
+        <w:t xml:space="preserve"> Naz Z. et al. </w:t>
+      </w:r>
+      <w:r>
+        <w:rPr>
+          <w:i/>
+          <w:iCs/>
+          <w:lang w:val="en-GB"/>
+        </w:rPr>
+        <w:t>An Explainable AI-Enabled Framework for Interpreting Pulmonary Diseases from Chest Radiographs</w:t>
+      </w:r>
+      <w:r>
+        <w:rPr>
+          <w:lang w:val="en-GB"/>
+        </w:rPr>
+        <w:t xml:space="preserve">. </w:t>
+      </w:r>
+      <w:r>
+        <w:rPr>
+          <w:lang w:val="en-GB"/>
+        </w:rPr>
+        <w:t>Cancers, 2023.</w:t>
+      </w:r>
+    </w:p>
+    <w:p>
+      <w:pPr>
+        <w:spacing w:before="120" w:after="0" w:line="360" w:lineRule="auto"/>
+        <w:ind w:firstLine="0"/>
+        <w:rPr>
+          <w:lang w:val="en-GB"/>
+        </w:rPr>
+      </w:pPr>
+      <w:r>
+        <w:rPr>
+          <w:b/>
+          <w:bCs/>
+          <w:lang w:val="en-GB"/>
+        </w:rPr>
+        <w:t>[4]</w:t>
+      </w:r>
+      <w:r>
+        <w:rPr>
+          <w:lang w:val="en-GB"/>
+        </w:rPr>
+        <w:t xml:space="preserve"> Khan M.A. et al. </w:t>
+      </w:r>
+      <w:r>
+        <w:rPr>
+          <w:i/>
+          <w:iCs/>
+          <w:lang w:val="en-GB"/>
+        </w:rPr>
+        <w:t>COVID-19 Classification from Chest X-Ray Images: A Framework of Deep Explainable Artificial Intelligence</w:t>
+      </w:r>
+      <w:r>
+        <w:rPr>
+          <w:lang w:val="en-GB"/>
+        </w:rPr>
+        <w:t xml:space="preserve">. </w:t>
+      </w:r>
+      <w:r>
+        <w:rPr>
+          <w:lang w:val="en-GB"/>
+        </w:rPr>
+        <w:t>Computational Intelligence and Neuroscience, 2022.</w:t>
+      </w:r>
+    </w:p>
+    <w:p>
+      <w:pPr>
+        <w:spacing w:before="120" w:after="0" w:line="360" w:lineRule="auto"/>
+        <w:ind w:firstLine="0"/>
+        <w:rPr>
+          <w:lang w:val="en-GB"/>
+        </w:rPr>
+      </w:pPr>
+      <w:r>
+        <w:rPr>
+          <w:b/>
+          <w:bCs/>
+          <w:lang w:val="en-GB"/>
+        </w:rPr>
+        <w:t>[5]</w:t>
+      </w:r>
+      <w:r>
+        <w:rPr>
+          <w:lang w:val="en-GB"/>
+        </w:rPr>
+        <w:t xml:space="preserve"> Jia G. et al. </w:t>
+      </w:r>
+      <w:r>
+        <w:rPr>
+          <w:i/>
+          <w:iCs/>
+          <w:lang w:val="en-GB"/>
+        </w:rPr>
+        <w:t>Classification of COVID-19 Chest X-Ray and CT Images Using a Type of Dynamic CNN Modification Method</w:t>
+      </w:r>
+      <w:r>
+        <w:rPr>
+          <w:lang w:val="en-GB"/>
+        </w:rPr>
+        <w:t xml:space="preserve">. </w:t>
+      </w:r>
+      <w:r>
+        <w:rPr>
+          <w:lang w:val="en-GB"/>
+        </w:rPr>
+        <w:t>Computers in Biology and Medicine, 2021.</w:t>
+      </w:r>
+    </w:p>
+    <w:p>
+      <w:pPr>
+        <w:spacing w:before="120" w:after="0" w:line="360" w:lineRule="auto"/>
+        <w:ind w:firstLine="0"/>
+        <w:rPr>
+          <w:lang w:val="en-GB"/>
+        </w:rPr>
+      </w:pPr>
+      <w:r>
+        <w:rPr>
+          <w:b/>
+          <w:bCs/>
+          <w:lang w:val="en-GB"/>
+        </w:rPr>
+        <w:t>[6]</w:t>
+      </w:r>
+      <w:r>
+        <w:rPr>
+          <w:lang w:val="en-GB"/>
+        </w:rPr>
+        <w:t xml:space="preserve"> Shazia A. et al. </w:t>
+      </w:r>
+      <w:r>
+        <w:rPr>
+          <w:i/>
+          <w:iCs/>
+          <w:lang w:val="en-GB"/>
+        </w:rPr>
+        <w:t>A Comparative Study of Multiple Neural Networks for Detection of COVID-19 on Chest X-Ray</w:t>
+      </w:r>
+      <w:r>
+        <w:rPr>
+          <w:lang w:val="en-GB"/>
+        </w:rPr>
+        <w:t xml:space="preserve">. </w:t>
+      </w:r>
+      <w:r>
+        <w:rPr>
+          <w:lang w:val="en-GB"/>
+        </w:rPr>
+        <w:t>EURASIP Journal on Advances in Signal Processing, 2021.</w:t>
+      </w:r>
+    </w:p>
+    <w:p>
+      <w:pPr>
+        <w:spacing w:before="120" w:after="0" w:line="360" w:lineRule="auto"/>
+        <w:ind w:firstLine="0"/>
+        <w:rPr>
+          <w:lang w:val="en-GB"/>
+        </w:rPr>
+      </w:pPr>
+      <w:r>
+        <w:rPr>
+          <w:b/>
+          <w:bCs/>
+          <w:lang w:val="en-GB"/>
+        </w:rPr>
+        <w:t>[7]</w:t>
+      </w:r>
+      <w:r>
+        <w:rPr>
+          <w:lang w:val="en-GB"/>
+        </w:rPr>
+        <w:t xml:space="preserve"> Lippi G., Sanchis-Gomar F. </w:t>
+      </w:r>
+      <w:r>
+        <w:rPr>
+          <w:i/>
+          <w:iCs/>
+          <w:lang w:val="en-GB"/>
+        </w:rPr>
+        <w:t>Mortality of Post-COVID-19 Condition: 2025 Update</w:t>
+      </w:r>
+      <w:r>
+        <w:rPr>
+          <w:lang w:val="en-GB"/>
+        </w:rPr>
+        <w:t xml:space="preserve">. </w:t>
+      </w:r>
+      <w:r>
+        <w:rPr>
+          <w:b/>
+          <w:bCs/>
+        </w:rPr>
+        <w:t>COVID</w:t>
+      </w:r>
+      <w:r>
+        <w:t xml:space="preserve">, 2025, 5(1), 11. </w:t>
+      </w:r>
+      <w:hyperlink r:id="rId21" w:tgtFrame="_new" w:history="1">
+        <w:r>
+          <w:rPr>
+            <w:rStyle w:val="Lienhypertexte"/>
+          </w:rPr>
+          <w:t>https://doi.org/10.3390/covid5010011</w:t>
+        </w:r>
+      </w:hyperlink>
+    </w:p>
+    <w:p>
+      <w:pPr>
+        <w:spacing w:before="120" w:after="0" w:line="360" w:lineRule="auto"/>
+        <w:ind w:firstLine="0"/>
+        <w:jc w:val="left"/>
+        <w:rPr>
+          <w:lang w:val="en-GB"/>
+        </w:rPr>
+      </w:pPr>
+      <w:r>
+        <w:rPr>
+          <w:b/>
+          <w:bCs/>
+          <w:lang w:val="en-GB"/>
+        </w:rPr>
+        <w:t>[8]</w:t>
+      </w:r>
+      <w:r>
+        <w:rPr>
+          <w:lang w:val="en-GB"/>
+        </w:rPr>
+        <w:t xml:space="preserve"> Fang Y., Zhang H., Xie J., Lin M., Ying L., Pang P., Ji W. </w:t>
+      </w:r>
+      <w:r>
+        <w:rPr>
+          <w:i/>
+          <w:iCs/>
+          <w:lang w:val="en-GB"/>
+        </w:rPr>
+        <w:t>Sensitivity of Chest CT for COVID-19: Comparison to RT-PCR</w:t>
+      </w:r>
+      <w:r>
+        <w:rPr>
+          <w:lang w:val="en-GB"/>
+        </w:rPr>
+        <w:t xml:space="preserve">. </w:t>
+      </w:r>
+      <w:r>
+        <w:rPr>
+          <w:b/>
+          <w:bCs/>
+        </w:rPr>
+        <w:t>Radiology</w:t>
+      </w:r>
+      <w:r>
+        <w:t xml:space="preserve">, 2020, 296(2), E115-E117. </w:t>
+      </w:r>
+      <w:hyperlink r:id="rId22" w:tgtFrame="_new" w:history="1">
+        <w:r>
+          <w:rPr>
+            <w:rStyle w:val="Lienhypertexte"/>
+          </w:rPr>
+          <w:t>https://doi.org/10.1148/radiol.2020200432</w:t>
+        </w:r>
+      </w:hyperlink>
     </w:p>
     <w:sectPr>
       <w:pgSz w:w="11907" w:h="16840" w:code="9"/>
@@ -2097,6 +3001,45 @@
     </w:sectPr>
   </w:body>
 </w:document>
+</file>
+
+<file path=word/comments.xml><?xml version="1.0" encoding="utf-8"?>
+<w:comments xmlns:wpc="http://schemas.microsoft.com/office/word/2010/wordprocessingCanvas" xmlns:cx="http://schemas.microsoft.com/office/drawing/2014/chartex" xmlns:cx1="http://schemas.microsoft.com/office/drawing/2015/9/8/chartex" xmlns:cx2="http://schemas.microsoft.com/office/drawing/2015/10/21/chartex" xmlns:cx3="http://schemas.microsoft.com/office/drawing/2016/5/9/chartex" xmlns:cx4="http://schemas.microsoft.com/office/drawing/2016/5/10/chartex" xmlns:cx5="http://schemas.microsoft.com/office/drawing/2016/5/11/chartex" xmlns:cx6="http://schemas.microsoft.com/office/drawing/2016/5/12/chartex" xmlns:cx7="http://schemas.microsoft.com/office/drawing/2016/5/13/chartex" xmlns:cx8="http://schemas.microsoft.com/office/drawing/2016/5/14/chartex" xmlns:mc="http://schemas.openxmlformats.org/markup-compatibility/2006" xmlns:aink="http://schemas.microsoft.com/office/drawing/2016/ink" xmlns:am3d="http://schemas.microsoft.com/office/drawing/2017/model3d" xmlns:o="urn:schemas-microsoft-com:office:office" xmlns:oel="http://schemas.microsoft.com/office/2019/extlst" xmlns:r="http://schemas.openxmlformats.org/officeDocument/2006/relationships" xmlns:m="http://schemas.openxmlformats.org/officeDocument/2006/math" xmlns:v="urn:schemas-microsoft-com:vml" xmlns:wp14="http://schemas.microsoft.com/office/word/2010/wordprocessingDrawing" xmlns:wp="http://schemas.openxmlformats.org/drawingml/2006/wordprocessingDrawing" xmlns:w10="urn:schemas-microsoft-com:office:word" xmlns:w="http://schemas.openxmlformats.org/wordprocessingml/2006/main" xmlns:w14="http://schemas.microsoft.com/office/word/2010/wordml" xmlns:w15="http://schemas.microsoft.com/office/word/2012/wordml" xmlns:w16cex="http://schemas.microsoft.com/office/word/2018/wordml/cex" xmlns:w16cid="http://schemas.microsoft.com/office/word/2016/wordml/cid" xmlns:w16="http://schemas.microsoft.com/office/word/2018/wordml" xmlns:w16du="http://schemas.microsoft.com/office/word/2023/wordml/word16du" xmlns:w16sdtdh="http://schemas.microsoft.com/office/word/2020/wordml/sdtdatahash" xmlns:w16sdtfl="http://schemas.microsoft.com/office/word/2024/wordml/sdtformatlock" xmlns:w16se="http://schemas.microsoft.com/office/word/2015/wordml/symex" xmlns:wpg="http://schemas.microsoft.com/office/word/2010/wordprocessingGroup" xmlns:wpi="http://schemas.microsoft.com/office/word/2010/wordprocessingInk" xmlns:wne="http://schemas.microsoft.com/office/word/2006/wordml" xmlns:wps="http://schemas.microsoft.com/office/word/2010/wordprocessingShape" mc:Ignorable="w14 w15 w16se w16cid w16 w16cex w16sdtdh w16sdtfl w16du wp14">
+  <w:comment w:id="25" w:author="noura Romari" w:date="2026-06-17T06:38:00Z" w:initials="nR">
+    <w:p>
+      <w:pPr>
+        <w:pStyle w:val="Commentaire"/>
+      </w:pPr>
+      <w:r>
+        <w:rPr>
+          <w:rStyle w:val="Marquedecommentaire"/>
+        </w:rPr>
+        <w:annotationRef/>
+      </w:r>
+      <w:r>
+        <w:t>Image hors contexte pour moi, car sujet accès sur le diagnostique, pas sur la prévention.</w:t>
+      </w:r>
+    </w:p>
+  </w:comment>
+</w:comments>
+</file>
+
+<file path=word/commentsExtended.xml><?xml version="1.0" encoding="utf-8"?>
+<w15:commentsEx xmlns:wpc="http://schemas.microsoft.com/office/word/2010/wordprocessingCanvas" xmlns:cx="http://schemas.microsoft.com/office/drawing/2014/chartex" xmlns:cx1="http://schemas.microsoft.com/office/drawing/2015/9/8/chartex" xmlns:cx2="http://schemas.microsoft.com/office/drawing/2015/10/21/chartex" xmlns:cx3="http://schemas.microsoft.com/office/drawing/2016/5/9/chartex" xmlns:cx4="http://schemas.microsoft.com/office/drawing/2016/5/10/chartex" xmlns:cx5="http://schemas.microsoft.com/office/drawing/2016/5/11/chartex" xmlns:cx6="http://schemas.microsoft.com/office/drawing/2016/5/12/chartex" xmlns:cx7="http://schemas.microsoft.com/office/drawing/2016/5/13/chartex" xmlns:cx8="http://schemas.microsoft.com/office/drawing/2016/5/14/chartex" xmlns:mc="http://schemas.openxmlformats.org/markup-compatibility/2006" xmlns:aink="http://schemas.microsoft.com/office/drawing/2016/ink" xmlns:am3d="http://schemas.microsoft.com/office/drawing/2017/model3d" xmlns:o="urn:schemas-microsoft-com:office:office" xmlns:oel="http://schemas.microsoft.com/office/2019/extlst" xmlns:r="http://schemas.openxmlformats.org/officeDocument/2006/relationships" xmlns:m="http://schemas.openxmlformats.org/officeDocument/2006/math" xmlns:v="urn:schemas-microsoft-com:vml" xmlns:wp14="http://schemas.microsoft.com/office/word/2010/wordprocessingDrawing" xmlns:wp="http://schemas.openxmlformats.org/drawingml/2006/wordprocessingDrawing" xmlns:w10="urn:schemas-microsoft-com:office:word" xmlns:w="http://schemas.openxmlformats.org/wordprocessingml/2006/main" xmlns:w14="http://schemas.microsoft.com/office/word/2010/wordml" xmlns:w15="http://schemas.microsoft.com/office/word/2012/wordml" xmlns:w16cex="http://schemas.microsoft.com/office/word/2018/wordml/cex" xmlns:w16cid="http://schemas.microsoft.com/office/word/2016/wordml/cid" xmlns:w16="http://schemas.microsoft.com/office/word/2018/wordml" xmlns:w16du="http://schemas.microsoft.com/office/word/2023/wordml/word16du" xmlns:w16sdtdh="http://schemas.microsoft.com/office/word/2020/wordml/sdtdatahash" xmlns:w16sdtfl="http://schemas.microsoft.com/office/word/2024/wordml/sdtformatlock" xmlns:w16se="http://schemas.microsoft.com/office/word/2015/wordml/symex" xmlns:wpg="http://schemas.microsoft.com/office/word/2010/wordprocessingGroup" xmlns:wpi="http://schemas.microsoft.com/office/word/2010/wordprocessingInk" xmlns:wne="http://schemas.microsoft.com/office/word/2006/wordml" xmlns:wps="http://schemas.microsoft.com/office/word/2010/wordprocessingShape" mc:Ignorable="w14 w15 w16se w16cid w16 w16cex w16sdtdh w16sdtfl w16du wp14">
+  <w15:commentEx w15:paraId="3D180F8A" w15:done="0"/>
+</w15:commentsEx>
+</file>
+
+<file path=word/commentsExtensible.xml><?xml version="1.0" encoding="utf-8"?>
+<w16cex:commentsExtensible xmlns:wpc="http://schemas.microsoft.com/office/word/2010/wordprocessingCanvas" xmlns:cx="http://schemas.microsoft.com/office/drawing/2014/chartex" xmlns:cx1="http://schemas.microsoft.com/office/drawing/2015/9/8/chartex" xmlns:cx2="http://schemas.microsoft.com/office/drawing/2015/10/21/chartex" xmlns:cx3="http://schemas.microsoft.com/office/drawing/2016/5/9/chartex" xmlns:cx4="http://schemas.microsoft.com/office/drawing/2016/5/10/chartex" xmlns:cx5="http://schemas.microsoft.com/office/drawing/2016/5/11/chartex" xmlns:cx6="http://schemas.microsoft.com/office/drawing/2016/5/12/chartex" xmlns:cx7="http://schemas.microsoft.com/office/drawing/2016/5/13/chartex" xmlns:cx8="http://schemas.microsoft.com/office/drawing/2016/5/14/chartex" xmlns:cr="http://schemas.microsoft.com/office/comments/2020/reactions" xmlns:mc="http://schemas.openxmlformats.org/markup-compatibility/2006" xmlns:aink="http://schemas.microsoft.com/office/drawing/2016/ink" xmlns:am3d="http://schemas.microsoft.com/office/drawing/2017/model3d" xmlns:o="urn:schemas-microsoft-com:office:office" xmlns:oel="http://schemas.microsoft.com/office/2019/extlst" xmlns:r="http://schemas.openxmlformats.org/officeDocument/2006/relationships" xmlns:m="http://schemas.openxmlformats.org/officeDocument/2006/math" xmlns:v="urn:schemas-microsoft-com:vml" xmlns:wp14="http://schemas.microsoft.com/office/word/2010/wordprocessingDrawing" xmlns:wp="http://schemas.openxmlformats.org/drawingml/2006/wordprocessingDrawing" xmlns:w10="urn:schemas-microsoft-com:office:word" xmlns:w="http://schemas.openxmlformats.org/wordprocessingml/2006/main" xmlns:w14="http://schemas.microsoft.com/office/word/2010/wordml" xmlns:w15="http://schemas.microsoft.com/office/word/2012/wordml" xmlns:w16cex="http://schemas.microsoft.com/office/word/2018/wordml/cex" xmlns:w16cid="http://schemas.microsoft.com/office/word/2016/wordml/cid" xmlns:w16="http://schemas.microsoft.com/office/word/2018/wordml" xmlns:w16du="http://schemas.microsoft.com/office/word/2023/wordml/word16du" xmlns:w16sdtdh="http://schemas.microsoft.com/office/word/2020/wordml/sdtdatahash" xmlns:w16sdtfl="http://schemas.microsoft.com/office/word/2024/wordml/sdtformatlock" xmlns:w16se="http://schemas.microsoft.com/office/word/2015/wordml/symex" xmlns:wpg="http://schemas.microsoft.com/office/word/2010/wordprocessingGroup" xmlns:wpi="http://schemas.microsoft.com/office/word/2010/wordprocessingInk" xmlns:wne="http://schemas.microsoft.com/office/word/2006/wordml" xmlns:wps="http://schemas.microsoft.com/office/word/2010/wordprocessingShape" mc:Ignorable="w14 w15 w16se w16cid w16 w16cex w16sdtdh w16sdtfl cr w16du wp14">
+  <w16cex:commentExtensible w16cex:durableId="7DB73FA2" w16cex:dateUtc="2026-06-17T04:38:00Z"/>
+</w16cex:commentsExtensible>
+</file>
+
+<file path=word/commentsIds.xml><?xml version="1.0" encoding="utf-8"?>
+<w16cid:commentsIds xmlns:wpc="http://schemas.microsoft.com/office/word/2010/wordprocessingCanvas" xmlns:cx="http://schemas.microsoft.com/office/drawing/2014/chartex" xmlns:cx1="http://schemas.microsoft.com/office/drawing/2015/9/8/chartex" xmlns:cx2="http://schemas.microsoft.com/office/drawing/2015/10/21/chartex" xmlns:cx3="http://schemas.microsoft.com/office/drawing/2016/5/9/chartex" xmlns:cx4="http://schemas.microsoft.com/office/drawing/2016/5/10/chartex" xmlns:cx5="http://schemas.microsoft.com/office/drawing/2016/5/11/chartex" xmlns:cx6="http://schemas.microsoft.com/office/drawing/2016/5/12/chartex" xmlns:cx7="http://schemas.microsoft.com/office/drawing/2016/5/13/chartex" xmlns:cx8="http://schemas.microsoft.com/office/drawing/2016/5/14/chartex" xmlns:mc="http://schemas.openxmlformats.org/markup-compatibility/2006" xmlns:aink="http://schemas.microsoft.com/office/drawing/2016/ink" xmlns:am3d="http://schemas.microsoft.com/office/drawing/2017/model3d" xmlns:o="urn:schemas-microsoft-com:office:office" xmlns:oel="http://schemas.microsoft.com/office/2019/extlst" xmlns:r="http://schemas.openxmlformats.org/officeDocument/2006/relationships" xmlns:m="http://schemas.openxmlformats.org/officeDocument/2006/math" xmlns:v="urn:schemas-microsoft-com:vml" xmlns:wp14="http://schemas.microsoft.com/office/word/2010/wordprocessingDrawing" xmlns:wp="http://schemas.openxmlformats.org/drawingml/2006/wordprocessingDrawing" xmlns:w10="urn:schemas-microsoft-com:office:word" xmlns:w="http://schemas.openxmlformats.org/wordprocessingml/2006/main" xmlns:w14="http://schemas.microsoft.com/office/word/2010/wordml" xmlns:w15="http://schemas.microsoft.com/office/word/2012/wordml" xmlns:w16cex="http://schemas.microsoft.com/office/word/2018/wordml/cex" xmlns:w16cid="http://schemas.microsoft.com/office/word/2016/wordml/cid" xmlns:w16="http://schemas.microsoft.com/office/word/2018/wordml" xmlns:w16du="http://schemas.microsoft.com/office/word/2023/wordml/word16du" xmlns:w16sdtdh="http://schemas.microsoft.com/office/word/2020/wordml/sdtdatahash" xmlns:w16sdtfl="http://schemas.microsoft.com/office/word/2024/wordml/sdtformatlock" xmlns:w16se="http://schemas.microsoft.com/office/word/2015/wordml/symex" xmlns:wpg="http://schemas.microsoft.com/office/word/2010/wordprocessingGroup" xmlns:wpi="http://schemas.microsoft.com/office/word/2010/wordprocessingInk" xmlns:wne="http://schemas.microsoft.com/office/word/2006/wordml" xmlns:wps="http://schemas.microsoft.com/office/word/2010/wordprocessingShape" mc:Ignorable="w14 w15 w16se w16cid w16 w16cex w16sdtdh w16sdtfl w16du wp14">
+  <w16cid:commentId w16cid:paraId="3D180F8A" w16cid:durableId="7DB73FA2"/>
+</w16cid:commentsIds>
 </file>
 
 <file path=word/endnotes.xml><?xml version="1.0" encoding="utf-8"?>
@@ -2713,7 +3656,7 @@
   <w:abstractNum w:abstractNumId="9" w15:restartNumberingAfterBreak="0">
     <w:nsid w:val="FFFFFFFB"/>
     <w:multiLevelType w:val="multilevel"/>
-    <w:tmpl w:val="6C50BCB4"/>
+    <w:tmpl w:val="F3D0F65C"/>
     <w:lvl w:ilvl="0">
       <w:start w:val="1"/>
       <w:numFmt w:val="decimal"/>
@@ -5454,6 +6397,14 @@
   </w:num>
   <w:numIdMacAtCleanup w:val="25"/>
 </w:numbering>
+</file>
+
+<file path=word/people.xml><?xml version="1.0" encoding="utf-8"?>
+<w15:people xmlns:wpc="http://schemas.microsoft.com/office/word/2010/wordprocessingCanvas" xmlns:cx="http://schemas.microsoft.com/office/drawing/2014/chartex" xmlns:cx1="http://schemas.microsoft.com/office/drawing/2015/9/8/chartex" xmlns:cx2="http://schemas.microsoft.com/office/drawing/2015/10/21/chartex" xmlns:cx3="http://schemas.microsoft.com/office/drawing/2016/5/9/chartex" xmlns:cx4="http://schemas.microsoft.com/office/drawing/2016/5/10/chartex" xmlns:cx5="http://schemas.microsoft.com/office/drawing/2016/5/11/chartex" xmlns:cx6="http://schemas.microsoft.com/office/drawing/2016/5/12/chartex" xmlns:cx7="http://schemas.microsoft.com/office/drawing/2016/5/13/chartex" xmlns:cx8="http://schemas.microsoft.com/office/drawing/2016/5/14/chartex" xmlns:mc="http://schemas.openxmlformats.org/markup-compatibility/2006" xmlns:aink="http://schemas.microsoft.com/office/drawing/2016/ink" xmlns:am3d="http://schemas.microsoft.com/office/drawing/2017/model3d" xmlns:o="urn:schemas-microsoft-com:office:office" xmlns:oel="http://schemas.microsoft.com/office/2019/extlst" xmlns:r="http://schemas.openxmlformats.org/officeDocument/2006/relationships" xmlns:m="http://schemas.openxmlformats.org/officeDocument/2006/math" xmlns:v="urn:schemas-microsoft-com:vml" xmlns:wp14="http://schemas.microsoft.com/office/word/2010/wordprocessingDrawing" xmlns:wp="http://schemas.openxmlformats.org/drawingml/2006/wordprocessingDrawing" xmlns:w10="urn:schemas-microsoft-com:office:word" xmlns:w="http://schemas.openxmlformats.org/wordprocessingml/2006/main" xmlns:w14="http://schemas.microsoft.com/office/word/2010/wordml" xmlns:w15="http://schemas.microsoft.com/office/word/2012/wordml" xmlns:w16cex="http://schemas.microsoft.com/office/word/2018/wordml/cex" xmlns:w16cid="http://schemas.microsoft.com/office/word/2016/wordml/cid" xmlns:w16="http://schemas.microsoft.com/office/word/2018/wordml" xmlns:w16du="http://schemas.microsoft.com/office/word/2023/wordml/word16du" xmlns:w16sdtdh="http://schemas.microsoft.com/office/word/2020/wordml/sdtdatahash" xmlns:w16sdtfl="http://schemas.microsoft.com/office/word/2024/wordml/sdtformatlock" xmlns:w16se="http://schemas.microsoft.com/office/word/2015/wordml/symex" xmlns:wpg="http://schemas.microsoft.com/office/word/2010/wordprocessingGroup" xmlns:wpi="http://schemas.microsoft.com/office/word/2010/wordprocessingInk" xmlns:wne="http://schemas.microsoft.com/office/word/2006/wordml" xmlns:wps="http://schemas.microsoft.com/office/word/2010/wordprocessingShape" mc:Ignorable="w14 w15 w16se w16cid w16 w16cex w16sdtdh w16sdtfl w16du wp14">
+  <w15:person w15:author="noura Romari">
+    <w15:presenceInfo w15:providerId="Windows Live" w15:userId="bcc0ceeb09390d83"/>
+  </w15:person>
+</w15:people>
 </file>
 
 <file path=word/styles.xml><?xml version="1.0" encoding="utf-8"?>
@@ -5862,7 +6813,7 @@
     <w:link w:val="Titre1Car"/>
     <w:autoRedefine/>
     <w:qFormat/>
-    <w:rsid w:val="00D10D6C"/>
+    <w:rsid w:val="003428FB"/>
     <w:pPr>
       <w:keepNext/>
       <w:pageBreakBefore/>
@@ -5873,7 +6824,7 @@
         <w:tab w:val="clear" w:pos="284"/>
         <w:tab w:val="num" w:pos="-284"/>
       </w:tabs>
-      <w:spacing w:after="60"/>
+      <w:spacing w:after="60" w:line="276" w:lineRule="auto"/>
       <w:ind w:left="567" w:hanging="567"/>
       <w:jc w:val="left"/>
       <w:outlineLvl w:val="0"/>
@@ -5896,14 +6847,14 @@
     <w:link w:val="Titre2Car"/>
     <w:autoRedefine/>
     <w:qFormat/>
-    <w:rsid w:val="00E440A5"/>
+    <w:rsid w:val="003428FB"/>
     <w:pPr>
       <w:keepNext/>
       <w:numPr>
         <w:ilvl w:val="1"/>
         <w:numId w:val="19"/>
       </w:numPr>
-      <w:spacing w:after="60"/>
+      <w:spacing w:after="60" w:line="360" w:lineRule="auto"/>
       <w:jc w:val="left"/>
       <w:outlineLvl w:val="1"/>
     </w:pPr>
@@ -6077,6 +7028,7 @@
   <w:style w:type="character" w:default="1" w:styleId="Policepardfaut">
     <w:name w:val="Default Paragraph Font"/>
     <w:uiPriority w:val="1"/>
+    <w:semiHidden/>
     <w:unhideWhenUsed/>
   </w:style>
   <w:style w:type="table" w:default="1" w:styleId="TableauNormal">
@@ -6878,7 +7830,7 @@
     <w:aliases w:val="Titre 2 FR Car,Heading1 Car,t2.T2.Titre 2 Car,t2 Car,T2 Car,X.1.1 Car,Ctrl+2 Car,2 Car,h2 Car,w2 Car,sub-sect Car,Titre 2  Car"/>
     <w:basedOn w:val="Policepardfaut"/>
     <w:link w:val="Titre2"/>
-    <w:rsid w:val="00E440A5"/>
+    <w:rsid w:val="003428FB"/>
     <w:rPr>
       <w:rFonts w:ascii="Arial Gras" w:hAnsi="Arial Gras" w:cs="Arial"/>
       <w:b/>
@@ -7066,7 +8018,7 @@
     <w:aliases w:val="Titre 1 FR Car,Chapter Car,t1.T1.Titre 1 Car,t1 Car,T1 Car,X.1 Car,Main Para Car,Ctrl+1 Car,Heading 1A Car,1 Car,level 1 Car"/>
     <w:basedOn w:val="Policepardfaut"/>
     <w:link w:val="Titre1"/>
-    <w:rsid w:val="00D10D6C"/>
+    <w:rsid w:val="003428FB"/>
     <w:rPr>
       <w:rFonts w:ascii="Arial Gras" w:hAnsi="Arial Gras" w:cs="Arial"/>
       <w:b/>
@@ -7696,7 +8648,7 @@
       <w:numPr>
         <w:numId w:val="0"/>
       </w:numPr>
-      <w:spacing w:after="0" w:line="276" w:lineRule="auto"/>
+      <w:spacing w:after="0"/>
       <w:outlineLvl w:val="9"/>
     </w:pPr>
     <w:rPr>
@@ -10711,6 +11663,18 @@
       <w:color w:val="000080"/>
       <w:sz w:val="22"/>
       <w:szCs w:val="24"/>
+    </w:rPr>
+  </w:style>
+  <w:style w:type="character" w:styleId="Mentionnonrsolue">
+    <w:name w:val="Unresolved Mention"/>
+    <w:basedOn w:val="Policepardfaut"/>
+    <w:uiPriority w:val="99"/>
+    <w:semiHidden/>
+    <w:unhideWhenUsed/>
+    <w:rsid w:val="003428FB"/>
+    <w:rPr>
+      <w:color w:val="605E5C"/>
+      <w:shd w:val="clear" w:color="auto" w:fill="E1DFDD"/>
     </w:rPr>
   </w:style>
 </w:styles>

</xml_diff>

<commit_message>
ajout section Materiel et Methodes + tableau recap + test ANOVA
</commit_message>
<xml_diff>
--- a/reports/presentation_Covid_Liora.docx
+++ b/reports/presentation_Covid_Liora.docx
@@ -85,7 +85,7 @@
                 <w:color w:val="FFFFFF" w:themeColor="background1"/>
               </w:rPr>
               <w:drawing>
-                <wp:anchor distT="0" distB="0" distL="114300" distR="114300" simplePos="0" relativeHeight="251660288" behindDoc="1" locked="0" layoutInCell="1" allowOverlap="1" wp14:anchorId="4D60BEFB" wp14:editId="1123247C">
+                <wp:anchor distT="0" distB="0" distL="114300" distR="114300" simplePos="0" relativeHeight="251660288" behindDoc="1" locked="0" layoutInCell="1" allowOverlap="1" wp14:anchorId="4D60BEFB" wp14:editId="67A462D5">
                   <wp:simplePos x="0" y="0"/>
                   <wp:positionH relativeFrom="column">
                     <wp:posOffset>-57149</wp:posOffset>
@@ -1295,7 +1295,6 @@
         <w:p>
           <w:pPr>
             <w:pStyle w:val="TM1"/>
-            <w:spacing w:line="360" w:lineRule="auto"/>
             <w:rPr>
               <w:rFonts w:asciiTheme="minorHAnsi" w:eastAsiaTheme="minorEastAsia" w:hAnsiTheme="minorHAnsi" w:cstheme="minorBidi"/>
               <w:b w:val="0"/>
@@ -1316,7 +1315,7 @@
           <w:r>
             <w:fldChar w:fldCharType="separate"/>
           </w:r>
-          <w:hyperlink w:anchor="_Toc232527853" w:history="1">
+          <w:hyperlink w:anchor="_Toc232579674" w:history="1">
             <w:r>
               <w:rPr>
                 <w:rStyle w:val="Lienhypertexte"/>
@@ -1359,7 +1358,7 @@
               <w:rPr>
                 <w:webHidden/>
               </w:rPr>
-              <w:instrText xml:space="preserve"> PAGEREF _Toc232527853 \h </w:instrText>
+              <w:instrText xml:space="preserve"> PAGEREF _Toc232579674 \h </w:instrText>
             </w:r>
             <w:r>
               <w:rPr>
@@ -1389,7 +1388,6 @@
         <w:p>
           <w:pPr>
             <w:pStyle w:val="TM2"/>
-            <w:spacing w:line="360" w:lineRule="auto"/>
             <w:rPr>
               <w:rFonts w:asciiTheme="minorHAnsi" w:eastAsiaTheme="minorEastAsia" w:hAnsiTheme="minorHAnsi" w:cstheme="minorBidi"/>
               <w:smallCaps w:val="0"/>
@@ -1399,7 +1397,7 @@
               <w14:ligatures w14:val="standardContextual"/>
             </w:rPr>
           </w:pPr>
-          <w:hyperlink w:anchor="_Toc232527854" w:history="1">
+          <w:hyperlink w:anchor="_Toc232579675" w:history="1">
             <w:r>
               <w:rPr>
                 <w:rStyle w:val="Lienhypertexte"/>
@@ -1421,7 +1419,7 @@
               <w:rPr>
                 <w:rStyle w:val="Lienhypertexte"/>
               </w:rPr>
-              <w:t>Objet</w:t>
+              <w:t>Contexte</w:t>
             </w:r>
             <w:r>
               <w:rPr>
@@ -1439,7 +1437,7 @@
               <w:rPr>
                 <w:webHidden/>
               </w:rPr>
-              <w:instrText xml:space="preserve"> PAGEREF _Toc232527854 \h </w:instrText>
+              <w:instrText xml:space="preserve"> PAGEREF _Toc232579675 \h </w:instrText>
             </w:r>
             <w:r>
               <w:rPr>
@@ -1469,7 +1467,6 @@
         <w:p>
           <w:pPr>
             <w:pStyle w:val="TM2"/>
-            <w:spacing w:line="360" w:lineRule="auto"/>
             <w:rPr>
               <w:rFonts w:asciiTheme="minorHAnsi" w:eastAsiaTheme="minorEastAsia" w:hAnsiTheme="minorHAnsi" w:cstheme="minorBidi"/>
               <w:smallCaps w:val="0"/>
@@ -1479,7 +1476,7 @@
               <w14:ligatures w14:val="standardContextual"/>
             </w:rPr>
           </w:pPr>
-          <w:hyperlink w:anchor="_Toc232527855" w:history="1">
+          <w:hyperlink w:anchor="_Toc232579676" w:history="1">
             <w:r>
               <w:rPr>
                 <w:rStyle w:val="Lienhypertexte"/>
@@ -1501,7 +1498,7 @@
               <w:rPr>
                 <w:rStyle w:val="Lienhypertexte"/>
               </w:rPr>
-              <w:t>Domaine d’application</w:t>
+              <w:t>Mise en place de l’environnement du projet</w:t>
             </w:r>
             <w:r>
               <w:rPr>
@@ -1519,7 +1516,7 @@
               <w:rPr>
                 <w:webHidden/>
               </w:rPr>
-              <w:instrText xml:space="preserve"> PAGEREF _Toc232527855 \h </w:instrText>
+              <w:instrText xml:space="preserve"> PAGEREF _Toc232579676 \h </w:instrText>
             </w:r>
             <w:r>
               <w:rPr>
@@ -1536,87 +1533,7 @@
               <w:rPr>
                 <w:webHidden/>
               </w:rPr>
-              <w:t>6</w:t>
-            </w:r>
-            <w:r>
-              <w:rPr>
-                <w:webHidden/>
-              </w:rPr>
-              <w:fldChar w:fldCharType="end"/>
-            </w:r>
-          </w:hyperlink>
-        </w:p>
-        <w:p>
-          <w:pPr>
-            <w:pStyle w:val="TM2"/>
-            <w:spacing w:line="360" w:lineRule="auto"/>
-            <w:rPr>
-              <w:rFonts w:asciiTheme="minorHAnsi" w:eastAsiaTheme="minorEastAsia" w:hAnsiTheme="minorHAnsi" w:cstheme="minorBidi"/>
-              <w:smallCaps w:val="0"/>
-              <w:kern w:val="2"/>
-              <w:sz w:val="24"/>
-              <w:szCs w:val="24"/>
-              <w14:ligatures w14:val="standardContextual"/>
-            </w:rPr>
-          </w:pPr>
-          <w:hyperlink w:anchor="_Toc232527856" w:history="1">
-            <w:r>
-              <w:rPr>
-                <w:rStyle w:val="Lienhypertexte"/>
-              </w:rPr>
-              <w:t>1.3</w:t>
-            </w:r>
-            <w:r>
-              <w:rPr>
-                <w:rFonts w:asciiTheme="minorHAnsi" w:eastAsiaTheme="minorEastAsia" w:hAnsiTheme="minorHAnsi" w:cstheme="minorBidi"/>
-                <w:smallCaps w:val="0"/>
-                <w:kern w:val="2"/>
-                <w:sz w:val="24"/>
-                <w:szCs w:val="24"/>
-                <w14:ligatures w14:val="standardContextual"/>
-              </w:rPr>
-              <w:tab/>
-            </w:r>
-            <w:r>
-              <w:rPr>
-                <w:rStyle w:val="Lienhypertexte"/>
-              </w:rPr>
-              <w:t>Présentation du logiciel</w:t>
-            </w:r>
-            <w:r>
-              <w:rPr>
-                <w:webHidden/>
-              </w:rPr>
-              <w:tab/>
-            </w:r>
-            <w:r>
-              <w:rPr>
-                <w:webHidden/>
-              </w:rPr>
-              <w:fldChar w:fldCharType="begin"/>
-            </w:r>
-            <w:r>
-              <w:rPr>
-                <w:webHidden/>
-              </w:rPr>
-              <w:instrText xml:space="preserve"> PAGEREF _Toc232527856 \h </w:instrText>
-            </w:r>
-            <w:r>
-              <w:rPr>
-                <w:webHidden/>
-              </w:rPr>
-            </w:r>
-            <w:r>
-              <w:rPr>
-                <w:webHidden/>
-              </w:rPr>
-              <w:fldChar w:fldCharType="separate"/>
-            </w:r>
-            <w:r>
-              <w:rPr>
-                <w:webHidden/>
-              </w:rPr>
-              <w:t>6</w:t>
+              <w:t>8</w:t>
             </w:r>
             <w:r>
               <w:rPr>
@@ -1633,7 +1550,6 @@
               <w:tab w:val="left" w:pos="1540"/>
               <w:tab w:val="right" w:leader="dot" w:pos="9912"/>
             </w:tabs>
-            <w:spacing w:line="360" w:lineRule="auto"/>
             <w:rPr>
               <w:rFonts w:eastAsiaTheme="minorEastAsia" w:cstheme="minorBidi"/>
               <w:i w:val="0"/>
@@ -1645,7 +1561,7 @@
               <w14:ligatures w14:val="standardContextual"/>
             </w:rPr>
           </w:pPr>
-          <w:hyperlink w:anchor="_Toc232527857" w:history="1">
+          <w:hyperlink w:anchor="_Toc232579677" w:history="1">
             <w:r>
               <w:rPr>
                 <w:rStyle w:val="Lienhypertexte"/>
@@ -1657,7 +1573,7 @@
                   </w14:lightRig>
                 </w14:scene3d>
               </w:rPr>
-              <w:t>1.3.1</w:t>
+              <w:t>1.2.1</w:t>
             </w:r>
             <w:r>
               <w:rPr>
@@ -1677,7 +1593,7 @@
                 <w:rStyle w:val="Lienhypertexte"/>
                 <w:noProof/>
               </w:rPr>
-              <w:t>Présentation de DS</w:t>
+              <w:t>Présentation</w:t>
             </w:r>
             <w:r>
               <w:rPr>
@@ -1698,7 +1614,7 @@
                 <w:noProof/>
                 <w:webHidden/>
               </w:rPr>
-              <w:instrText xml:space="preserve"> PAGEREF _Toc232527857 \h </w:instrText>
+              <w:instrText xml:space="preserve"> PAGEREF _Toc232579677 \h </w:instrText>
             </w:r>
             <w:r>
               <w:rPr>
@@ -1718,11 +1634,416 @@
                 <w:noProof/>
                 <w:webHidden/>
               </w:rPr>
-              <w:t>6</w:t>
+              <w:t>8</w:t>
             </w:r>
             <w:r>
               <w:rPr>
                 <w:noProof/>
+                <w:webHidden/>
+              </w:rPr>
+              <w:fldChar w:fldCharType="end"/>
+            </w:r>
+          </w:hyperlink>
+        </w:p>
+        <w:p>
+          <w:pPr>
+            <w:pStyle w:val="TM1"/>
+            <w:rPr>
+              <w:rFonts w:asciiTheme="minorHAnsi" w:eastAsiaTheme="minorEastAsia" w:hAnsiTheme="minorHAnsi" w:cstheme="minorBidi"/>
+              <w:b w:val="0"/>
+              <w:bCs w:val="0"/>
+              <w:caps w:val="0"/>
+              <w:kern w:val="2"/>
+              <w:sz w:val="24"/>
+              <w:szCs w:val="24"/>
+              <w14:ligatures w14:val="standardContextual"/>
+            </w:rPr>
+          </w:pPr>
+          <w:hyperlink w:anchor="_Toc232579678" w:history="1">
+            <w:r>
+              <w:rPr>
+                <w:rStyle w:val="Lienhypertexte"/>
+                <w:rFonts w:cs="Times New Roman"/>
+              </w:rPr>
+              <w:t>2.</w:t>
+            </w:r>
+            <w:r>
+              <w:rPr>
+                <w:rFonts w:asciiTheme="minorHAnsi" w:eastAsiaTheme="minorEastAsia" w:hAnsiTheme="minorHAnsi" w:cstheme="minorBidi"/>
+                <w:b w:val="0"/>
+                <w:bCs w:val="0"/>
+                <w:caps w:val="0"/>
+                <w:kern w:val="2"/>
+                <w:sz w:val="24"/>
+                <w:szCs w:val="24"/>
+                <w14:ligatures w14:val="standardContextual"/>
+              </w:rPr>
+              <w:tab/>
+            </w:r>
+            <w:r>
+              <w:rPr>
+                <w:rStyle w:val="Lienhypertexte"/>
+              </w:rPr>
+              <w:t>Matériel et Méthodes</w:t>
+            </w:r>
+            <w:r>
+              <w:rPr>
+                <w:webHidden/>
+              </w:rPr>
+              <w:tab/>
+            </w:r>
+            <w:r>
+              <w:rPr>
+                <w:webHidden/>
+              </w:rPr>
+              <w:fldChar w:fldCharType="begin"/>
+            </w:r>
+            <w:r>
+              <w:rPr>
+                <w:webHidden/>
+              </w:rPr>
+              <w:instrText xml:space="preserve"> PAGEREF _Toc232579678 \h </w:instrText>
+            </w:r>
+            <w:r>
+              <w:rPr>
+                <w:webHidden/>
+              </w:rPr>
+            </w:r>
+            <w:r>
+              <w:rPr>
+                <w:webHidden/>
+              </w:rPr>
+              <w:fldChar w:fldCharType="separate"/>
+            </w:r>
+            <w:r>
+              <w:rPr>
+                <w:webHidden/>
+              </w:rPr>
+              <w:t>9</w:t>
+            </w:r>
+            <w:r>
+              <w:rPr>
+                <w:webHidden/>
+              </w:rPr>
+              <w:fldChar w:fldCharType="end"/>
+            </w:r>
+          </w:hyperlink>
+        </w:p>
+        <w:p>
+          <w:pPr>
+            <w:pStyle w:val="TM2"/>
+            <w:rPr>
+              <w:rFonts w:asciiTheme="minorHAnsi" w:eastAsiaTheme="minorEastAsia" w:hAnsiTheme="minorHAnsi" w:cstheme="minorBidi"/>
+              <w:smallCaps w:val="0"/>
+              <w:kern w:val="2"/>
+              <w:sz w:val="24"/>
+              <w:szCs w:val="24"/>
+              <w14:ligatures w14:val="standardContextual"/>
+            </w:rPr>
+          </w:pPr>
+          <w:hyperlink w:anchor="_Toc232579679" w:history="1">
+            <w:r>
+              <w:rPr>
+                <w:rStyle w:val="Lienhypertexte"/>
+              </w:rPr>
+              <w:t>2.1</w:t>
+            </w:r>
+            <w:r>
+              <w:rPr>
+                <w:rFonts w:asciiTheme="minorHAnsi" w:eastAsiaTheme="minorEastAsia" w:hAnsiTheme="minorHAnsi" w:cstheme="minorBidi"/>
+                <w:smallCaps w:val="0"/>
+                <w:kern w:val="2"/>
+                <w:sz w:val="24"/>
+                <w:szCs w:val="24"/>
+                <w14:ligatures w14:val="standardContextual"/>
+              </w:rPr>
+              <w:tab/>
+            </w:r>
+            <w:r>
+              <w:rPr>
+                <w:rStyle w:val="Lienhypertexte"/>
+              </w:rPr>
+              <w:t>Données</w:t>
+            </w:r>
+            <w:r>
+              <w:rPr>
+                <w:webHidden/>
+              </w:rPr>
+              <w:tab/>
+            </w:r>
+            <w:r>
+              <w:rPr>
+                <w:webHidden/>
+              </w:rPr>
+              <w:fldChar w:fldCharType="begin"/>
+            </w:r>
+            <w:r>
+              <w:rPr>
+                <w:webHidden/>
+              </w:rPr>
+              <w:instrText xml:space="preserve"> PAGEREF _Toc232579679 \h </w:instrText>
+            </w:r>
+            <w:r>
+              <w:rPr>
+                <w:webHidden/>
+              </w:rPr>
+            </w:r>
+            <w:r>
+              <w:rPr>
+                <w:webHidden/>
+              </w:rPr>
+              <w:fldChar w:fldCharType="separate"/>
+            </w:r>
+            <w:r>
+              <w:rPr>
+                <w:webHidden/>
+              </w:rPr>
+              <w:t>9</w:t>
+            </w:r>
+            <w:r>
+              <w:rPr>
+                <w:webHidden/>
+              </w:rPr>
+              <w:fldChar w:fldCharType="end"/>
+            </w:r>
+          </w:hyperlink>
+        </w:p>
+        <w:p>
+          <w:pPr>
+            <w:pStyle w:val="TM2"/>
+            <w:rPr>
+              <w:rFonts w:asciiTheme="minorHAnsi" w:eastAsiaTheme="minorEastAsia" w:hAnsiTheme="minorHAnsi" w:cstheme="minorBidi"/>
+              <w:smallCaps w:val="0"/>
+              <w:kern w:val="2"/>
+              <w:sz w:val="24"/>
+              <w:szCs w:val="24"/>
+              <w14:ligatures w14:val="standardContextual"/>
+            </w:rPr>
+          </w:pPr>
+          <w:hyperlink w:anchor="_Toc232579680" w:history="1">
+            <w:r>
+              <w:rPr>
+                <w:rStyle w:val="Lienhypertexte"/>
+              </w:rPr>
+              <w:t>2.2</w:t>
+            </w:r>
+            <w:r>
+              <w:rPr>
+                <w:rFonts w:asciiTheme="minorHAnsi" w:eastAsiaTheme="minorEastAsia" w:hAnsiTheme="minorHAnsi" w:cstheme="minorBidi"/>
+                <w:smallCaps w:val="0"/>
+                <w:kern w:val="2"/>
+                <w:sz w:val="24"/>
+                <w:szCs w:val="24"/>
+                <w14:ligatures w14:val="standardContextual"/>
+              </w:rPr>
+              <w:tab/>
+            </w:r>
+            <w:r>
+              <w:rPr>
+                <w:rStyle w:val="Lienhypertexte"/>
+              </w:rPr>
+              <w:t>Outils</w:t>
+            </w:r>
+            <w:r>
+              <w:rPr>
+                <w:webHidden/>
+              </w:rPr>
+              <w:tab/>
+            </w:r>
+            <w:r>
+              <w:rPr>
+                <w:webHidden/>
+              </w:rPr>
+              <w:fldChar w:fldCharType="begin"/>
+            </w:r>
+            <w:r>
+              <w:rPr>
+                <w:webHidden/>
+              </w:rPr>
+              <w:instrText xml:space="preserve"> PAGEREF _Toc232579680 \h </w:instrText>
+            </w:r>
+            <w:r>
+              <w:rPr>
+                <w:webHidden/>
+              </w:rPr>
+            </w:r>
+            <w:r>
+              <w:rPr>
+                <w:webHidden/>
+              </w:rPr>
+              <w:fldChar w:fldCharType="separate"/>
+            </w:r>
+            <w:r>
+              <w:rPr>
+                <w:webHidden/>
+              </w:rPr>
+              <w:t>9</w:t>
+            </w:r>
+            <w:r>
+              <w:rPr>
+                <w:webHidden/>
+              </w:rPr>
+              <w:fldChar w:fldCharType="end"/>
+            </w:r>
+          </w:hyperlink>
+        </w:p>
+        <w:p>
+          <w:pPr>
+            <w:pStyle w:val="TM2"/>
+            <w:rPr>
+              <w:rFonts w:asciiTheme="minorHAnsi" w:eastAsiaTheme="minorEastAsia" w:hAnsiTheme="minorHAnsi" w:cstheme="minorBidi"/>
+              <w:smallCaps w:val="0"/>
+              <w:kern w:val="2"/>
+              <w:sz w:val="24"/>
+              <w:szCs w:val="24"/>
+              <w14:ligatures w14:val="standardContextual"/>
+            </w:rPr>
+          </w:pPr>
+          <w:hyperlink w:anchor="_Toc232579681" w:history="1">
+            <w:r>
+              <w:rPr>
+                <w:rStyle w:val="Lienhypertexte"/>
+              </w:rPr>
+              <w:t>2.3</w:t>
+            </w:r>
+            <w:r>
+              <w:rPr>
+                <w:rFonts w:asciiTheme="minorHAnsi" w:eastAsiaTheme="minorEastAsia" w:hAnsiTheme="minorHAnsi" w:cstheme="minorBidi"/>
+                <w:smallCaps w:val="0"/>
+                <w:kern w:val="2"/>
+                <w:sz w:val="24"/>
+                <w:szCs w:val="24"/>
+                <w14:ligatures w14:val="standardContextual"/>
+              </w:rPr>
+              <w:tab/>
+            </w:r>
+            <w:r>
+              <w:rPr>
+                <w:rStyle w:val="Lienhypertexte"/>
+              </w:rPr>
+              <w:t>Démarche d'exploration</w:t>
+            </w:r>
+            <w:r>
+              <w:rPr>
+                <w:webHidden/>
+              </w:rPr>
+              <w:tab/>
+            </w:r>
+            <w:r>
+              <w:rPr>
+                <w:webHidden/>
+              </w:rPr>
+              <w:fldChar w:fldCharType="begin"/>
+            </w:r>
+            <w:r>
+              <w:rPr>
+                <w:webHidden/>
+              </w:rPr>
+              <w:instrText xml:space="preserve"> PAGEREF _Toc232579681 \h </w:instrText>
+            </w:r>
+            <w:r>
+              <w:rPr>
+                <w:webHidden/>
+              </w:rPr>
+            </w:r>
+            <w:r>
+              <w:rPr>
+                <w:webHidden/>
+              </w:rPr>
+              <w:fldChar w:fldCharType="separate"/>
+            </w:r>
+            <w:r>
+              <w:rPr>
+                <w:webHidden/>
+              </w:rPr>
+              <w:t>9</w:t>
+            </w:r>
+            <w:r>
+              <w:rPr>
+                <w:webHidden/>
+              </w:rPr>
+              <w:fldChar w:fldCharType="end"/>
+            </w:r>
+          </w:hyperlink>
+        </w:p>
+        <w:p>
+          <w:pPr>
+            <w:pStyle w:val="TM1"/>
+            <w:rPr>
+              <w:rFonts w:asciiTheme="minorHAnsi" w:eastAsiaTheme="minorEastAsia" w:hAnsiTheme="minorHAnsi" w:cstheme="minorBidi"/>
+              <w:b w:val="0"/>
+              <w:bCs w:val="0"/>
+              <w:caps w:val="0"/>
+              <w:kern w:val="2"/>
+              <w:sz w:val="24"/>
+              <w:szCs w:val="24"/>
+              <w14:ligatures w14:val="standardContextual"/>
+            </w:rPr>
+          </w:pPr>
+          <w:hyperlink w:anchor="_Toc232579682" w:history="1">
+            <w:r>
+              <w:rPr>
+                <w:rStyle w:val="Lienhypertexte"/>
+                <w:rFonts w:cs="Times New Roman"/>
+              </w:rPr>
+              <w:t>3.</w:t>
+            </w:r>
+            <w:r>
+              <w:rPr>
+                <w:rFonts w:asciiTheme="minorHAnsi" w:eastAsiaTheme="minorEastAsia" w:hAnsiTheme="minorHAnsi" w:cstheme="minorBidi"/>
+                <w:b w:val="0"/>
+                <w:bCs w:val="0"/>
+                <w:caps w:val="0"/>
+                <w:kern w:val="2"/>
+                <w:sz w:val="24"/>
+                <w:szCs w:val="24"/>
+                <w14:ligatures w14:val="standardContextual"/>
+              </w:rPr>
+              <w:tab/>
+            </w:r>
+            <w:r>
+              <w:rPr>
+                <w:rStyle w:val="Lienhypertexte"/>
+              </w:rPr>
+              <w:t>REFERENCES (à mettre en derniere place du sommaire)</w:t>
+            </w:r>
+            <w:r>
+              <w:rPr>
+                <w:webHidden/>
+              </w:rPr>
+              <w:tab/>
+            </w:r>
+            <w:r>
+              <w:rPr>
+                <w:webHidden/>
+              </w:rPr>
+              <w:fldChar w:fldCharType="begin"/>
+            </w:r>
+            <w:r>
+              <w:rPr>
+                <w:webHidden/>
+              </w:rPr>
+              <w:instrText xml:space="preserve"> PAGEREF _Toc232579682 \h </w:instrText>
+            </w:r>
+            <w:r>
+              <w:rPr>
+                <w:webHidden/>
+              </w:rPr>
+            </w:r>
+            <w:r>
+              <w:rPr>
+                <w:webHidden/>
+              </w:rPr>
+              <w:fldChar w:fldCharType="separate"/>
+            </w:r>
+            <w:r>
+              <w:rPr>
+                <w:webHidden/>
+              </w:rPr>
+              <w:t>10</w:t>
+            </w:r>
+            <w:r>
+              <w:rPr>
                 <w:webHidden/>
               </w:rPr>
               <w:fldChar w:fldCharType="end"/>
@@ -1902,7 +2223,7 @@
       </w:pPr>
       <w:bookmarkStart w:id="0" w:name="_Toc522805191"/>
       <w:bookmarkStart w:id="1" w:name="_Toc529538238"/>
-      <w:bookmarkStart w:id="2" w:name="_Toc232527853"/>
+      <w:bookmarkStart w:id="2" w:name="_Toc232579674"/>
       <w:r>
         <w:lastRenderedPageBreak/>
         <w:t>Généralités</w:t>
@@ -1915,35 +2236,37 @@
       <w:pPr>
         <w:pStyle w:val="Titre2"/>
       </w:pPr>
+      <w:bookmarkStart w:id="3" w:name="_Toc232579675"/>
       <w:r>
         <w:t>Contexte</w:t>
       </w:r>
+      <w:bookmarkEnd w:id="3"/>
     </w:p>
     <w:p>
       <w:pPr>
         <w:spacing w:before="120" w:after="0" w:line="360" w:lineRule="auto"/>
         <w:ind w:firstLine="0"/>
       </w:pPr>
-      <w:bookmarkStart w:id="3" w:name="_Toc408749389"/>
-      <w:bookmarkStart w:id="4" w:name="_Toc413214120"/>
-      <w:bookmarkStart w:id="5" w:name="_Toc427073281"/>
-      <w:bookmarkStart w:id="6" w:name="_Toc475752933"/>
-      <w:bookmarkStart w:id="7" w:name="_Toc475753472"/>
-      <w:bookmarkStart w:id="8" w:name="_Toc475767441"/>
-      <w:bookmarkStart w:id="9" w:name="_Toc475782535"/>
-      <w:bookmarkStart w:id="10" w:name="_Toc475785302"/>
-      <w:bookmarkStart w:id="11" w:name="_Toc475785528"/>
-      <w:bookmarkStart w:id="12" w:name="_Toc475785668"/>
-      <w:bookmarkStart w:id="13" w:name="_Toc475841806"/>
-      <w:bookmarkStart w:id="14" w:name="_Toc476457664"/>
-      <w:bookmarkStart w:id="15" w:name="_Toc476548250"/>
-      <w:bookmarkStart w:id="16" w:name="_Toc477773122"/>
-      <w:bookmarkStart w:id="17" w:name="_Toc107894973"/>
-      <w:bookmarkStart w:id="18" w:name="_Toc107912860"/>
-      <w:bookmarkStart w:id="19" w:name="_Toc182878907"/>
-      <w:bookmarkStart w:id="20" w:name="_Toc204483506"/>
-      <w:bookmarkStart w:id="21" w:name="_Toc304214571"/>
-      <w:bookmarkStart w:id="22" w:name="_Toc522805193"/>
+      <w:bookmarkStart w:id="4" w:name="_Toc408749389"/>
+      <w:bookmarkStart w:id="5" w:name="_Toc413214120"/>
+      <w:bookmarkStart w:id="6" w:name="_Toc427073281"/>
+      <w:bookmarkStart w:id="7" w:name="_Toc475752933"/>
+      <w:bookmarkStart w:id="8" w:name="_Toc475753472"/>
+      <w:bookmarkStart w:id="9" w:name="_Toc475767441"/>
+      <w:bookmarkStart w:id="10" w:name="_Toc475782535"/>
+      <w:bookmarkStart w:id="11" w:name="_Toc475785302"/>
+      <w:bookmarkStart w:id="12" w:name="_Toc475785528"/>
+      <w:bookmarkStart w:id="13" w:name="_Toc475785668"/>
+      <w:bookmarkStart w:id="14" w:name="_Toc475841806"/>
+      <w:bookmarkStart w:id="15" w:name="_Toc476457664"/>
+      <w:bookmarkStart w:id="16" w:name="_Toc476548250"/>
+      <w:bookmarkStart w:id="17" w:name="_Toc477773122"/>
+      <w:bookmarkStart w:id="18" w:name="_Toc107894973"/>
+      <w:bookmarkStart w:id="19" w:name="_Toc107912860"/>
+      <w:bookmarkStart w:id="20" w:name="_Toc182878907"/>
+      <w:bookmarkStart w:id="21" w:name="_Toc204483506"/>
+      <w:bookmarkStart w:id="22" w:name="_Toc304214571"/>
+      <w:bookmarkStart w:id="23" w:name="_Toc522805193"/>
       <w:r>
         <w:t>L</w:t>
       </w:r>
@@ -2442,8 +2765,8 @@
           <w:bCs/>
         </w:rPr>
       </w:pPr>
-      <w:bookmarkStart w:id="23" w:name="_Toc43731543"/>
-      <w:bookmarkStart w:id="24" w:name="_Toc232528732"/>
+      <w:bookmarkStart w:id="24" w:name="_Toc43731543"/>
+      <w:bookmarkStart w:id="25" w:name="_Toc232528732"/>
       <w:r>
         <w:rPr>
           <w:b/>
@@ -2490,8 +2813,8 @@
         </w:rPr>
         <w:t xml:space="preserve"> : </w:t>
       </w:r>
-      <w:bookmarkEnd w:id="23"/>
-      <w:commentRangeStart w:id="25"/>
+      <w:bookmarkEnd w:id="24"/>
+      <w:commentRangeStart w:id="26"/>
       <w:r>
         <w:rPr>
           <w:b/>
@@ -2499,8 +2822,8 @@
         </w:rPr>
         <w:t>Contexte</w:t>
       </w:r>
-      <w:bookmarkEnd w:id="24"/>
-      <w:commentRangeEnd w:id="25"/>
+      <w:bookmarkEnd w:id="25"/>
+      <w:commentRangeEnd w:id="26"/>
       <w:r>
         <w:rPr>
           <w:rStyle w:val="Marquedecommentaire"/>
@@ -2509,7 +2832,7 @@
           <w:sz w:val="22"/>
           <w:szCs w:val="24"/>
         </w:rPr>
-        <w:commentReference w:id="25"/>
+        <w:commentReference w:id="26"/>
       </w:r>
     </w:p>
     <w:p>
@@ -2521,65 +2844,66 @@
         <w:br w:type="page"/>
       </w:r>
     </w:p>
-    <w:bookmarkEnd w:id="3"/>
-    <w:bookmarkEnd w:id="4"/>
-    <w:bookmarkEnd w:id="5"/>
-    <w:bookmarkEnd w:id="6"/>
-    <w:bookmarkEnd w:id="7"/>
-    <w:bookmarkEnd w:id="8"/>
-    <w:bookmarkEnd w:id="9"/>
-    <w:bookmarkEnd w:id="10"/>
-    <w:bookmarkEnd w:id="11"/>
-    <w:bookmarkEnd w:id="12"/>
-    <w:bookmarkEnd w:id="13"/>
-    <w:bookmarkEnd w:id="14"/>
-    <w:bookmarkEnd w:id="15"/>
-    <w:bookmarkEnd w:id="16"/>
-    <w:bookmarkEnd w:id="17"/>
-    <w:bookmarkEnd w:id="18"/>
-    <w:bookmarkEnd w:id="19"/>
-    <w:bookmarkEnd w:id="20"/>
-    <w:bookmarkEnd w:id="21"/>
-    <w:bookmarkEnd w:id="22"/>
     <w:p>
       <w:pPr>
         <w:pStyle w:val="Titre2"/>
       </w:pPr>
+      <w:bookmarkStart w:id="27" w:name="_Toc232579676"/>
+      <w:bookmarkEnd w:id="4"/>
+      <w:bookmarkEnd w:id="5"/>
+      <w:bookmarkEnd w:id="6"/>
+      <w:bookmarkEnd w:id="7"/>
+      <w:bookmarkEnd w:id="8"/>
+      <w:bookmarkEnd w:id="9"/>
+      <w:bookmarkEnd w:id="10"/>
+      <w:bookmarkEnd w:id="11"/>
+      <w:bookmarkEnd w:id="12"/>
+      <w:bookmarkEnd w:id="13"/>
+      <w:bookmarkEnd w:id="14"/>
+      <w:bookmarkEnd w:id="15"/>
+      <w:bookmarkEnd w:id="16"/>
+      <w:bookmarkEnd w:id="17"/>
+      <w:bookmarkEnd w:id="18"/>
+      <w:bookmarkEnd w:id="19"/>
+      <w:bookmarkEnd w:id="20"/>
+      <w:bookmarkEnd w:id="21"/>
+      <w:bookmarkEnd w:id="22"/>
+      <w:bookmarkEnd w:id="23"/>
       <w:r>
         <w:lastRenderedPageBreak/>
         <w:t>Mise en place de l’environnement du projet</w:t>
       </w:r>
+      <w:bookmarkEnd w:id="27"/>
     </w:p>
     <w:p>
       <w:pPr>
         <w:pStyle w:val="Titre3"/>
         <w:spacing w:line="360" w:lineRule="auto"/>
       </w:pPr>
-      <w:bookmarkStart w:id="26" w:name="_Toc408749390"/>
-      <w:bookmarkStart w:id="27" w:name="_Toc413214121"/>
-      <w:bookmarkStart w:id="28" w:name="_Toc427073282"/>
-      <w:bookmarkStart w:id="29" w:name="_Toc475752934"/>
-      <w:bookmarkStart w:id="30" w:name="_Toc475753473"/>
-      <w:bookmarkStart w:id="31" w:name="_Toc475767442"/>
-      <w:bookmarkStart w:id="32" w:name="_Toc475782536"/>
-      <w:bookmarkStart w:id="33" w:name="_Toc475785303"/>
-      <w:bookmarkStart w:id="34" w:name="_Toc475785529"/>
-      <w:bookmarkStart w:id="35" w:name="_Toc475785669"/>
-      <w:bookmarkStart w:id="36" w:name="_Toc475841807"/>
-      <w:bookmarkStart w:id="37" w:name="_Toc476457665"/>
-      <w:bookmarkStart w:id="38" w:name="_Toc476548251"/>
-      <w:bookmarkStart w:id="39" w:name="_Toc477773123"/>
-      <w:bookmarkStart w:id="40" w:name="_Toc107894974"/>
-      <w:bookmarkStart w:id="41" w:name="_Toc107912861"/>
-      <w:bookmarkStart w:id="42" w:name="_Toc182878908"/>
-      <w:bookmarkStart w:id="43" w:name="_Toc204483507"/>
-      <w:bookmarkStart w:id="44" w:name="_Toc304214572"/>
-      <w:bookmarkStart w:id="45" w:name="_Toc511458432"/>
+      <w:bookmarkStart w:id="28" w:name="_Toc408749390"/>
+      <w:bookmarkStart w:id="29" w:name="_Toc413214121"/>
+      <w:bookmarkStart w:id="30" w:name="_Toc427073282"/>
+      <w:bookmarkStart w:id="31" w:name="_Toc475752934"/>
+      <w:bookmarkStart w:id="32" w:name="_Toc475753473"/>
+      <w:bookmarkStart w:id="33" w:name="_Toc475767442"/>
+      <w:bookmarkStart w:id="34" w:name="_Toc475782536"/>
+      <w:bookmarkStart w:id="35" w:name="_Toc475785303"/>
+      <w:bookmarkStart w:id="36" w:name="_Toc475785529"/>
+      <w:bookmarkStart w:id="37" w:name="_Toc475785669"/>
+      <w:bookmarkStart w:id="38" w:name="_Toc475841807"/>
+      <w:bookmarkStart w:id="39" w:name="_Toc476457665"/>
+      <w:bookmarkStart w:id="40" w:name="_Toc476548251"/>
+      <w:bookmarkStart w:id="41" w:name="_Toc477773123"/>
+      <w:bookmarkStart w:id="42" w:name="_Toc107894974"/>
+      <w:bookmarkStart w:id="43" w:name="_Toc107912861"/>
+      <w:bookmarkStart w:id="44" w:name="_Toc182878908"/>
+      <w:bookmarkStart w:id="45" w:name="_Toc204483507"/>
+      <w:bookmarkStart w:id="46" w:name="_Toc304214572"/>
+      <w:bookmarkStart w:id="47" w:name="_Toc511458432"/>
+      <w:bookmarkStart w:id="48" w:name="_Toc232579677"/>
       <w:r>
         <w:t>Présentation</w:t>
       </w:r>
-      <w:bookmarkEnd w:id="26"/>
-      <w:bookmarkEnd w:id="27"/>
       <w:bookmarkEnd w:id="28"/>
       <w:bookmarkEnd w:id="29"/>
       <w:bookmarkEnd w:id="30"/>
@@ -2598,6 +2922,9 @@
       <w:bookmarkEnd w:id="43"/>
       <w:bookmarkEnd w:id="44"/>
       <w:bookmarkEnd w:id="45"/>
+      <w:bookmarkEnd w:id="46"/>
+      <w:bookmarkEnd w:id="47"/>
+      <w:bookmarkEnd w:id="48"/>
     </w:p>
     <w:p>
       <w:pPr>
@@ -2618,10 +2945,150 @@
       <w:pPr>
         <w:pStyle w:val="Titre1"/>
       </w:pPr>
+      <w:bookmarkStart w:id="49" w:name="_Toc232579678"/>
+      <w:r>
+        <w:lastRenderedPageBreak/>
+        <w:t>Matériel et Méthodes</w:t>
+      </w:r>
+      <w:bookmarkEnd w:id="49"/>
+    </w:p>
+    <w:p>
+      <w:pPr>
+        <w:pStyle w:val="Titre2"/>
+      </w:pPr>
+      <w:bookmarkStart w:id="50" w:name="_Toc232579679"/>
+      <w:r>
+        <w:t>Données</w:t>
+      </w:r>
+      <w:bookmarkEnd w:id="50"/>
+    </w:p>
+    <w:p>
+      <w:r>
+        <w:t>Le jeu de données utilisé est le COVID-19 Radiography Database, constitué par une équipe de recherche de Qatar University, University of Dhaka, et leurs collaborateurs au Pakistan et en Malaisie. Il comprend 21 165 radiographies pulmonaires (format PNG, niveaux de gris) réparties en 4 classes : Normal (10 192), Lung Opacity (6 012), COVID-19 (3 616) et Viral Pneumonia (1 345). Chaque image est accompagnée d'un masque de segmentation pulmonaire correspondant.</w:t>
+      </w:r>
+    </w:p>
+    <w:p>
+      <w:r>
+        <w:t>Les images COVID-19 proviennent de sources hétérogènes (PadChest, GitHub, SIRM, et autres dépôts publics), tandis que les classes Normal, Lung Opacity et Viral Pneumonia sont issues de bases de données uniques (RSNA, Kaggle).</w:t>
+      </w:r>
+    </w:p>
+    <w:p>
+      <w:pPr>
+        <w:pStyle w:val="Titre2"/>
+        <w:jc w:val="both"/>
+      </w:pPr>
+      <w:bookmarkStart w:id="51" w:name="_Toc232579680"/>
+      <w:r>
+        <w:t>Outils</w:t>
+      </w:r>
+      <w:bookmarkEnd w:id="51"/>
+    </w:p>
+    <w:p>
+      <w:r>
+        <w:t>L'analyse a été réalisée en Python (3.11), à l'aide des bibliothèques suivantes :</w:t>
+      </w:r>
+    </w:p>
+    <w:p>
+      <w:pPr>
+        <w:pStyle w:val="Listepuces"/>
+      </w:pPr>
+      <w:r>
+        <w:t>OpenCV : chargement et traitement des images, application des masques</w:t>
+      </w:r>
+    </w:p>
+    <w:p>
+      <w:pPr>
+        <w:pStyle w:val="Listepuces"/>
+      </w:pPr>
+      <w:r>
+        <w:t>NumPy : manipulation des données image sous forme de tableaux</w:t>
+      </w:r>
+    </w:p>
+    <w:p>
+      <w:pPr>
+        <w:pStyle w:val="Listepuces"/>
+      </w:pPr>
+      <w:r>
+        <w:t>Pandas : gestion des métadonnées (sources, noms de fichiers)</w:t>
+      </w:r>
+    </w:p>
+    <w:p>
+      <w:pPr>
+        <w:pStyle w:val="Listepuces"/>
+      </w:pPr>
+      <w:r>
+        <w:t>Matplotlib / Seaborn : visualisation des distributions</w:t>
+      </w:r>
+    </w:p>
+    <w:p>
+      <w:pPr>
+        <w:pStyle w:val="Listepuces"/>
+      </w:pPr>
+      <w:r>
+        <w:t>SciPy : tests statistiques (ANOVA)</w:t>
+      </w:r>
+    </w:p>
+    <w:p>
+      <w:pPr>
+        <w:pStyle w:val="Titre2"/>
+        <w:jc w:val="both"/>
+      </w:pPr>
+      <w:bookmarkStart w:id="52" w:name="_Toc232579681"/>
+      <w:r>
+        <w:t>Démarche d'exploration</w:t>
+      </w:r>
+      <w:bookmarkEnd w:id="52"/>
+    </w:p>
+    <w:p>
+      <w:pPr>
+        <w:pStyle w:val="Listenumros"/>
+      </w:pPr>
+      <w:r>
+        <w:t>Inventaire de la structure du dataset et des métadonnées disponibles</w:t>
+      </w:r>
+    </w:p>
+    <w:p>
+      <w:pPr>
+        <w:pStyle w:val="Listenumros"/>
+      </w:pPr>
+      <w:r>
+        <w:t>Vérification des dimensions images/masques et redimensionnement (256→299)</w:t>
+      </w:r>
+    </w:p>
+    <w:p>
+      <w:pPr>
+        <w:pStyle w:val="Listenumros"/>
+      </w:pPr>
+      <w:r>
+        <w:t>Analyse de la distribution des classes (déséquilibre)</w:t>
+      </w:r>
+    </w:p>
+    <w:p>
+      <w:pPr>
+        <w:pStyle w:val="Listenumros"/>
+      </w:pPr>
+      <w:r>
+        <w:t>Analyse de l'hétérogénéité des sources pour la classe COVID-19 (distribution des pixels, luminosité moyenne par source)</w:t>
+      </w:r>
+    </w:p>
+    <w:p>
+      <w:pPr>
+        <w:pStyle w:val="Listenumros"/>
+      </w:pPr>
+      <w:r>
+        <w:t>Validation statistique des observations visuelles par test ANOVA</w:t>
+      </w:r>
+    </w:p>
+    <w:p>
+      <w:pPr>
+        <w:pStyle w:val="Titre1"/>
+      </w:pPr>
+      <w:bookmarkStart w:id="53" w:name="_Toc232579682"/>
       <w:r>
         <w:lastRenderedPageBreak/>
         <w:t>REFERENCES (à mettre en derniere place du sommaire)</w:t>
       </w:r>
+      <w:bookmarkEnd w:id="53"/>
     </w:p>
     <w:p>
       <w:pPr>
@@ -3005,7 +3472,7 @@
 
 <file path=word/comments.xml><?xml version="1.0" encoding="utf-8"?>
 <w:comments xmlns:wpc="http://schemas.microsoft.com/office/word/2010/wordprocessingCanvas" xmlns:cx="http://schemas.microsoft.com/office/drawing/2014/chartex" xmlns:cx1="http://schemas.microsoft.com/office/drawing/2015/9/8/chartex" xmlns:cx2="http://schemas.microsoft.com/office/drawing/2015/10/21/chartex" xmlns:cx3="http://schemas.microsoft.com/office/drawing/2016/5/9/chartex" xmlns:cx4="http://schemas.microsoft.com/office/drawing/2016/5/10/chartex" xmlns:cx5="http://schemas.microsoft.com/office/drawing/2016/5/11/chartex" xmlns:cx6="http://schemas.microsoft.com/office/drawing/2016/5/12/chartex" xmlns:cx7="http://schemas.microsoft.com/office/drawing/2016/5/13/chartex" xmlns:cx8="http://schemas.microsoft.com/office/drawing/2016/5/14/chartex" xmlns:mc="http://schemas.openxmlformats.org/markup-compatibility/2006" xmlns:aink="http://schemas.microsoft.com/office/drawing/2016/ink" xmlns:am3d="http://schemas.microsoft.com/office/drawing/2017/model3d" xmlns:o="urn:schemas-microsoft-com:office:office" xmlns:oel="http://schemas.microsoft.com/office/2019/extlst" xmlns:r="http://schemas.openxmlformats.org/officeDocument/2006/relationships" xmlns:m="http://schemas.openxmlformats.org/officeDocument/2006/math" xmlns:v="urn:schemas-microsoft-com:vml" xmlns:wp14="http://schemas.microsoft.com/office/word/2010/wordprocessingDrawing" xmlns:wp="http://schemas.openxmlformats.org/drawingml/2006/wordprocessingDrawing" xmlns:w10="urn:schemas-microsoft-com:office:word" xmlns:w="http://schemas.openxmlformats.org/wordprocessingml/2006/main" xmlns:w14="http://schemas.microsoft.com/office/word/2010/wordml" xmlns:w15="http://schemas.microsoft.com/office/word/2012/wordml" xmlns:w16cex="http://schemas.microsoft.com/office/word/2018/wordml/cex" xmlns:w16cid="http://schemas.microsoft.com/office/word/2016/wordml/cid" xmlns:w16="http://schemas.microsoft.com/office/word/2018/wordml" xmlns:w16du="http://schemas.microsoft.com/office/word/2023/wordml/word16du" xmlns:w16sdtdh="http://schemas.microsoft.com/office/word/2020/wordml/sdtdatahash" xmlns:w16sdtfl="http://schemas.microsoft.com/office/word/2024/wordml/sdtformatlock" xmlns:w16se="http://schemas.microsoft.com/office/word/2015/wordml/symex" xmlns:wpg="http://schemas.microsoft.com/office/word/2010/wordprocessingGroup" xmlns:wpi="http://schemas.microsoft.com/office/word/2010/wordprocessingInk" xmlns:wne="http://schemas.microsoft.com/office/word/2006/wordml" xmlns:wps="http://schemas.microsoft.com/office/word/2010/wordprocessingShape" mc:Ignorable="w14 w15 w16se w16cid w16 w16cex w16sdtdh w16sdtfl w16du wp14">
-  <w:comment w:id="25" w:author="noura Romari" w:date="2026-06-17T06:38:00Z" w:initials="nR">
+  <w:comment w:id="26" w:author="noura Romari" w:date="2026-06-17T06:38:00Z" w:initials="nR">
     <w:p>
       <w:pPr>
         <w:pStyle w:val="Commentaire"/>

</xml_diff>

<commit_message>
ajustements section Materiel et Methodes
</commit_message>
<xml_diff>
--- a/reports/presentation_Covid_Liora.docx
+++ b/reports/presentation_Covid_Liora.docx
@@ -85,7 +85,7 @@
                 <w:color w:val="FFFFFF" w:themeColor="background1"/>
               </w:rPr>
               <w:drawing>
-                <wp:anchor distT="0" distB="0" distL="114300" distR="114300" simplePos="0" relativeHeight="251660288" behindDoc="1" locked="0" layoutInCell="1" allowOverlap="1" wp14:anchorId="4D60BEFB" wp14:editId="67A462D5">
+                <wp:anchor distT="0" distB="0" distL="114300" distR="114300" simplePos="0" relativeHeight="251660288" behindDoc="1" locked="0" layoutInCell="1" allowOverlap="1" wp14:anchorId="4D60BEFB" wp14:editId="7141A38E">
                   <wp:simplePos x="0" y="0"/>
                   <wp:positionH relativeFrom="column">
                     <wp:posOffset>-57149</wp:posOffset>
@@ -2963,11 +2963,17 @@
       <w:bookmarkEnd w:id="50"/>
     </w:p>
     <w:p>
+      <w:pPr>
+        <w:ind w:firstLine="0"/>
+      </w:pPr>
       <w:r>
         <w:t>Le jeu de données utilisé est le COVID-19 Radiography Database, constitué par une équipe de recherche de Qatar University, University of Dhaka, et leurs collaborateurs au Pakistan et en Malaisie. Il comprend 21 165 radiographies pulmonaires (format PNG, niveaux de gris) réparties en 4 classes : Normal (10 192), Lung Opacity (6 012), COVID-19 (3 616) et Viral Pneumonia (1 345). Chaque image est accompagnée d'un masque de segmentation pulmonaire correspondant.</w:t>
       </w:r>
     </w:p>
     <w:p>
+      <w:pPr>
+        <w:ind w:firstLine="0"/>
+      </w:pPr>
       <w:r>
         <w:t>Les images COVID-19 proviennent de sources hétérogènes (PadChest, GitHub, SIRM, et autres dépôts publics), tandis que les classes Normal, Lung Opacity et Viral Pneumonia sont issues de bases de données uniques (RSNA, Kaggle).</w:t>
       </w:r>
@@ -2984,6 +2990,9 @@
       <w:bookmarkEnd w:id="51"/>
     </w:p>
     <w:p>
+      <w:pPr>
+        <w:ind w:firstLine="0"/>
+      </w:pPr>
       <w:r>
         <w:t>L'analyse a été réalisée en Python (3.11), à l'aide des bibliothèques suivantes :</w:t>
       </w:r>

</xml_diff>

<commit_message>
precision sur la creation des masques (U-Net)
</commit_message>
<xml_diff>
--- a/reports/presentation_Covid_Liora.docx
+++ b/reports/presentation_Covid_Liora.docx
@@ -85,7 +85,7 @@
                 <w:color w:val="FFFFFF" w:themeColor="background1"/>
               </w:rPr>
               <w:drawing>
-                <wp:anchor distT="0" distB="0" distL="114300" distR="114300" simplePos="0" relativeHeight="251660288" behindDoc="1" locked="0" layoutInCell="1" allowOverlap="1" wp14:anchorId="4D60BEFB" wp14:editId="7141A38E">
+                <wp:anchor distT="0" distB="0" distL="114300" distR="114300" simplePos="0" relativeHeight="251660288" behindDoc="1" locked="0" layoutInCell="1" allowOverlap="1" wp14:anchorId="4D60BEFB" wp14:editId="1B44F128">
                   <wp:simplePos x="0" y="0"/>
                   <wp:positionH relativeFrom="column">
                     <wp:posOffset>-57149</wp:posOffset>
@@ -2980,6 +2980,14 @@
     </w:p>
     <w:p>
       <w:pPr>
+        <w:ind w:firstLine="0"/>
+      </w:pPr>
+      <w:r>
+        <w:t>Les masques de segmentation pulmonaire fournis avec le dataset n'ont pas été créés manuellement par source, mais générés de façon automatique et homogène par un réseau de neurones U-Net modifié, appliqué par les auteurs du dataset sur l'ensemble des images (Chowdhury et al., 2020).</w:t>
+      </w:r>
+    </w:p>
+    <w:p>
+      <w:pPr>
         <w:pStyle w:val="Titre2"/>
         <w:jc w:val="both"/>
       </w:pPr>
@@ -7504,7 +7512,6 @@
   <w:style w:type="character" w:default="1" w:styleId="Policepardfaut">
     <w:name w:val="Default Paragraph Font"/>
     <w:uiPriority w:val="1"/>
-    <w:semiHidden/>
     <w:unhideWhenUsed/>
   </w:style>
   <w:style w:type="table" w:default="1" w:styleId="TableauNormal">

</xml_diff>

<commit_message>
ajout contexte medical sur les signes radiologiques du Covid
</commit_message>
<xml_diff>
--- a/reports/presentation_Covid_Liora.docx
+++ b/reports/presentation_Covid_Liora.docx
@@ -85,7 +85,7 @@
                 <w:color w:val="FFFFFF" w:themeColor="background1"/>
               </w:rPr>
               <w:drawing>
-                <wp:anchor distT="0" distB="0" distL="114300" distR="114300" simplePos="0" relativeHeight="251660288" behindDoc="1" locked="0" layoutInCell="1" allowOverlap="1" wp14:anchorId="4D60BEFB" wp14:editId="1B44F128">
+                <wp:anchor distT="0" distB="0" distL="114300" distR="114300" simplePos="0" relativeHeight="251660288" behindDoc="1" locked="0" layoutInCell="1" allowOverlap="1" wp14:anchorId="4D60BEFB" wp14:editId="74FF381E">
                   <wp:simplePos x="0" y="0"/>
                   <wp:positionH relativeFrom="column">
                     <wp:posOffset>-57149</wp:posOffset>
@@ -2381,14 +2381,27 @@
                             <w:r>
                               <w:t xml:space="preserve">Figure </w:t>
                             </w:r>
-                            <w:fldSimple w:instr=" SEQ Figure \* ARABIC ">
-                              <w:r>
-                                <w:rPr>
-                                  <w:noProof/>
-                                </w:rPr>
-                                <w:t>1</w:t>
-                              </w:r>
-                            </w:fldSimple>
+                            <w:r>
+                              <w:fldChar w:fldCharType="begin"/>
+                            </w:r>
+                            <w:r>
+                              <w:instrText xml:space="preserve"> SEQ Figure \* ARABIC </w:instrText>
+                            </w:r>
+                            <w:r>
+                              <w:fldChar w:fldCharType="separate"/>
+                            </w:r>
+                            <w:r>
+                              <w:rPr>
+                                <w:noProof/>
+                              </w:rPr>
+                              <w:t>1</w:t>
+                            </w:r>
+                            <w:r>
+                              <w:rPr>
+                                <w:noProof/>
+                              </w:rPr>
+                              <w:fldChar w:fldCharType="end"/>
+                            </w:r>
                             <w:r>
                               <w:t xml:space="preserve"> : </w:t>
                             </w:r>
@@ -2471,14 +2484,27 @@
                       <w:r>
                         <w:t xml:space="preserve">Figure </w:t>
                       </w:r>
-                      <w:fldSimple w:instr=" SEQ Figure \* ARABIC ">
-                        <w:r>
-                          <w:rPr>
-                            <w:noProof/>
-                          </w:rPr>
-                          <w:t>1</w:t>
-                        </w:r>
-                      </w:fldSimple>
+                      <w:r>
+                        <w:fldChar w:fldCharType="begin"/>
+                      </w:r>
+                      <w:r>
+                        <w:instrText xml:space="preserve"> SEQ Figure \* ARABIC </w:instrText>
+                      </w:r>
+                      <w:r>
+                        <w:fldChar w:fldCharType="separate"/>
+                      </w:r>
+                      <w:r>
+                        <w:rPr>
+                          <w:noProof/>
+                        </w:rPr>
+                        <w:t>1</w:t>
+                      </w:r>
+                      <w:r>
+                        <w:rPr>
+                          <w:noProof/>
+                        </w:rPr>
+                        <w:fldChar w:fldCharType="end"/>
+                      </w:r>
                       <w:r>
                         <w:t xml:space="preserve"> : </w:t>
                       </w:r>
@@ -2652,10 +2678,6 @@
         <w:spacing w:before="120" w:after="0" w:line="360" w:lineRule="auto"/>
         <w:ind w:firstLine="0"/>
       </w:pPr>
-      <w:r>
-        <w:lastRenderedPageBreak/>
-        <w:t>Comparativement au scanner thoracique (CT Scan), la radiographie présente plusieurs avantages : elle est rapide, peu coûteuse, largement disponible dans les établissements de santé et peut être réalisée grâce à des appareils portables limitant les risques de contamination croisée [1]. Ces caractéristiques en font un outil particulièrement pertinent dans les situations d'urgence sanitaire, dans les régions à ressources limitées ou lorsque les capacités de dépistage biologique sont saturées [1,5].</w:t>
-      </w:r>
     </w:p>
     <w:p>
       <w:pPr>
@@ -2663,7 +2685,14 @@
         <w:ind w:firstLine="0"/>
       </w:pPr>
       <w:r>
-        <w:t>Cependant, l'interprétation des radiographies thoraciques demeure une tâche complexe nécessitant l'expertise de radiologues expérimentés. De plus, certaines manifestations radiologiques du COVID-19 peuvent être très similaires à celles observées dans d'autres pathologies pulmonaires, notamment les pneumonies virales ou bactériennes [5]. Face à l'augmentation massive du nombre d'examens à analyser durant la pandémie, la nécessité d'automatiser une partie du processus diagnostique est rapidement apparue [6].</w:t>
+        <w:lastRenderedPageBreak/>
+        <w:t>Sur une radiographie thoracique normale, les poumons apparaissent sombres car ils sont remplis d'air, qui laisse bien passer les rayons X. Quand un poumon est infecté (par le Covid ou un autre agent), les alvéoles se remplissent partiellement de liquide ou de cellules inflammatoires : l'air est remplacé, les rayons X sont davantage absorbés, et la zone touchée apparaît plus claire sur l'image</w:t>
+      </w:r>
+      <w:r>
+        <w:t xml:space="preserve">, </w:t>
+      </w:r>
+      <w:r>
+        <w:t>du gris plus opaque jusqu'au blanc selon la sévérité.</w:t>
       </w:r>
     </w:p>
     <w:p>
@@ -2672,6 +2701,94 @@
         <w:ind w:firstLine="0"/>
       </w:pPr>
       <w:r>
+        <w:t>On distingue schématiquement deux types d'opacités, qui correspondent à un degré de sévérité croissant :</w:t>
+      </w:r>
+    </w:p>
+    <w:p>
+      <w:pPr>
+        <w:numPr>
+          <w:ilvl w:val="0"/>
+          <w:numId w:val="40"/>
+        </w:numPr>
+        <w:spacing w:before="120" w:after="0" w:line="360" w:lineRule="auto"/>
+      </w:pPr>
+      <w:r>
+        <w:t>le verre dépoli : une zone légèrement plus claire que le poumon sain, mais où on distingue encore les vaisseaux sanguins en transparence — un peu comme regarder à travers une vitre embuée plutôt qu'opaque ;</w:t>
+      </w:r>
+    </w:p>
+    <w:p>
+      <w:pPr>
+        <w:numPr>
+          <w:ilvl w:val="0"/>
+          <w:numId w:val="40"/>
+        </w:numPr>
+        <w:spacing w:before="120" w:after="0" w:line="360" w:lineRule="auto"/>
+      </w:pPr>
+      <w:r>
+        <w:t>la consolidation : une zone complètement blanche, où l'air a été totalement remplacé</w:t>
+      </w:r>
+      <w:r>
+        <w:t>,</w:t>
+      </w:r>
+      <w:r>
+        <w:t xml:space="preserve"> plus l'atteinte est sévère, plus la zone est dense et opaque.</w:t>
+      </w:r>
+    </w:p>
+    <w:p>
+      <w:pPr>
+        <w:spacing w:before="120" w:after="0" w:line="360" w:lineRule="auto"/>
+        <w:ind w:firstLine="0"/>
+      </w:pPr>
+      <w:r>
+        <w:t>Dans le cas du Covid, ces opacités apparaissent typiquement des deux côtés des poumons (et non d'un seul), plutôt sur les bords et en bas des poumons. C'est ce schéma (bilatéral + périphérique + bases pulmonaires) que le dataset espère permettre à un modèle d'apprendre à reconnaître.</w:t>
+      </w:r>
+    </w:p>
+    <w:p>
+      <w:pPr>
+        <w:spacing w:before="120" w:after="0" w:line="360" w:lineRule="auto"/>
+        <w:ind w:firstLine="0"/>
+      </w:pPr>
+      <w:r>
+        <w:t>Limite importante à garder en tête : ces signes ne sont pas propres au Covid</w:t>
+      </w:r>
+      <w:r>
+        <w:t>,</w:t>
+      </w:r>
+      <w:r>
+        <w:t xml:space="preserve"> on les retrouve aussi dans d'autres pneumonies virales, ce qui explique pourquoi distinguer visuellement "Covid" de "Viral Pneumonia" est une tâche difficile, y compris pour des radiologues expérimentés. La radiographie est également moins fiable que le test PCR pour détecter le Covid (environ 69% de sensibilité contre 91% pour la PCR)</w:t>
+      </w:r>
+      <w:r>
+        <w:t>,</w:t>
+      </w:r>
+      <w:r>
+        <w:t xml:space="preserve"> un poumon qui paraît normal sur la radio n'exclut donc pas l'infection. Ces limites intrinsèques à l'imagerie elle-même posent un plafond de performance que même le meilleur modèle ne pourra pas dépasser.</w:t>
+      </w:r>
+    </w:p>
+    <w:p>
+      <w:pPr>
+        <w:spacing w:before="120" w:after="0" w:line="360" w:lineRule="auto"/>
+        <w:ind w:firstLine="0"/>
+      </w:pPr>
+      <w:r>
+        <w:t>Comparativement au scanner thoracique (CT Scan), la radiographie présente plusieurs avantages : elle est rapide, peu coûteuse, largement disponible dans les établissements de santé et peut être réalisée grâce à des appareils portables limitant les risques de contamination croisée [1]. Ces caractéristiques en font un outil particulièrement pertinent dans les situations d'urgence sanitaire, dans les régions à ressources limitées ou lorsque les capacités de dépistage biologique sont saturées [1,5].</w:t>
+      </w:r>
+    </w:p>
+    <w:p>
+      <w:pPr>
+        <w:spacing w:before="120" w:after="0" w:line="360" w:lineRule="auto"/>
+        <w:ind w:firstLine="0"/>
+      </w:pPr>
+      <w:r>
+        <w:t>Cependant, l'interprétation des radiographies thoraciques demeure une tâche complexe nécessitant l'expertise de radiologues expérimentés. De plus, certaines manifestations radiologiques du COVID-19 peuvent être très similaires à celles observées dans d'autres pathologies pulmonaires, notamment les pneumonies virales ou bactériennes [5]. Face à l'augmentation massive du nombre d'examens à analyser durant la pandémie, la nécessité d'automatiser une partie du processus diagnostique est rapidement apparue [6].</w:t>
+      </w:r>
+    </w:p>
+    <w:p>
+      <w:pPr>
+        <w:spacing w:before="120" w:after="0" w:line="360" w:lineRule="auto"/>
+        <w:ind w:firstLine="0"/>
+      </w:pPr>
+      <w:r>
+        <w:lastRenderedPageBreak/>
         <w:t>Les progrès récents de l'intelligence artificielle, et plus particulièrement du Deep Learning, ont ouvert de nouvelles perspectives dans ce domaine. Les réseaux de neurones convolutifs (CNN) ont démontré leur capacité à extraire automatiquement des caractéristiques complexes à partir d'images médicales et à atteindre des performances comparables, voire supérieures, à celles obtenues par des méthodes traditionnelles d'analyse d'image [2,4]. Plusieurs travaux ont ainsi proposé des architectures dédiées à la détection du COVID-19 sur radiographies pulmonaires. Wang et al. ont notamment développé COVID-Net, l'un des premiers réseaux neuronaux spécifiquement conçus pour le dépistage du COVID-19 à partir d'images radiographiques [1]. D'autres études ont comparé de nombreuses architectures de référence telles que VGG16, ResNet50, DenseNet121 ou EfficientNet, certaines atteignant des taux de classification supérieurs à 95 % [2,3,5].</w:t>
       </w:r>
     </w:p>
@@ -5476,6 +5593,155 @@
     </w:lvl>
   </w:abstractNum>
   <w:abstractNum w:abstractNumId="20" w15:restartNumberingAfterBreak="0">
+    <w:nsid w:val="36616EAD"/>
+    <w:multiLevelType w:val="multilevel"/>
+    <w:tmpl w:val="407091F0"/>
+    <w:lvl w:ilvl="0">
+      <w:start w:val="1"/>
+      <w:numFmt w:val="bullet"/>
+      <w:lvlText w:val=""/>
+      <w:lvlJc w:val="left"/>
+      <w:pPr>
+        <w:tabs>
+          <w:tab w:val="num" w:pos="720"/>
+        </w:tabs>
+        <w:ind w:left="720" w:hanging="360"/>
+      </w:pPr>
+      <w:rPr>
+        <w:rFonts w:ascii="Symbol" w:hAnsi="Symbol" w:hint="default"/>
+        <w:sz w:val="20"/>
+      </w:rPr>
+    </w:lvl>
+    <w:lvl w:ilvl="1" w:tentative="1">
+      <w:start w:val="1"/>
+      <w:numFmt w:val="bullet"/>
+      <w:lvlText w:val="o"/>
+      <w:lvlJc w:val="left"/>
+      <w:pPr>
+        <w:tabs>
+          <w:tab w:val="num" w:pos="1440"/>
+        </w:tabs>
+        <w:ind w:left="1440" w:hanging="360"/>
+      </w:pPr>
+      <w:rPr>
+        <w:rFonts w:ascii="Courier New" w:hAnsi="Courier New" w:hint="default"/>
+        <w:sz w:val="20"/>
+      </w:rPr>
+    </w:lvl>
+    <w:lvl w:ilvl="2" w:tentative="1">
+      <w:start w:val="1"/>
+      <w:numFmt w:val="bullet"/>
+      <w:lvlText w:val=""/>
+      <w:lvlJc w:val="left"/>
+      <w:pPr>
+        <w:tabs>
+          <w:tab w:val="num" w:pos="2160"/>
+        </w:tabs>
+        <w:ind w:left="2160" w:hanging="360"/>
+      </w:pPr>
+      <w:rPr>
+        <w:rFonts w:ascii="Wingdings" w:hAnsi="Wingdings" w:hint="default"/>
+        <w:sz w:val="20"/>
+      </w:rPr>
+    </w:lvl>
+    <w:lvl w:ilvl="3" w:tentative="1">
+      <w:start w:val="1"/>
+      <w:numFmt w:val="bullet"/>
+      <w:lvlText w:val=""/>
+      <w:lvlJc w:val="left"/>
+      <w:pPr>
+        <w:tabs>
+          <w:tab w:val="num" w:pos="2880"/>
+        </w:tabs>
+        <w:ind w:left="2880" w:hanging="360"/>
+      </w:pPr>
+      <w:rPr>
+        <w:rFonts w:ascii="Wingdings" w:hAnsi="Wingdings" w:hint="default"/>
+        <w:sz w:val="20"/>
+      </w:rPr>
+    </w:lvl>
+    <w:lvl w:ilvl="4" w:tentative="1">
+      <w:start w:val="1"/>
+      <w:numFmt w:val="bullet"/>
+      <w:lvlText w:val=""/>
+      <w:lvlJc w:val="left"/>
+      <w:pPr>
+        <w:tabs>
+          <w:tab w:val="num" w:pos="3600"/>
+        </w:tabs>
+        <w:ind w:left="3600" w:hanging="360"/>
+      </w:pPr>
+      <w:rPr>
+        <w:rFonts w:ascii="Wingdings" w:hAnsi="Wingdings" w:hint="default"/>
+        <w:sz w:val="20"/>
+      </w:rPr>
+    </w:lvl>
+    <w:lvl w:ilvl="5" w:tentative="1">
+      <w:start w:val="1"/>
+      <w:numFmt w:val="bullet"/>
+      <w:lvlText w:val=""/>
+      <w:lvlJc w:val="left"/>
+      <w:pPr>
+        <w:tabs>
+          <w:tab w:val="num" w:pos="4320"/>
+        </w:tabs>
+        <w:ind w:left="4320" w:hanging="360"/>
+      </w:pPr>
+      <w:rPr>
+        <w:rFonts w:ascii="Wingdings" w:hAnsi="Wingdings" w:hint="default"/>
+        <w:sz w:val="20"/>
+      </w:rPr>
+    </w:lvl>
+    <w:lvl w:ilvl="6" w:tentative="1">
+      <w:start w:val="1"/>
+      <w:numFmt w:val="bullet"/>
+      <w:lvlText w:val=""/>
+      <w:lvlJc w:val="left"/>
+      <w:pPr>
+        <w:tabs>
+          <w:tab w:val="num" w:pos="5040"/>
+        </w:tabs>
+        <w:ind w:left="5040" w:hanging="360"/>
+      </w:pPr>
+      <w:rPr>
+        <w:rFonts w:ascii="Wingdings" w:hAnsi="Wingdings" w:hint="default"/>
+        <w:sz w:val="20"/>
+      </w:rPr>
+    </w:lvl>
+    <w:lvl w:ilvl="7" w:tentative="1">
+      <w:start w:val="1"/>
+      <w:numFmt w:val="bullet"/>
+      <w:lvlText w:val=""/>
+      <w:lvlJc w:val="left"/>
+      <w:pPr>
+        <w:tabs>
+          <w:tab w:val="num" w:pos="5760"/>
+        </w:tabs>
+        <w:ind w:left="5760" w:hanging="360"/>
+      </w:pPr>
+      <w:rPr>
+        <w:rFonts w:ascii="Wingdings" w:hAnsi="Wingdings" w:hint="default"/>
+        <w:sz w:val="20"/>
+      </w:rPr>
+    </w:lvl>
+    <w:lvl w:ilvl="8" w:tentative="1">
+      <w:start w:val="1"/>
+      <w:numFmt w:val="bullet"/>
+      <w:lvlText w:val=""/>
+      <w:lvlJc w:val="left"/>
+      <w:pPr>
+        <w:tabs>
+          <w:tab w:val="num" w:pos="6480"/>
+        </w:tabs>
+        <w:ind w:left="6480" w:hanging="360"/>
+      </w:pPr>
+      <w:rPr>
+        <w:rFonts w:ascii="Wingdings" w:hAnsi="Wingdings" w:hint="default"/>
+        <w:sz w:val="20"/>
+      </w:rPr>
+    </w:lvl>
+  </w:abstractNum>
+  <w:abstractNum w:abstractNumId="21" w15:restartNumberingAfterBreak="0">
     <w:nsid w:val="42904A84"/>
     <w:multiLevelType w:val="hybridMultilevel"/>
     <w:tmpl w:val="0680BE4E"/>
@@ -5587,7 +5853,7 @@
       </w:rPr>
     </w:lvl>
   </w:abstractNum>
-  <w:abstractNum w:abstractNumId="21" w15:restartNumberingAfterBreak="0">
+  <w:abstractNum w:abstractNumId="22" w15:restartNumberingAfterBreak="0">
     <w:nsid w:val="4C4E0128"/>
     <w:multiLevelType w:val="hybridMultilevel"/>
     <w:tmpl w:val="18A84772"/>
@@ -5728,7 +5994,7 @@
       </w:rPr>
     </w:lvl>
   </w:abstractNum>
-  <w:abstractNum w:abstractNumId="22" w15:restartNumberingAfterBreak="0">
+  <w:abstractNum w:abstractNumId="23" w15:restartNumberingAfterBreak="0">
     <w:nsid w:val="558355EB"/>
     <w:multiLevelType w:val="hybridMultilevel"/>
     <w:tmpl w:val="02BC3F9E"/>
@@ -5841,7 +6107,7 @@
       </w:rPr>
     </w:lvl>
   </w:abstractNum>
-  <w:abstractNum w:abstractNumId="23" w15:restartNumberingAfterBreak="0">
+  <w:abstractNum w:abstractNumId="24" w15:restartNumberingAfterBreak="0">
     <w:nsid w:val="5EBF08F1"/>
     <w:multiLevelType w:val="multilevel"/>
     <w:tmpl w:val="8D9C3686"/>
@@ -5991,7 +6257,7 @@
       </w:rPr>
     </w:lvl>
   </w:abstractNum>
-  <w:abstractNum w:abstractNumId="24" w15:restartNumberingAfterBreak="0">
+  <w:abstractNum w:abstractNumId="25" w15:restartNumberingAfterBreak="0">
     <w:nsid w:val="5FA870B5"/>
     <w:multiLevelType w:val="hybridMultilevel"/>
     <w:tmpl w:val="5376321C"/>
@@ -6134,7 +6400,7 @@
       </w:rPr>
     </w:lvl>
   </w:abstractNum>
-  <w:abstractNum w:abstractNumId="25" w15:restartNumberingAfterBreak="0">
+  <w:abstractNum w:abstractNumId="26" w15:restartNumberingAfterBreak="0">
     <w:nsid w:val="69DA0B1C"/>
     <w:multiLevelType w:val="multilevel"/>
     <w:tmpl w:val="EC7E1F8C"/>
@@ -6244,7 +6510,7 @@
       </w:pPr>
     </w:lvl>
   </w:abstractNum>
-  <w:abstractNum w:abstractNumId="26" w15:restartNumberingAfterBreak="0">
+  <w:abstractNum w:abstractNumId="27" w15:restartNumberingAfterBreak="0">
     <w:nsid w:val="6CC1036B"/>
     <w:multiLevelType w:val="hybridMultilevel"/>
     <w:tmpl w:val="247C17DE"/>
@@ -6334,7 +6600,7 @@
       </w:pPr>
     </w:lvl>
   </w:abstractNum>
-  <w:abstractNum w:abstractNumId="27" w15:restartNumberingAfterBreak="0">
+  <w:abstractNum w:abstractNumId="28" w15:restartNumberingAfterBreak="0">
     <w:nsid w:val="6DEF3F1B"/>
     <w:multiLevelType w:val="hybridMultilevel"/>
     <w:tmpl w:val="69A0BE3C"/>
@@ -6447,7 +6713,7 @@
       </w:rPr>
     </w:lvl>
   </w:abstractNum>
-  <w:abstractNum w:abstractNumId="28" w15:restartNumberingAfterBreak="0">
+  <w:abstractNum w:abstractNumId="29" w15:restartNumberingAfterBreak="0">
     <w:nsid w:val="77E13800"/>
     <w:multiLevelType w:val="multilevel"/>
     <w:tmpl w:val="05AAC4B4"/>
@@ -6562,7 +6828,7 @@
       </w:pPr>
     </w:lvl>
   </w:abstractNum>
-  <w:abstractNum w:abstractNumId="29" w15:restartNumberingAfterBreak="0">
+  <w:abstractNum w:abstractNumId="30" w15:restartNumberingAfterBreak="0">
     <w:nsid w:val="7E071666"/>
     <w:multiLevelType w:val="hybridMultilevel"/>
     <w:tmpl w:val="0BE00050"/>
@@ -6691,7 +6957,7 @@
     <w:abstractNumId w:val="11"/>
   </w:num>
   <w:num w:numId="6" w16cid:durableId="13044459">
-    <w:abstractNumId w:val="26"/>
+    <w:abstractNumId w:val="27"/>
   </w:num>
   <w:num w:numId="7" w16cid:durableId="96799009">
     <w:abstractNumId w:val="15"/>
@@ -6742,10 +7008,10 @@
     <w:abstractNumId w:val="0"/>
   </w:num>
   <w:num w:numId="13" w16cid:durableId="350572233">
-    <w:abstractNumId w:val="23"/>
+    <w:abstractNumId w:val="24"/>
   </w:num>
   <w:num w:numId="14" w16cid:durableId="544408560">
-    <w:abstractNumId w:val="24"/>
+    <w:abstractNumId w:val="25"/>
   </w:num>
   <w:num w:numId="15" w16cid:durableId="2078740808">
     <w:abstractNumId w:val="7"/>
@@ -6769,13 +7035,13 @@
     </w:lvlOverride>
   </w:num>
   <w:num w:numId="21" w16cid:durableId="657611364">
-    <w:abstractNumId w:val="21"/>
+    <w:abstractNumId w:val="22"/>
   </w:num>
   <w:num w:numId="22" w16cid:durableId="513149240">
-    <w:abstractNumId w:val="25"/>
+    <w:abstractNumId w:val="26"/>
   </w:num>
   <w:num w:numId="23" w16cid:durableId="8260737">
-    <w:abstractNumId w:val="25"/>
+    <w:abstractNumId w:val="26"/>
     <w:lvlOverride w:ilvl="0">
       <w:startOverride w:val="1"/>
     </w:lvlOverride>
@@ -6805,7 +7071,7 @@
     </w:lvlOverride>
   </w:num>
   <w:num w:numId="24" w16cid:durableId="1146362311">
-    <w:abstractNumId w:val="28"/>
+    <w:abstractNumId w:val="29"/>
     <w:lvlOverride w:ilvl="0">
       <w:startOverride w:val="6"/>
     </w:lvlOverride>
@@ -6835,7 +7101,7 @@
     </w:lvlOverride>
   </w:num>
   <w:num w:numId="25" w16cid:durableId="439032473">
-    <w:abstractNumId w:val="20"/>
+    <w:abstractNumId w:val="21"/>
   </w:num>
   <w:num w:numId="26" w16cid:durableId="502552439">
     <w:abstractNumId w:val="13"/>
@@ -6856,10 +7122,10 @@
     <w:abstractNumId w:val="13"/>
   </w:num>
   <w:num w:numId="32" w16cid:durableId="1276133749">
-    <w:abstractNumId w:val="22"/>
+    <w:abstractNumId w:val="23"/>
   </w:num>
   <w:num w:numId="33" w16cid:durableId="2094427400">
-    <w:abstractNumId w:val="29"/>
+    <w:abstractNumId w:val="30"/>
   </w:num>
   <w:num w:numId="34" w16cid:durableId="66801838">
     <w:abstractNumId w:val="10"/>
@@ -6871,13 +7137,16 @@
     <w:abstractNumId w:val="9"/>
   </w:num>
   <w:num w:numId="37" w16cid:durableId="1862862643">
-    <w:abstractNumId w:val="27"/>
+    <w:abstractNumId w:val="28"/>
   </w:num>
   <w:num w:numId="38" w16cid:durableId="1091394304">
     <w:abstractNumId w:val="16"/>
   </w:num>
   <w:num w:numId="39" w16cid:durableId="197009749">
     <w:abstractNumId w:val="18"/>
+  </w:num>
+  <w:num w:numId="40" w16cid:durableId="502936503">
+    <w:abstractNumId w:val="20"/>
   </w:num>
   <w:numIdMacAtCleanup w:val="25"/>
 </w:numbering>

</xml_diff>

<commit_message>
ajustements contexte medical et vulgarisation
</commit_message>
<xml_diff>
--- a/reports/presentation_Covid_Liora.docx
+++ b/reports/presentation_Covid_Liora.docx
@@ -85,7 +85,7 @@
                 <w:color w:val="FFFFFF" w:themeColor="background1"/>
               </w:rPr>
               <w:drawing>
-                <wp:anchor distT="0" distB="0" distL="114300" distR="114300" simplePos="0" relativeHeight="251660288" behindDoc="1" locked="0" layoutInCell="1" allowOverlap="1" wp14:anchorId="4D60BEFB" wp14:editId="74FF381E">
+                <wp:anchor distT="0" distB="0" distL="114300" distR="114300" simplePos="0" relativeHeight="251660288" behindDoc="1" locked="0" layoutInCell="1" allowOverlap="1" wp14:anchorId="4D60BEFB" wp14:editId="4889DB17">
                   <wp:simplePos x="0" y="0"/>
                   <wp:positionH relativeFrom="column">
                     <wp:posOffset>-57149</wp:posOffset>
@@ -2708,30 +2708,38 @@
       <w:pPr>
         <w:numPr>
           <w:ilvl w:val="0"/>
-          <w:numId w:val="40"/>
+          <w:numId w:val="41"/>
         </w:numPr>
         <w:spacing w:before="120" w:after="0" w:line="360" w:lineRule="auto"/>
       </w:pPr>
       <w:r>
-        <w:t>le verre dépoli : une zone légèrement plus claire que le poumon sain, mais où on distingue encore les vaisseaux sanguins en transparence — un peu comme regarder à travers une vitre embuée plutôt qu'opaque ;</w:t>
+        <w:rPr>
+          <w:b/>
+          <w:bCs/>
+        </w:rPr>
+        <w:t>une zone trouble</w:t>
+      </w:r>
+      <w:r>
+        <w:t xml:space="preserve"> (terme médical : verre dépoli) : légèrement plus claire que le poumon sain, mais où l'on distingue encore les vaisseaux sanguins en transparence — un peu comme regarder à travers une vitre embuée plutôt qu'opaque ;</w:t>
       </w:r>
     </w:p>
     <w:p>
       <w:pPr>
         <w:numPr>
           <w:ilvl w:val="0"/>
-          <w:numId w:val="40"/>
+          <w:numId w:val="41"/>
         </w:numPr>
         <w:spacing w:before="120" w:after="0" w:line="360" w:lineRule="auto"/>
       </w:pPr>
       <w:r>
-        <w:t>la consolidation : une zone complètement blanche, où l'air a été totalement remplacé</w:t>
+        <w:rPr>
+          <w:b/>
+          <w:bCs/>
+        </w:rPr>
+        <w:t>une zone opaque</w:t>
       </w:r>
       <w:r>
-        <w:t>,</w:t>
-      </w:r>
-      <w:r>
-        <w:t xml:space="preserve"> plus l'atteinte est sévère, plus la zone est dense et opaque.</w:t>
+        <w:t xml:space="preserve"> (terme médical : consolidation) : complètement blanche, où l'air a été totalement remplacé — plus l'atteinte est sévère, plus la zone est dense et opaque.</w:t>
       </w:r>
     </w:p>
     <w:p>
@@ -6714,6 +6722,155 @@
     </w:lvl>
   </w:abstractNum>
   <w:abstractNum w:abstractNumId="29" w15:restartNumberingAfterBreak="0">
+    <w:nsid w:val="6F310BF1"/>
+    <w:multiLevelType w:val="multilevel"/>
+    <w:tmpl w:val="84A2C51C"/>
+    <w:lvl w:ilvl="0">
+      <w:start w:val="1"/>
+      <w:numFmt w:val="bullet"/>
+      <w:lvlText w:val=""/>
+      <w:lvlJc w:val="left"/>
+      <w:pPr>
+        <w:tabs>
+          <w:tab w:val="num" w:pos="720"/>
+        </w:tabs>
+        <w:ind w:left="720" w:hanging="360"/>
+      </w:pPr>
+      <w:rPr>
+        <w:rFonts w:ascii="Symbol" w:hAnsi="Symbol" w:hint="default"/>
+        <w:sz w:val="20"/>
+      </w:rPr>
+    </w:lvl>
+    <w:lvl w:ilvl="1" w:tentative="1">
+      <w:start w:val="1"/>
+      <w:numFmt w:val="bullet"/>
+      <w:lvlText w:val="o"/>
+      <w:lvlJc w:val="left"/>
+      <w:pPr>
+        <w:tabs>
+          <w:tab w:val="num" w:pos="1440"/>
+        </w:tabs>
+        <w:ind w:left="1440" w:hanging="360"/>
+      </w:pPr>
+      <w:rPr>
+        <w:rFonts w:ascii="Courier New" w:hAnsi="Courier New" w:hint="default"/>
+        <w:sz w:val="20"/>
+      </w:rPr>
+    </w:lvl>
+    <w:lvl w:ilvl="2" w:tentative="1">
+      <w:start w:val="1"/>
+      <w:numFmt w:val="bullet"/>
+      <w:lvlText w:val=""/>
+      <w:lvlJc w:val="left"/>
+      <w:pPr>
+        <w:tabs>
+          <w:tab w:val="num" w:pos="2160"/>
+        </w:tabs>
+        <w:ind w:left="2160" w:hanging="360"/>
+      </w:pPr>
+      <w:rPr>
+        <w:rFonts w:ascii="Wingdings" w:hAnsi="Wingdings" w:hint="default"/>
+        <w:sz w:val="20"/>
+      </w:rPr>
+    </w:lvl>
+    <w:lvl w:ilvl="3" w:tentative="1">
+      <w:start w:val="1"/>
+      <w:numFmt w:val="bullet"/>
+      <w:lvlText w:val=""/>
+      <w:lvlJc w:val="left"/>
+      <w:pPr>
+        <w:tabs>
+          <w:tab w:val="num" w:pos="2880"/>
+        </w:tabs>
+        <w:ind w:left="2880" w:hanging="360"/>
+      </w:pPr>
+      <w:rPr>
+        <w:rFonts w:ascii="Wingdings" w:hAnsi="Wingdings" w:hint="default"/>
+        <w:sz w:val="20"/>
+      </w:rPr>
+    </w:lvl>
+    <w:lvl w:ilvl="4" w:tentative="1">
+      <w:start w:val="1"/>
+      <w:numFmt w:val="bullet"/>
+      <w:lvlText w:val=""/>
+      <w:lvlJc w:val="left"/>
+      <w:pPr>
+        <w:tabs>
+          <w:tab w:val="num" w:pos="3600"/>
+        </w:tabs>
+        <w:ind w:left="3600" w:hanging="360"/>
+      </w:pPr>
+      <w:rPr>
+        <w:rFonts w:ascii="Wingdings" w:hAnsi="Wingdings" w:hint="default"/>
+        <w:sz w:val="20"/>
+      </w:rPr>
+    </w:lvl>
+    <w:lvl w:ilvl="5" w:tentative="1">
+      <w:start w:val="1"/>
+      <w:numFmt w:val="bullet"/>
+      <w:lvlText w:val=""/>
+      <w:lvlJc w:val="left"/>
+      <w:pPr>
+        <w:tabs>
+          <w:tab w:val="num" w:pos="4320"/>
+        </w:tabs>
+        <w:ind w:left="4320" w:hanging="360"/>
+      </w:pPr>
+      <w:rPr>
+        <w:rFonts w:ascii="Wingdings" w:hAnsi="Wingdings" w:hint="default"/>
+        <w:sz w:val="20"/>
+      </w:rPr>
+    </w:lvl>
+    <w:lvl w:ilvl="6" w:tentative="1">
+      <w:start w:val="1"/>
+      <w:numFmt w:val="bullet"/>
+      <w:lvlText w:val=""/>
+      <w:lvlJc w:val="left"/>
+      <w:pPr>
+        <w:tabs>
+          <w:tab w:val="num" w:pos="5040"/>
+        </w:tabs>
+        <w:ind w:left="5040" w:hanging="360"/>
+      </w:pPr>
+      <w:rPr>
+        <w:rFonts w:ascii="Wingdings" w:hAnsi="Wingdings" w:hint="default"/>
+        <w:sz w:val="20"/>
+      </w:rPr>
+    </w:lvl>
+    <w:lvl w:ilvl="7" w:tentative="1">
+      <w:start w:val="1"/>
+      <w:numFmt w:val="bullet"/>
+      <w:lvlText w:val=""/>
+      <w:lvlJc w:val="left"/>
+      <w:pPr>
+        <w:tabs>
+          <w:tab w:val="num" w:pos="5760"/>
+        </w:tabs>
+        <w:ind w:left="5760" w:hanging="360"/>
+      </w:pPr>
+      <w:rPr>
+        <w:rFonts w:ascii="Wingdings" w:hAnsi="Wingdings" w:hint="default"/>
+        <w:sz w:val="20"/>
+      </w:rPr>
+    </w:lvl>
+    <w:lvl w:ilvl="8" w:tentative="1">
+      <w:start w:val="1"/>
+      <w:numFmt w:val="bullet"/>
+      <w:lvlText w:val=""/>
+      <w:lvlJc w:val="left"/>
+      <w:pPr>
+        <w:tabs>
+          <w:tab w:val="num" w:pos="6480"/>
+        </w:tabs>
+        <w:ind w:left="6480" w:hanging="360"/>
+      </w:pPr>
+      <w:rPr>
+        <w:rFonts w:ascii="Wingdings" w:hAnsi="Wingdings" w:hint="default"/>
+        <w:sz w:val="20"/>
+      </w:rPr>
+    </w:lvl>
+  </w:abstractNum>
+  <w:abstractNum w:abstractNumId="30" w15:restartNumberingAfterBreak="0">
     <w:nsid w:val="77E13800"/>
     <w:multiLevelType w:val="multilevel"/>
     <w:tmpl w:val="05AAC4B4"/>
@@ -6828,7 +6985,7 @@
       </w:pPr>
     </w:lvl>
   </w:abstractNum>
-  <w:abstractNum w:abstractNumId="30" w15:restartNumberingAfterBreak="0">
+  <w:abstractNum w:abstractNumId="31" w15:restartNumberingAfterBreak="0">
     <w:nsid w:val="7E071666"/>
     <w:multiLevelType w:val="hybridMultilevel"/>
     <w:tmpl w:val="0BE00050"/>
@@ -7071,7 +7228,7 @@
     </w:lvlOverride>
   </w:num>
   <w:num w:numId="24" w16cid:durableId="1146362311">
-    <w:abstractNumId w:val="29"/>
+    <w:abstractNumId w:val="30"/>
     <w:lvlOverride w:ilvl="0">
       <w:startOverride w:val="6"/>
     </w:lvlOverride>
@@ -7125,7 +7282,7 @@
     <w:abstractNumId w:val="23"/>
   </w:num>
   <w:num w:numId="33" w16cid:durableId="2094427400">
-    <w:abstractNumId w:val="30"/>
+    <w:abstractNumId w:val="31"/>
   </w:num>
   <w:num w:numId="34" w16cid:durableId="66801838">
     <w:abstractNumId w:val="10"/>
@@ -7147,6 +7304,9 @@
   </w:num>
   <w:num w:numId="40" w16cid:durableId="502936503">
     <w:abstractNumId w:val="20"/>
+  </w:num>
+  <w:num w:numId="41" w16cid:durableId="789512835">
+    <w:abstractNumId w:val="29"/>
   </w:num>
   <w:numIdMacAtCleanup w:val="25"/>
 </w:numbering>

</xml_diff>

<commit_message>
ajout paragraphe intro hypothese biais sources
</commit_message>
<xml_diff>
--- a/reports/presentation_Covid_Liora.docx
+++ b/reports/presentation_Covid_Liora.docx
@@ -85,7 +85,7 @@
                 <w:color w:val="FFFFFF" w:themeColor="background1"/>
               </w:rPr>
               <w:drawing>
-                <wp:anchor distT="0" distB="0" distL="114300" distR="114300" simplePos="0" relativeHeight="251660288" behindDoc="1" locked="0" layoutInCell="1" allowOverlap="1" wp14:anchorId="4D60BEFB" wp14:editId="4889DB17">
+                <wp:anchor distT="0" distB="0" distL="114300" distR="114300" simplePos="0" relativeHeight="251660288" behindDoc="1" locked="0" layoutInCell="1" allowOverlap="1" wp14:anchorId="4D60BEFB" wp14:editId="08622BA5">
                   <wp:simplePos x="0" y="0"/>
                   <wp:positionH relativeFrom="column">
                     <wp:posOffset>-57149</wp:posOffset>
@@ -1315,7 +1315,7 @@
           <w:r>
             <w:fldChar w:fldCharType="separate"/>
           </w:r>
-          <w:hyperlink w:anchor="_Toc232579674" w:history="1">
+          <w:hyperlink w:anchor="_Toc232692243" w:history="1">
             <w:r>
               <w:rPr>
                 <w:rStyle w:val="Lienhypertexte"/>
@@ -1358,7 +1358,7 @@
               <w:rPr>
                 <w:webHidden/>
               </w:rPr>
-              <w:instrText xml:space="preserve"> PAGEREF _Toc232579674 \h </w:instrText>
+              <w:instrText xml:space="preserve"> PAGEREF _Toc232692243 \h </w:instrText>
             </w:r>
             <w:r>
               <w:rPr>
@@ -1397,7 +1397,7 @@
               <w14:ligatures w14:val="standardContextual"/>
             </w:rPr>
           </w:pPr>
-          <w:hyperlink w:anchor="_Toc232579675" w:history="1">
+          <w:hyperlink w:anchor="_Toc232692244" w:history="1">
             <w:r>
               <w:rPr>
                 <w:rStyle w:val="Lienhypertexte"/>
@@ -1437,7 +1437,7 @@
               <w:rPr>
                 <w:webHidden/>
               </w:rPr>
-              <w:instrText xml:space="preserve"> PAGEREF _Toc232579675 \h </w:instrText>
+              <w:instrText xml:space="preserve"> PAGEREF _Toc232692244 \h </w:instrText>
             </w:r>
             <w:r>
               <w:rPr>
@@ -1476,7 +1476,7 @@
               <w14:ligatures w14:val="standardContextual"/>
             </w:rPr>
           </w:pPr>
-          <w:hyperlink w:anchor="_Toc232579676" w:history="1">
+          <w:hyperlink w:anchor="_Toc232692245" w:history="1">
             <w:r>
               <w:rPr>
                 <w:rStyle w:val="Lienhypertexte"/>
@@ -1516,7 +1516,7 @@
               <w:rPr>
                 <w:webHidden/>
               </w:rPr>
-              <w:instrText xml:space="preserve"> PAGEREF _Toc232579676 \h </w:instrText>
+              <w:instrText xml:space="preserve"> PAGEREF _Toc232692245 \h </w:instrText>
             </w:r>
             <w:r>
               <w:rPr>
@@ -1533,7 +1533,7 @@
               <w:rPr>
                 <w:webHidden/>
               </w:rPr>
-              <w:t>8</w:t>
+              <w:t>9</w:t>
             </w:r>
             <w:r>
               <w:rPr>
@@ -1561,7 +1561,7 @@
               <w14:ligatures w14:val="standardContextual"/>
             </w:rPr>
           </w:pPr>
-          <w:hyperlink w:anchor="_Toc232579677" w:history="1">
+          <w:hyperlink w:anchor="_Toc232692246" w:history="1">
             <w:r>
               <w:rPr>
                 <w:rStyle w:val="Lienhypertexte"/>
@@ -1614,7 +1614,7 @@
                 <w:noProof/>
                 <w:webHidden/>
               </w:rPr>
-              <w:instrText xml:space="preserve"> PAGEREF _Toc232579677 \h </w:instrText>
+              <w:instrText xml:space="preserve"> PAGEREF _Toc232692246 \h </w:instrText>
             </w:r>
             <w:r>
               <w:rPr>
@@ -1634,7 +1634,7 @@
                 <w:noProof/>
                 <w:webHidden/>
               </w:rPr>
-              <w:t>8</w:t>
+              <w:t>9</w:t>
             </w:r>
             <w:r>
               <w:rPr>
@@ -1659,7 +1659,7 @@
               <w14:ligatures w14:val="standardContextual"/>
             </w:rPr>
           </w:pPr>
-          <w:hyperlink w:anchor="_Toc232579678" w:history="1">
+          <w:hyperlink w:anchor="_Toc232692247" w:history="1">
             <w:r>
               <w:rPr>
                 <w:rStyle w:val="Lienhypertexte"/>
@@ -1702,7 +1702,7 @@
               <w:rPr>
                 <w:webHidden/>
               </w:rPr>
-              <w:instrText xml:space="preserve"> PAGEREF _Toc232579678 \h </w:instrText>
+              <w:instrText xml:space="preserve"> PAGEREF _Toc232692247 \h </w:instrText>
             </w:r>
             <w:r>
               <w:rPr>
@@ -1719,7 +1719,7 @@
               <w:rPr>
                 <w:webHidden/>
               </w:rPr>
-              <w:t>9</w:t>
+              <w:t>10</w:t>
             </w:r>
             <w:r>
               <w:rPr>
@@ -1741,7 +1741,7 @@
               <w14:ligatures w14:val="standardContextual"/>
             </w:rPr>
           </w:pPr>
-          <w:hyperlink w:anchor="_Toc232579679" w:history="1">
+          <w:hyperlink w:anchor="_Toc232692248" w:history="1">
             <w:r>
               <w:rPr>
                 <w:rStyle w:val="Lienhypertexte"/>
@@ -1781,7 +1781,7 @@
               <w:rPr>
                 <w:webHidden/>
               </w:rPr>
-              <w:instrText xml:space="preserve"> PAGEREF _Toc232579679 \h </w:instrText>
+              <w:instrText xml:space="preserve"> PAGEREF _Toc232692248 \h </w:instrText>
             </w:r>
             <w:r>
               <w:rPr>
@@ -1798,7 +1798,7 @@
               <w:rPr>
                 <w:webHidden/>
               </w:rPr>
-              <w:t>9</w:t>
+              <w:t>10</w:t>
             </w:r>
             <w:r>
               <w:rPr>
@@ -1820,7 +1820,7 @@
               <w14:ligatures w14:val="standardContextual"/>
             </w:rPr>
           </w:pPr>
-          <w:hyperlink w:anchor="_Toc232579680" w:history="1">
+          <w:hyperlink w:anchor="_Toc232692249" w:history="1">
             <w:r>
               <w:rPr>
                 <w:rStyle w:val="Lienhypertexte"/>
@@ -1860,7 +1860,7 @@
               <w:rPr>
                 <w:webHidden/>
               </w:rPr>
-              <w:instrText xml:space="preserve"> PAGEREF _Toc232579680 \h </w:instrText>
+              <w:instrText xml:space="preserve"> PAGEREF _Toc232692249 \h </w:instrText>
             </w:r>
             <w:r>
               <w:rPr>
@@ -1877,7 +1877,7 @@
               <w:rPr>
                 <w:webHidden/>
               </w:rPr>
-              <w:t>9</w:t>
+              <w:t>10</w:t>
             </w:r>
             <w:r>
               <w:rPr>
@@ -1899,7 +1899,7 @@
               <w14:ligatures w14:val="standardContextual"/>
             </w:rPr>
           </w:pPr>
-          <w:hyperlink w:anchor="_Toc232579681" w:history="1">
+          <w:hyperlink w:anchor="_Toc232692250" w:history="1">
             <w:r>
               <w:rPr>
                 <w:rStyle w:val="Lienhypertexte"/>
@@ -1939,7 +1939,7 @@
               <w:rPr>
                 <w:webHidden/>
               </w:rPr>
-              <w:instrText xml:space="preserve"> PAGEREF _Toc232579681 \h </w:instrText>
+              <w:instrText xml:space="preserve"> PAGEREF _Toc232692250 \h </w:instrText>
             </w:r>
             <w:r>
               <w:rPr>
@@ -1956,7 +1956,7 @@
               <w:rPr>
                 <w:webHidden/>
               </w:rPr>
-              <w:t>9</w:t>
+              <w:t>10</w:t>
             </w:r>
             <w:r>
               <w:rPr>
@@ -1980,13 +1980,176 @@
               <w14:ligatures w14:val="standardContextual"/>
             </w:rPr>
           </w:pPr>
-          <w:hyperlink w:anchor="_Toc232579682" w:history="1">
+          <w:hyperlink w:anchor="_Toc232692251" w:history="1">
             <w:r>
               <w:rPr>
                 <w:rStyle w:val="Lienhypertexte"/>
                 <w:rFonts w:cs="Times New Roman"/>
               </w:rPr>
               <w:t>3.</w:t>
+            </w:r>
+            <w:r>
+              <w:rPr>
+                <w:rFonts w:asciiTheme="minorHAnsi" w:eastAsiaTheme="minorEastAsia" w:hAnsiTheme="minorHAnsi" w:cstheme="minorBidi"/>
+                <w:b w:val="0"/>
+                <w:bCs w:val="0"/>
+                <w:caps w:val="0"/>
+                <w:kern w:val="2"/>
+                <w:sz w:val="24"/>
+                <w:szCs w:val="24"/>
+                <w14:ligatures w14:val="standardContextual"/>
+              </w:rPr>
+              <w:tab/>
+            </w:r>
+            <w:r>
+              <w:rPr>
+                <w:rStyle w:val="Lienhypertexte"/>
+              </w:rPr>
+              <w:t>Exploration des données</w:t>
+            </w:r>
+            <w:r>
+              <w:rPr>
+                <w:webHidden/>
+              </w:rPr>
+              <w:tab/>
+            </w:r>
+            <w:r>
+              <w:rPr>
+                <w:webHidden/>
+              </w:rPr>
+              <w:fldChar w:fldCharType="begin"/>
+            </w:r>
+            <w:r>
+              <w:rPr>
+                <w:webHidden/>
+              </w:rPr>
+              <w:instrText xml:space="preserve"> PAGEREF _Toc232692251 \h </w:instrText>
+            </w:r>
+            <w:r>
+              <w:rPr>
+                <w:webHidden/>
+              </w:rPr>
+            </w:r>
+            <w:r>
+              <w:rPr>
+                <w:webHidden/>
+              </w:rPr>
+              <w:fldChar w:fldCharType="separate"/>
+            </w:r>
+            <w:r>
+              <w:rPr>
+                <w:webHidden/>
+              </w:rPr>
+              <w:t>11</w:t>
+            </w:r>
+            <w:r>
+              <w:rPr>
+                <w:webHidden/>
+              </w:rPr>
+              <w:fldChar w:fldCharType="end"/>
+            </w:r>
+          </w:hyperlink>
+        </w:p>
+        <w:p>
+          <w:pPr>
+            <w:pStyle w:val="TM2"/>
+            <w:rPr>
+              <w:rFonts w:asciiTheme="minorHAnsi" w:eastAsiaTheme="minorEastAsia" w:hAnsiTheme="minorHAnsi" w:cstheme="minorBidi"/>
+              <w:smallCaps w:val="0"/>
+              <w:kern w:val="2"/>
+              <w:sz w:val="24"/>
+              <w:szCs w:val="24"/>
+              <w14:ligatures w14:val="standardContextual"/>
+            </w:rPr>
+          </w:pPr>
+          <w:hyperlink w:anchor="_Toc232692252" w:history="1">
+            <w:r>
+              <w:rPr>
+                <w:rStyle w:val="Lienhypertexte"/>
+              </w:rPr>
+              <w:t>3.1</w:t>
+            </w:r>
+            <w:r>
+              <w:rPr>
+                <w:rFonts w:asciiTheme="minorHAnsi" w:eastAsiaTheme="minorEastAsia" w:hAnsiTheme="minorHAnsi" w:cstheme="minorBidi"/>
+                <w:smallCaps w:val="0"/>
+                <w:kern w:val="2"/>
+                <w:sz w:val="24"/>
+                <w:szCs w:val="24"/>
+                <w14:ligatures w14:val="standardContextual"/>
+              </w:rPr>
+              <w:tab/>
+            </w:r>
+            <w:r>
+              <w:rPr>
+                <w:rStyle w:val="Lienhypertexte"/>
+              </w:rPr>
+              <w:t>Hétérogénéité des sources d'images COVID</w:t>
+            </w:r>
+            <w:r>
+              <w:rPr>
+                <w:webHidden/>
+              </w:rPr>
+              <w:tab/>
+            </w:r>
+            <w:r>
+              <w:rPr>
+                <w:webHidden/>
+              </w:rPr>
+              <w:fldChar w:fldCharType="begin"/>
+            </w:r>
+            <w:r>
+              <w:rPr>
+                <w:webHidden/>
+              </w:rPr>
+              <w:instrText xml:space="preserve"> PAGEREF _Toc232692252 \h </w:instrText>
+            </w:r>
+            <w:r>
+              <w:rPr>
+                <w:webHidden/>
+              </w:rPr>
+            </w:r>
+            <w:r>
+              <w:rPr>
+                <w:webHidden/>
+              </w:rPr>
+              <w:fldChar w:fldCharType="separate"/>
+            </w:r>
+            <w:r>
+              <w:rPr>
+                <w:webHidden/>
+              </w:rPr>
+              <w:t>11</w:t>
+            </w:r>
+            <w:r>
+              <w:rPr>
+                <w:webHidden/>
+              </w:rPr>
+              <w:fldChar w:fldCharType="end"/>
+            </w:r>
+          </w:hyperlink>
+        </w:p>
+        <w:p>
+          <w:pPr>
+            <w:pStyle w:val="TM1"/>
+            <w:rPr>
+              <w:rFonts w:asciiTheme="minorHAnsi" w:eastAsiaTheme="minorEastAsia" w:hAnsiTheme="minorHAnsi" w:cstheme="minorBidi"/>
+              <w:b w:val="0"/>
+              <w:bCs w:val="0"/>
+              <w:caps w:val="0"/>
+              <w:kern w:val="2"/>
+              <w:sz w:val="24"/>
+              <w:szCs w:val="24"/>
+              <w14:ligatures w14:val="standardContextual"/>
+            </w:rPr>
+          </w:pPr>
+          <w:hyperlink w:anchor="_Toc232692253" w:history="1">
+            <w:r>
+              <w:rPr>
+                <w:rStyle w:val="Lienhypertexte"/>
+                <w:rFonts w:cs="Times New Roman"/>
+              </w:rPr>
+              <w:t>4.</w:t>
             </w:r>
             <w:r>
               <w:rPr>
@@ -2023,7 +2186,7 @@
               <w:rPr>
                 <w:webHidden/>
               </w:rPr>
-              <w:instrText xml:space="preserve"> PAGEREF _Toc232579682 \h </w:instrText>
+              <w:instrText xml:space="preserve"> PAGEREF _Toc232692253 \h </w:instrText>
             </w:r>
             <w:r>
               <w:rPr>
@@ -2040,7 +2203,7 @@
               <w:rPr>
                 <w:webHidden/>
               </w:rPr>
-              <w:t>10</w:t>
+              <w:t>12</w:t>
             </w:r>
             <w:r>
               <w:rPr>
@@ -2114,7 +2277,6 @@
         <w:tabs>
           <w:tab w:val="right" w:leader="dot" w:pos="9912"/>
         </w:tabs>
-        <w:spacing w:line="360" w:lineRule="auto"/>
         <w:rPr>
           <w:rFonts w:eastAsiaTheme="minorEastAsia" w:cstheme="minorBidi"/>
           <w:smallCaps w:val="0"/>
@@ -2134,15 +2296,13 @@
       <w:r>
         <w:fldChar w:fldCharType="separate"/>
       </w:r>
-      <w:hyperlink w:anchor="_Toc232528732" w:history="1">
+      <w:hyperlink w:anchor="_Toc232692254" w:history="1">
         <w:r>
           <w:rPr>
             <w:rStyle w:val="Lienhypertexte"/>
-            <w:b/>
-            <w:bCs/>
             <w:noProof/>
           </w:rPr>
-          <w:t>Figure 1 : Contexte</w:t>
+          <w:t>Figure 1 : Exemple de radiographies thoraciques utilisées pour le diagnostic de la COVID-19 : (A) patient non atteint, (B) patient atteint présentant des opacités pulmonaires compatibles avec une infection COVID-19 [1].</w:t>
         </w:r>
         <w:r>
           <w:rPr>
@@ -2163,7 +2323,7 @@
             <w:noProof/>
             <w:webHidden/>
           </w:rPr>
-          <w:instrText xml:space="preserve"> PAGEREF _Toc232528732 \h </w:instrText>
+          <w:instrText xml:space="preserve"> PAGEREF _Toc232692254 \h </w:instrText>
         </w:r>
         <w:r>
           <w:rPr>
@@ -2196,6 +2356,82 @@
     </w:p>
     <w:p>
       <w:pPr>
+        <w:pStyle w:val="Tabledesillustrations"/>
+        <w:tabs>
+          <w:tab w:val="right" w:leader="dot" w:pos="9912"/>
+        </w:tabs>
+        <w:rPr>
+          <w:rFonts w:eastAsiaTheme="minorEastAsia" w:cstheme="minorBidi"/>
+          <w:smallCaps w:val="0"/>
+          <w:noProof/>
+          <w:kern w:val="2"/>
+          <w:sz w:val="24"/>
+          <w:szCs w:val="24"/>
+          <w14:ligatures w14:val="standardContextual"/>
+        </w:rPr>
+      </w:pPr>
+      <w:hyperlink w:anchor="_Toc232692255" w:history="1">
+        <w:r>
+          <w:rPr>
+            <w:rStyle w:val="Lienhypertexte"/>
+            <w:b/>
+            <w:bCs/>
+            <w:noProof/>
+          </w:rPr>
+          <w:t>Figure 2 : Contexte</w:t>
+        </w:r>
+        <w:r>
+          <w:rPr>
+            <w:noProof/>
+            <w:webHidden/>
+          </w:rPr>
+          <w:tab/>
+        </w:r>
+        <w:r>
+          <w:rPr>
+            <w:noProof/>
+            <w:webHidden/>
+          </w:rPr>
+          <w:fldChar w:fldCharType="begin"/>
+        </w:r>
+        <w:r>
+          <w:rPr>
+            <w:noProof/>
+            <w:webHidden/>
+          </w:rPr>
+          <w:instrText xml:space="preserve"> PAGEREF _Toc232692255 \h </w:instrText>
+        </w:r>
+        <w:r>
+          <w:rPr>
+            <w:noProof/>
+            <w:webHidden/>
+          </w:rPr>
+        </w:r>
+        <w:r>
+          <w:rPr>
+            <w:noProof/>
+            <w:webHidden/>
+          </w:rPr>
+          <w:fldChar w:fldCharType="separate"/>
+        </w:r>
+        <w:r>
+          <w:rPr>
+            <w:noProof/>
+            <w:webHidden/>
+          </w:rPr>
+          <w:t>8</w:t>
+        </w:r>
+        <w:r>
+          <w:rPr>
+            <w:noProof/>
+            <w:webHidden/>
+          </w:rPr>
+          <w:fldChar w:fldCharType="end"/>
+        </w:r>
+      </w:hyperlink>
+    </w:p>
+    <w:p>
+      <w:pPr>
         <w:pStyle w:val="En-ttetablesFR"/>
         <w:spacing w:line="360" w:lineRule="auto"/>
       </w:pPr>
@@ -2223,7 +2459,7 @@
       </w:pPr>
       <w:bookmarkStart w:id="0" w:name="_Toc522805191"/>
       <w:bookmarkStart w:id="1" w:name="_Toc529538238"/>
-      <w:bookmarkStart w:id="2" w:name="_Toc232579674"/>
+      <w:bookmarkStart w:id="2" w:name="_Toc232692243"/>
       <w:r>
         <w:lastRenderedPageBreak/>
         <w:t>Généralités</w:t>
@@ -2236,7 +2472,7 @@
       <w:pPr>
         <w:pStyle w:val="Titre2"/>
       </w:pPr>
-      <w:bookmarkStart w:id="3" w:name="_Toc232579675"/>
+      <w:bookmarkStart w:id="3" w:name="_Toc232692244"/>
       <w:r>
         <w:t>Contexte</w:t>
       </w:r>
@@ -2378,30 +2614,18 @@
                                 <w:sz w:val="22"/>
                               </w:rPr>
                             </w:pPr>
+                            <w:bookmarkStart w:id="24" w:name="_Toc232692254"/>
                             <w:r>
                               <w:t xml:space="preserve">Figure </w:t>
                             </w:r>
-                            <w:r>
-                              <w:fldChar w:fldCharType="begin"/>
-                            </w:r>
-                            <w:r>
-                              <w:instrText xml:space="preserve"> SEQ Figure \* ARABIC </w:instrText>
-                            </w:r>
-                            <w:r>
-                              <w:fldChar w:fldCharType="separate"/>
-                            </w:r>
-                            <w:r>
-                              <w:rPr>
-                                <w:noProof/>
-                              </w:rPr>
-                              <w:t>1</w:t>
-                            </w:r>
-                            <w:r>
-                              <w:rPr>
-                                <w:noProof/>
-                              </w:rPr>
-                              <w:fldChar w:fldCharType="end"/>
-                            </w:r>
+                            <w:fldSimple w:instr=" SEQ Figure \* ARABIC ">
+                              <w:r>
+                                <w:rPr>
+                                  <w:noProof/>
+                                </w:rPr>
+                                <w:t>1</w:t>
+                              </w:r>
+                            </w:fldSimple>
                             <w:r>
                               <w:t xml:space="preserve"> : </w:t>
                             </w:r>
@@ -2447,6 +2671,7 @@
                               </w:rPr>
                               <w:t>nfection COVID-19 [1].</w:t>
                             </w:r>
+                            <w:bookmarkEnd w:id="24"/>
                           </w:p>
                         </w:txbxContent>
                       </wps:txbx>
@@ -2481,30 +2706,18 @@
                           <w:sz w:val="22"/>
                         </w:rPr>
                       </w:pPr>
+                      <w:bookmarkStart w:id="25" w:name="_Toc232692254"/>
                       <w:r>
                         <w:t xml:space="preserve">Figure </w:t>
                       </w:r>
-                      <w:r>
-                        <w:fldChar w:fldCharType="begin"/>
-                      </w:r>
-                      <w:r>
-                        <w:instrText xml:space="preserve"> SEQ Figure \* ARABIC </w:instrText>
-                      </w:r>
-                      <w:r>
-                        <w:fldChar w:fldCharType="separate"/>
-                      </w:r>
-                      <w:r>
-                        <w:rPr>
-                          <w:noProof/>
-                        </w:rPr>
-                        <w:t>1</w:t>
-                      </w:r>
-                      <w:r>
-                        <w:rPr>
-                          <w:noProof/>
-                        </w:rPr>
-                        <w:fldChar w:fldCharType="end"/>
-                      </w:r>
+                      <w:fldSimple w:instr=" SEQ Figure \* ARABIC ">
+                        <w:r>
+                          <w:rPr>
+                            <w:noProof/>
+                          </w:rPr>
+                          <w:t>1</w:t>
+                        </w:r>
+                      </w:fldSimple>
                       <w:r>
                         <w:t xml:space="preserve"> : </w:t>
                       </w:r>
@@ -2550,6 +2763,7 @@
                         </w:rPr>
                         <w:t>nfection COVID-19 [1].</w:t>
                       </w:r>
+                      <w:bookmarkEnd w:id="25"/>
                     </w:p>
                   </w:txbxContent>
                 </v:textbox>
@@ -2890,8 +3104,8 @@
           <w:bCs/>
         </w:rPr>
       </w:pPr>
-      <w:bookmarkStart w:id="24" w:name="_Toc43731543"/>
-      <w:bookmarkStart w:id="25" w:name="_Toc232528732"/>
+      <w:bookmarkStart w:id="26" w:name="_Toc43731543"/>
+      <w:bookmarkStart w:id="27" w:name="_Toc232692255"/>
       <w:r>
         <w:rPr>
           <w:b/>
@@ -2938,8 +3152,8 @@
         </w:rPr>
         <w:t xml:space="preserve"> : </w:t>
       </w:r>
-      <w:bookmarkEnd w:id="24"/>
-      <w:commentRangeStart w:id="26"/>
+      <w:bookmarkEnd w:id="26"/>
+      <w:commentRangeStart w:id="28"/>
       <w:r>
         <w:rPr>
           <w:b/>
@@ -2947,8 +3161,8 @@
         </w:rPr>
         <w:t>Contexte</w:t>
       </w:r>
-      <w:bookmarkEnd w:id="25"/>
-      <w:commentRangeEnd w:id="26"/>
+      <w:bookmarkEnd w:id="27"/>
+      <w:commentRangeEnd w:id="28"/>
       <w:r>
         <w:rPr>
           <w:rStyle w:val="Marquedecommentaire"/>
@@ -2957,7 +3171,7 @@
           <w:sz w:val="22"/>
           <w:szCs w:val="24"/>
         </w:rPr>
-        <w:commentReference w:id="26"/>
+        <w:commentReference w:id="28"/>
       </w:r>
     </w:p>
     <w:p>
@@ -2973,7 +3187,7 @@
       <w:pPr>
         <w:pStyle w:val="Titre2"/>
       </w:pPr>
-      <w:bookmarkStart w:id="27" w:name="_Toc232579676"/>
+      <w:bookmarkStart w:id="29" w:name="_Toc232692245"/>
       <w:bookmarkEnd w:id="4"/>
       <w:bookmarkEnd w:id="5"/>
       <w:bookmarkEnd w:id="6"/>
@@ -2998,39 +3212,37 @@
         <w:lastRenderedPageBreak/>
         <w:t>Mise en place de l’environnement du projet</w:t>
       </w:r>
-      <w:bookmarkEnd w:id="27"/>
+      <w:bookmarkEnd w:id="29"/>
     </w:p>
     <w:p>
       <w:pPr>
         <w:pStyle w:val="Titre3"/>
         <w:spacing w:line="360" w:lineRule="auto"/>
       </w:pPr>
-      <w:bookmarkStart w:id="28" w:name="_Toc408749390"/>
-      <w:bookmarkStart w:id="29" w:name="_Toc413214121"/>
-      <w:bookmarkStart w:id="30" w:name="_Toc427073282"/>
-      <w:bookmarkStart w:id="31" w:name="_Toc475752934"/>
-      <w:bookmarkStart w:id="32" w:name="_Toc475753473"/>
-      <w:bookmarkStart w:id="33" w:name="_Toc475767442"/>
-      <w:bookmarkStart w:id="34" w:name="_Toc475782536"/>
-      <w:bookmarkStart w:id="35" w:name="_Toc475785303"/>
-      <w:bookmarkStart w:id="36" w:name="_Toc475785529"/>
-      <w:bookmarkStart w:id="37" w:name="_Toc475785669"/>
-      <w:bookmarkStart w:id="38" w:name="_Toc475841807"/>
-      <w:bookmarkStart w:id="39" w:name="_Toc476457665"/>
-      <w:bookmarkStart w:id="40" w:name="_Toc476548251"/>
-      <w:bookmarkStart w:id="41" w:name="_Toc477773123"/>
-      <w:bookmarkStart w:id="42" w:name="_Toc107894974"/>
-      <w:bookmarkStart w:id="43" w:name="_Toc107912861"/>
-      <w:bookmarkStart w:id="44" w:name="_Toc182878908"/>
-      <w:bookmarkStart w:id="45" w:name="_Toc204483507"/>
-      <w:bookmarkStart w:id="46" w:name="_Toc304214572"/>
-      <w:bookmarkStart w:id="47" w:name="_Toc511458432"/>
-      <w:bookmarkStart w:id="48" w:name="_Toc232579677"/>
+      <w:bookmarkStart w:id="30" w:name="_Toc408749390"/>
+      <w:bookmarkStart w:id="31" w:name="_Toc413214121"/>
+      <w:bookmarkStart w:id="32" w:name="_Toc427073282"/>
+      <w:bookmarkStart w:id="33" w:name="_Toc475752934"/>
+      <w:bookmarkStart w:id="34" w:name="_Toc475753473"/>
+      <w:bookmarkStart w:id="35" w:name="_Toc475767442"/>
+      <w:bookmarkStart w:id="36" w:name="_Toc475782536"/>
+      <w:bookmarkStart w:id="37" w:name="_Toc475785303"/>
+      <w:bookmarkStart w:id="38" w:name="_Toc475785529"/>
+      <w:bookmarkStart w:id="39" w:name="_Toc475785669"/>
+      <w:bookmarkStart w:id="40" w:name="_Toc475841807"/>
+      <w:bookmarkStart w:id="41" w:name="_Toc476457665"/>
+      <w:bookmarkStart w:id="42" w:name="_Toc476548251"/>
+      <w:bookmarkStart w:id="43" w:name="_Toc477773123"/>
+      <w:bookmarkStart w:id="44" w:name="_Toc107894974"/>
+      <w:bookmarkStart w:id="45" w:name="_Toc107912861"/>
+      <w:bookmarkStart w:id="46" w:name="_Toc182878908"/>
+      <w:bookmarkStart w:id="47" w:name="_Toc204483507"/>
+      <w:bookmarkStart w:id="48" w:name="_Toc304214572"/>
+      <w:bookmarkStart w:id="49" w:name="_Toc511458432"/>
+      <w:bookmarkStart w:id="50" w:name="_Toc232692246"/>
       <w:r>
         <w:t>Présentation</w:t>
       </w:r>
-      <w:bookmarkEnd w:id="28"/>
-      <w:bookmarkEnd w:id="29"/>
       <w:bookmarkEnd w:id="30"/>
       <w:bookmarkEnd w:id="31"/>
       <w:bookmarkEnd w:id="32"/>
@@ -3050,6 +3262,8 @@
       <w:bookmarkEnd w:id="46"/>
       <w:bookmarkEnd w:id="47"/>
       <w:bookmarkEnd w:id="48"/>
+      <w:bookmarkEnd w:id="49"/>
+      <w:bookmarkEnd w:id="50"/>
     </w:p>
     <w:p>
       <w:pPr>
@@ -3070,167 +3284,572 @@
       <w:pPr>
         <w:pStyle w:val="Titre1"/>
       </w:pPr>
-      <w:bookmarkStart w:id="49" w:name="_Toc232579678"/>
+      <w:bookmarkStart w:id="51" w:name="_Toc232692247"/>
       <w:r>
         <w:lastRenderedPageBreak/>
         <w:t>Matériel et Méthodes</w:t>
-      </w:r>
-      <w:bookmarkEnd w:id="49"/>
-    </w:p>
-    <w:p>
-      <w:pPr>
-        <w:pStyle w:val="Titre2"/>
-      </w:pPr>
-      <w:bookmarkStart w:id="50" w:name="_Toc232579679"/>
-      <w:r>
-        <w:t>Données</w:t>
-      </w:r>
-      <w:bookmarkEnd w:id="50"/>
-    </w:p>
-    <w:p>
-      <w:pPr>
-        <w:ind w:firstLine="0"/>
-      </w:pPr>
-      <w:r>
-        <w:t>Le jeu de données utilisé est le COVID-19 Radiography Database, constitué par une équipe de recherche de Qatar University, University of Dhaka, et leurs collaborateurs au Pakistan et en Malaisie. Il comprend 21 165 radiographies pulmonaires (format PNG, niveaux de gris) réparties en 4 classes : Normal (10 192), Lung Opacity (6 012), COVID-19 (3 616) et Viral Pneumonia (1 345). Chaque image est accompagnée d'un masque de segmentation pulmonaire correspondant.</w:t>
-      </w:r>
-    </w:p>
-    <w:p>
-      <w:pPr>
-        <w:ind w:firstLine="0"/>
-      </w:pPr>
-      <w:r>
-        <w:t>Les images COVID-19 proviennent de sources hétérogènes (PadChest, GitHub, SIRM, et autres dépôts publics), tandis que les classes Normal, Lung Opacity et Viral Pneumonia sont issues de bases de données uniques (RSNA, Kaggle).</w:t>
-      </w:r>
-    </w:p>
-    <w:p>
-      <w:pPr>
-        <w:ind w:firstLine="0"/>
-      </w:pPr>
-      <w:r>
-        <w:t>Les masques de segmentation pulmonaire fournis avec le dataset n'ont pas été créés manuellement par source, mais générés de façon automatique et homogène par un réseau de neurones U-Net modifié, appliqué par les auteurs du dataset sur l'ensemble des images (Chowdhury et al., 2020).</w:t>
-      </w:r>
-    </w:p>
-    <w:p>
-      <w:pPr>
-        <w:pStyle w:val="Titre2"/>
-        <w:jc w:val="both"/>
-      </w:pPr>
-      <w:bookmarkStart w:id="51" w:name="_Toc232579680"/>
-      <w:r>
-        <w:t>Outils</w:t>
       </w:r>
       <w:bookmarkEnd w:id="51"/>
     </w:p>
     <w:p>
       <w:pPr>
-        <w:ind w:firstLine="0"/>
-      </w:pPr>
-      <w:r>
-        <w:t>L'analyse a été réalisée en Python (3.11), à l'aide des bibliothèques suivantes :</w:t>
-      </w:r>
-    </w:p>
-    <w:p>
-      <w:pPr>
-        <w:pStyle w:val="Listepuces"/>
-      </w:pPr>
-      <w:r>
-        <w:t>OpenCV : chargement et traitement des images, application des masques</w:t>
-      </w:r>
-    </w:p>
-    <w:p>
-      <w:pPr>
-        <w:pStyle w:val="Listepuces"/>
-      </w:pPr>
-      <w:r>
-        <w:t>NumPy : manipulation des données image sous forme de tableaux</w:t>
-      </w:r>
-    </w:p>
-    <w:p>
-      <w:pPr>
-        <w:pStyle w:val="Listepuces"/>
-      </w:pPr>
-      <w:r>
-        <w:t>Pandas : gestion des métadonnées (sources, noms de fichiers)</w:t>
-      </w:r>
-    </w:p>
-    <w:p>
-      <w:pPr>
-        <w:pStyle w:val="Listepuces"/>
-      </w:pPr>
-      <w:r>
-        <w:t>Matplotlib / Seaborn : visualisation des distributions</w:t>
-      </w:r>
-    </w:p>
-    <w:p>
-      <w:pPr>
-        <w:pStyle w:val="Listepuces"/>
-      </w:pPr>
-      <w:r>
-        <w:t>SciPy : tests statistiques (ANOVA)</w:t>
-      </w:r>
-    </w:p>
-    <w:p>
-      <w:pPr>
         <w:pStyle w:val="Titre2"/>
-        <w:jc w:val="both"/>
-      </w:pPr>
-      <w:bookmarkStart w:id="52" w:name="_Toc232579681"/>
-      <w:r>
-        <w:t>Démarche d'exploration</w:t>
+      </w:pPr>
+      <w:bookmarkStart w:id="52" w:name="_Toc232692248"/>
+      <w:r>
+        <w:t>Données</w:t>
       </w:r>
       <w:bookmarkEnd w:id="52"/>
     </w:p>
     <w:p>
       <w:pPr>
-        <w:pStyle w:val="Listenumros"/>
-      </w:pPr>
-      <w:r>
-        <w:t>Inventaire de la structure du dataset et des métadonnées disponibles</w:t>
+        <w:ind w:firstLine="0"/>
+      </w:pPr>
+      <w:r>
+        <w:t>Le jeu de données utilisé est le COVID-19 Radiography Database, constitué par une équipe de recherche de Qatar University, University of Dhaka, et leurs collaborateurs au Pakistan et en Malaisie. Il comprend 21 165 radiographies pulmonaires (format PNG, niveaux de gris) réparties en 4 classes : Normal (10 192), Lung Opacity (6 012), COVID-19 (3 616) et Viral Pneumonia (1 345). Chaque image est accompagnée d'un masque de segmentation pulmonaire correspondant.</w:t>
       </w:r>
     </w:p>
     <w:p>
       <w:pPr>
-        <w:pStyle w:val="Listenumros"/>
-      </w:pPr>
-      <w:r>
-        <w:t>Vérification des dimensions images/masques et redimensionnement (256→299)</w:t>
+        <w:ind w:firstLine="0"/>
+      </w:pPr>
+      <w:r>
+        <w:t>Les images COVID-19 proviennent de sources hétérogènes (PadChest, GitHub, SIRM, et autres dépôts publics), tandis que les classes Normal, Lung Opacity et Viral Pneumonia sont issues de bases de données uniques (RSNA, Kaggle).</w:t>
       </w:r>
     </w:p>
     <w:p>
       <w:pPr>
-        <w:pStyle w:val="Listenumros"/>
-      </w:pPr>
-      <w:r>
-        <w:t>Analyse de la distribution des classes (déséquilibre)</w:t>
+        <w:ind w:firstLine="0"/>
+      </w:pPr>
+      <w:r>
+        <w:t>Les masques de segmentation pulmonaire fournis avec le dataset n'ont pas été créés manuellement par source, mais générés de façon automatique et homogène par un réseau de neurones U-Net modifié, appliqué par les auteurs du dataset sur l'ensemble des images (Chowdhury et al., 2020).</w:t>
       </w:r>
     </w:p>
     <w:p>
       <w:pPr>
-        <w:pStyle w:val="Listenumros"/>
-      </w:pPr>
-      <w:r>
-        <w:t>Analyse de l'hétérogénéité des sources pour la classe COVID-19 (distribution des pixels, luminosité moyenne par source)</w:t>
-      </w:r>
+        <w:pStyle w:val="Titre2"/>
+        <w:jc w:val="both"/>
+      </w:pPr>
+      <w:bookmarkStart w:id="53" w:name="_Toc232692249"/>
+      <w:r>
+        <w:t>Outils</w:t>
+      </w:r>
+      <w:bookmarkEnd w:id="53"/>
     </w:p>
     <w:p>
       <w:pPr>
-        <w:pStyle w:val="Listenumros"/>
-      </w:pPr>
-      <w:r>
-        <w:t>Validation statistique des observations visuelles par test ANOVA</w:t>
+        <w:ind w:firstLine="0"/>
+      </w:pPr>
+      <w:r>
+        <w:t>L'analyse a été réalisée en Python (3.11), à l'aide des bibliothèques suivantes :</w:t>
       </w:r>
     </w:p>
     <w:p>
       <w:pPr>
+        <w:pStyle w:val="Listepuces"/>
+      </w:pPr>
+      <w:r>
+        <w:t>OpenCV : chargement et traitement des images, application des masques</w:t>
+      </w:r>
+    </w:p>
+    <w:p>
+      <w:pPr>
+        <w:pStyle w:val="Listepuces"/>
+      </w:pPr>
+      <w:r>
+        <w:t>NumPy : manipulation des données image sous forme de tableaux</w:t>
+      </w:r>
+    </w:p>
+    <w:p>
+      <w:pPr>
+        <w:pStyle w:val="Listepuces"/>
+      </w:pPr>
+      <w:r>
+        <w:t>Pandas : gestion des métadonnées (sources, noms de fichiers)</w:t>
+      </w:r>
+    </w:p>
+    <w:p>
+      <w:pPr>
+        <w:pStyle w:val="Listepuces"/>
+      </w:pPr>
+      <w:r>
+        <w:t>Matplotlib / Seaborn : visualisation des distributions</w:t>
+      </w:r>
+    </w:p>
+    <w:p>
+      <w:pPr>
+        <w:pStyle w:val="Listepuces"/>
+      </w:pPr>
+      <w:r>
+        <w:t>SciPy : tests statistiques (ANOVA)</w:t>
+      </w:r>
+    </w:p>
+    <w:p>
+      <w:pPr>
+        <w:pStyle w:val="Titre2"/>
+        <w:jc w:val="both"/>
+      </w:pPr>
+      <w:bookmarkStart w:id="54" w:name="_Toc232692250"/>
+      <w:r>
+        <w:t>Démarche d'exploration</w:t>
+      </w:r>
+      <w:bookmarkEnd w:id="54"/>
+    </w:p>
+    <w:p>
+      <w:pPr>
+        <w:pStyle w:val="Listenumros"/>
+      </w:pPr>
+      <w:r>
+        <w:t>Inventaire de la structure du dataset et des métadonnées disponibles</w:t>
+      </w:r>
+    </w:p>
+    <w:p>
+      <w:pPr>
+        <w:pStyle w:val="Listenumros"/>
+      </w:pPr>
+      <w:r>
+        <w:t>Vérification des dimensions images/masques et redimensionnement (256→299)</w:t>
+      </w:r>
+    </w:p>
+    <w:p>
+      <w:pPr>
+        <w:pStyle w:val="Listenumros"/>
+      </w:pPr>
+      <w:r>
+        <w:t>Analyse de la distribution des classes (déséquilibre)</w:t>
+      </w:r>
+    </w:p>
+    <w:p>
+      <w:pPr>
+        <w:pStyle w:val="Listenumros"/>
+      </w:pPr>
+      <w:r>
+        <w:t>Analyse de l'hétérogénéité des sources pour la classe COVID-19 (distribution des pixels, luminosité moyenne par source)</w:t>
+      </w:r>
+    </w:p>
+    <w:p>
+      <w:pPr>
+        <w:pStyle w:val="Listenumros"/>
+      </w:pPr>
+      <w:r>
+        <w:t>Validation statistique des observations visuelles par test ANOVA</w:t>
+      </w:r>
+    </w:p>
+    <w:p>
+      <w:pPr>
         <w:pStyle w:val="Titre1"/>
       </w:pPr>
-      <w:bookmarkStart w:id="53" w:name="_Toc232579682"/>
+      <w:bookmarkStart w:id="55" w:name="_Toc232692251"/>
+      <w:r>
+        <w:lastRenderedPageBreak/>
+        <w:t>Exploration des données</w:t>
+      </w:r>
+      <w:bookmarkEnd w:id="55"/>
+    </w:p>
+    <w:p>
+      <w:pPr>
+        <w:pStyle w:val="Titre2"/>
+      </w:pPr>
+      <w:bookmarkStart w:id="56" w:name="_Toc232692252"/>
+      <w:r>
+        <w:t>Hétérogénéité des sources d'images COVID</w:t>
+      </w:r>
+      <w:bookmarkEnd w:id="56"/>
+    </w:p>
+    <w:p>
+      <w:r>
+        <w:t>L'objectif de cette analyse est d'évaluer si les images COVID, provenant de plusieurs sources distinctes (SIRM, GitHub, PadChest, et autres dépôts publics), présentent des différences systématiques susceptibles d'introduire un biais dans l'apprentissage d'un futur modèle. Un modèle entraîné sur des images hétérogènes risque en effet d'apprendre à reconnaître des artefacts techniques propres à chaque source (luminosité, contraste, cadrage) plutôt que les caractéristiques médicales réelles du Covid. Cette analyse vise donc à localiser précisément l'origine de ce biais</w:t>
+      </w:r>
+      <w:r>
+        <w:t>,</w:t>
+      </w:r>
+      <w:r>
+        <w:t xml:space="preserve"> zone pulmonaire ou simple fond d'image</w:t>
+      </w:r>
+      <w:r>
+        <w:t>,</w:t>
+      </w:r>
+      <w:r>
+        <w:t xml:space="preserve"> afin d'orienter les choix de pre-processing.</w:t>
+      </w:r>
+    </w:p>
+    <w:p>
+      <w:r>
+        <w:rPr>
+          <w:noProof/>
+        </w:rPr>
+        <mc:AlternateContent>
+          <mc:Choice Requires="wps">
+            <w:drawing>
+              <wp:anchor distT="0" distB="0" distL="114300" distR="114300" simplePos="0" relativeHeight="251665408" behindDoc="1" locked="0" layoutInCell="1" allowOverlap="1" wp14:anchorId="47630F73" wp14:editId="05585746">
+                <wp:simplePos x="0" y="0"/>
+                <wp:positionH relativeFrom="column">
+                  <wp:posOffset>373711</wp:posOffset>
+                </wp:positionH>
+                <wp:positionV relativeFrom="paragraph">
+                  <wp:posOffset>1832858</wp:posOffset>
+                </wp:positionV>
+                <wp:extent cx="3418840" cy="635"/>
+                <wp:effectExtent l="0" t="0" r="0" b="0"/>
+                <wp:wrapNone/>
+                <wp:docPr id="1921142689" name="Zone de texte 1"/>
+                <wp:cNvGraphicFramePr/>
+                <a:graphic xmlns:a="http://schemas.openxmlformats.org/drawingml/2006/main">
+                  <a:graphicData uri="http://schemas.microsoft.com/office/word/2010/wordprocessingShape">
+                    <wps:wsp>
+                      <wps:cNvSpPr txBox="1"/>
+                      <wps:spPr>
+                        <a:xfrm>
+                          <a:off x="0" y="0"/>
+                          <a:ext cx="3418840" cy="635"/>
+                        </a:xfrm>
+                        <a:prstGeom prst="rect">
+                          <a:avLst/>
+                        </a:prstGeom>
+                        <a:solidFill>
+                          <a:prstClr val="white"/>
+                        </a:solidFill>
+                        <a:ln>
+                          <a:noFill/>
+                        </a:ln>
+                      </wps:spPr>
+                      <wps:txbx>
+                        <w:txbxContent>
+                          <w:p>
+                            <w:pPr>
+                              <w:pStyle w:val="Lgende"/>
+                              <w:jc w:val="both"/>
+                              <w:rPr>
+                                <w:b w:val="0"/>
+                                <w:bCs w:val="0"/>
+                                <w:sz w:val="22"/>
+                              </w:rPr>
+                            </w:pPr>
+                            <w:r>
+                              <w:t xml:space="preserve">Figure </w:t>
+                            </w:r>
+                            <w:r>
+                              <w:t>3</w:t>
+                            </w:r>
+                            <w:r>
+                              <w:t xml:space="preserve"> : </w:t>
+                            </w:r>
+                            <w:r>
+                              <w:rPr>
+                                <w:b w:val="0"/>
+                                <w:bCs w:val="0"/>
+                              </w:rPr>
+                              <w:t>Boxplots des luminosités moyennes des COVID, images entières, avec masques, sans masques</w:t>
+                            </w:r>
+                          </w:p>
+                        </w:txbxContent>
+                      </wps:txbx>
+                      <wps:bodyPr rot="0" spcFirstLastPara="0" vertOverflow="overflow" horzOverflow="overflow" vert="horz" wrap="square" lIns="0" tIns="0" rIns="0" bIns="0" numCol="1" spcCol="0" rtlCol="0" fromWordArt="0" anchor="t" anchorCtr="0" forceAA="0" compatLnSpc="1">
+                        <a:prstTxWarp prst="textNoShape">
+                          <a:avLst/>
+                        </a:prstTxWarp>
+                        <a:spAutoFit/>
+                      </wps:bodyPr>
+                    </wps:wsp>
+                  </a:graphicData>
+                </a:graphic>
+              </wp:anchor>
+            </w:drawing>
+          </mc:Choice>
+          <mc:Fallback>
+            <w:pict>
+              <v:shape w14:anchorId="47630F73" id="_x0000_s1027" type="#_x0000_t202" style="position:absolute;left:0;text-align:left;margin-left:29.45pt;margin-top:144.3pt;width:269.2pt;height:.05pt;z-index:-251651072;visibility:visible;mso-wrap-style:square;mso-wrap-distance-left:9pt;mso-wrap-distance-top:0;mso-wrap-distance-right:9pt;mso-wrap-distance-bottom:0;mso-position-horizontal:absolute;mso-position-horizontal-relative:text;mso-position-vertical:absolute;mso-position-vertical-relative:text;v-text-anchor:top" o:gfxdata="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" stroked="f">
+                <v:textbox style="mso-fit-shape-to-text:t" inset="0,0,0,0">
+                  <w:txbxContent>
+                    <w:p>
+                      <w:pPr>
+                        <w:pStyle w:val="Lgende"/>
+                        <w:jc w:val="both"/>
+                        <w:rPr>
+                          <w:b w:val="0"/>
+                          <w:bCs w:val="0"/>
+                          <w:sz w:val="22"/>
+                        </w:rPr>
+                      </w:pPr>
+                      <w:r>
+                        <w:t xml:space="preserve">Figure </w:t>
+                      </w:r>
+                      <w:r>
+                        <w:t>3</w:t>
+                      </w:r>
+                      <w:r>
+                        <w:t xml:space="preserve"> : </w:t>
+                      </w:r>
+                      <w:r>
+                        <w:rPr>
+                          <w:b w:val="0"/>
+                          <w:bCs w:val="0"/>
+                        </w:rPr>
+                        <w:t>Boxplots des luminosités moyennes des COVID, images entières, avec masques, sans masques</w:t>
+                      </w:r>
+                    </w:p>
+                  </w:txbxContent>
+                </v:textbox>
+              </v:shape>
+            </w:pict>
+          </mc:Fallback>
+        </mc:AlternateContent>
+      </w:r>
+      <w:r>
+        <w:rPr>
+          <w:b/>
+        </w:rPr>
+        <w:drawing>
+          <wp:inline distT="0" distB="0" distL="0" distR="0" wp14:anchorId="61B13EB0" wp14:editId="0D35296F">
+            <wp:extent cx="6082748" cy="1682227"/>
+            <wp:effectExtent l="0" t="0" r="0" b="0"/>
+            <wp:docPr id="404535276" name="Image 1"/>
+            <wp:cNvGraphicFramePr>
+              <a:graphicFrameLocks xmlns:a="http://schemas.openxmlformats.org/drawingml/2006/main" noChangeAspect="1"/>
+            </wp:cNvGraphicFramePr>
+            <a:graphic xmlns:a="http://schemas.openxmlformats.org/drawingml/2006/main">
+              <a:graphicData uri="http://schemas.openxmlformats.org/drawingml/2006/picture">
+                <pic:pic xmlns:pic="http://schemas.openxmlformats.org/drawingml/2006/picture">
+                  <pic:nvPicPr>
+                    <pic:cNvPr id="404535276" name=""/>
+                    <pic:cNvPicPr/>
+                  </pic:nvPicPr>
+                  <pic:blipFill>
+                    <a:blip r:embed="rId21"/>
+                    <a:stretch>
+                      <a:fillRect/>
+                    </a:stretch>
+                  </pic:blipFill>
+                  <pic:spPr>
+                    <a:xfrm>
+                      <a:off x="0" y="0"/>
+                      <a:ext cx="6160827" cy="1703820"/>
+                    </a:xfrm>
+                    <a:prstGeom prst="rect">
+                      <a:avLst/>
+                    </a:prstGeom>
+                  </pic:spPr>
+                </pic:pic>
+              </a:graphicData>
+            </a:graphic>
+          </wp:inline>
+        </w:drawing>
+      </w:r>
+    </w:p>
+    <w:p/>
+    <w:p>
+      <w:pPr>
+        <w:ind w:firstLine="0"/>
+      </w:pPr>
+    </w:p>
+    <w:p>
+      <w:pPr>
+        <w:ind w:firstLine="0"/>
+      </w:pPr>
+      <w:r>
+        <w:t>Les trois boxplots montrent des distributions de luminosité globalement comparables entre sources, avec une médiane plus basse à l'intérieur du masque (~115-120, zone pulmonaire moins dense) qu'à l'extérieur (~150-160, zone incluant les structures osseuses et le fond).</w:t>
+      </w:r>
+    </w:p>
+    <w:p>
+      <w:pPr>
+        <w:ind w:firstLine="0"/>
+      </w:pPr>
+      <w:r>
+        <w:t>PadChest se distingue visuellement dans les trois zones par une dispersion plus importante, avec de nombreuses valeurs aberrantes vers le bas (images particulièrement sombres). Cette observation visuelle est cohérente avec sa sur-représentation dans le dataset (68% des images COVID), mais aussi avec les résultats des tests statistiques qui suivent.</w:t>
+      </w:r>
+    </w:p>
+    <w:p>
+      <w:r>
+        <w:rPr>
+          <w:b/>
+        </w:rPr>
+        <w:drawing>
+          <wp:inline distT="0" distB="0" distL="0" distR="0" wp14:anchorId="4C77C120" wp14:editId="3EE75321">
+            <wp:extent cx="6300470" cy="1898650"/>
+            <wp:effectExtent l="0" t="0" r="5080" b="6350"/>
+            <wp:docPr id="1565730366" name="Image 1"/>
+            <wp:cNvGraphicFramePr>
+              <a:graphicFrameLocks xmlns:a="http://schemas.openxmlformats.org/drawingml/2006/main" noChangeAspect="1"/>
+            </wp:cNvGraphicFramePr>
+            <a:graphic xmlns:a="http://schemas.openxmlformats.org/drawingml/2006/main">
+              <a:graphicData uri="http://schemas.openxmlformats.org/drawingml/2006/picture">
+                <pic:pic xmlns:pic="http://schemas.openxmlformats.org/drawingml/2006/picture">
+                  <pic:nvPicPr>
+                    <pic:cNvPr id="1565730366" name=""/>
+                    <pic:cNvPicPr/>
+                  </pic:nvPicPr>
+                  <pic:blipFill>
+                    <a:blip r:embed="rId22"/>
+                    <a:stretch>
+                      <a:fillRect/>
+                    </a:stretch>
+                  </pic:blipFill>
+                  <pic:spPr>
+                    <a:xfrm>
+                      <a:off x="0" y="0"/>
+                      <a:ext cx="6300470" cy="1898650"/>
+                    </a:xfrm>
+                    <a:prstGeom prst="rect">
+                      <a:avLst/>
+                    </a:prstGeom>
+                  </pic:spPr>
+                </pic:pic>
+              </a:graphicData>
+            </a:graphic>
+          </wp:inline>
+        </w:drawing>
+      </w:r>
+    </w:p>
+    <w:p>
+      <w:pPr>
+        <w:ind w:firstLine="0"/>
+      </w:pPr>
+      <w:r>
+        <w:rPr>
+          <w:noProof/>
+        </w:rPr>
+        <mc:AlternateContent>
+          <mc:Choice Requires="wps">
+            <w:drawing>
+              <wp:anchor distT="0" distB="0" distL="114300" distR="114300" simplePos="0" relativeHeight="251667456" behindDoc="1" locked="0" layoutInCell="1" allowOverlap="1" wp14:anchorId="724F2C4D" wp14:editId="62638713">
+                <wp:simplePos x="0" y="0"/>
+                <wp:positionH relativeFrom="column">
+                  <wp:posOffset>0</wp:posOffset>
+                </wp:positionH>
+                <wp:positionV relativeFrom="paragraph">
+                  <wp:posOffset>-635</wp:posOffset>
+                </wp:positionV>
+                <wp:extent cx="3418840" cy="635"/>
+                <wp:effectExtent l="0" t="0" r="0" b="0"/>
+                <wp:wrapNone/>
+                <wp:docPr id="864683524" name="Zone de texte 1"/>
+                <wp:cNvGraphicFramePr/>
+                <a:graphic xmlns:a="http://schemas.openxmlformats.org/drawingml/2006/main">
+                  <a:graphicData uri="http://schemas.microsoft.com/office/word/2010/wordprocessingShape">
+                    <wps:wsp>
+                      <wps:cNvSpPr txBox="1"/>
+                      <wps:spPr>
+                        <a:xfrm>
+                          <a:off x="0" y="0"/>
+                          <a:ext cx="3418840" cy="635"/>
+                        </a:xfrm>
+                        <a:prstGeom prst="rect">
+                          <a:avLst/>
+                        </a:prstGeom>
+                        <a:solidFill>
+                          <a:prstClr val="white"/>
+                        </a:solidFill>
+                        <a:ln>
+                          <a:noFill/>
+                        </a:ln>
+                      </wps:spPr>
+                      <wps:txbx>
+                        <w:txbxContent>
+                          <w:p>
+                            <w:pPr>
+                              <w:pStyle w:val="Lgende"/>
+                              <w:jc w:val="both"/>
+                              <w:rPr>
+                                <w:b w:val="0"/>
+                                <w:bCs w:val="0"/>
+                                <w:sz w:val="22"/>
+                              </w:rPr>
+                            </w:pPr>
+                            <w:r>
+                              <w:t xml:space="preserve">Figure </w:t>
+                            </w:r>
+                            <w:r>
+                              <w:t>4</w:t>
+                            </w:r>
+                            <w:r>
+                              <w:t xml:space="preserve"> : </w:t>
+                            </w:r>
+                            <w:r>
+                              <w:rPr>
+                                <w:b w:val="0"/>
+                                <w:bCs w:val="0"/>
+                              </w:rPr>
+                              <w:t>Tests de DUNN sur sources COVID</w:t>
+                            </w:r>
+                          </w:p>
+                        </w:txbxContent>
+                      </wps:txbx>
+                      <wps:bodyPr rot="0" spcFirstLastPara="0" vertOverflow="overflow" horzOverflow="overflow" vert="horz" wrap="square" lIns="0" tIns="0" rIns="0" bIns="0" numCol="1" spcCol="0" rtlCol="0" fromWordArt="0" anchor="t" anchorCtr="0" forceAA="0" compatLnSpc="1">
+                        <a:prstTxWarp prst="textNoShape">
+                          <a:avLst/>
+                        </a:prstTxWarp>
+                        <a:spAutoFit/>
+                      </wps:bodyPr>
+                    </wps:wsp>
+                  </a:graphicData>
+                </a:graphic>
+              </wp:anchor>
+            </w:drawing>
+          </mc:Choice>
+          <mc:Fallback>
+            <w:pict>
+              <v:shape w14:anchorId="724F2C4D" id="_x0000_s1028" type="#_x0000_t202" style="position:absolute;left:0;text-align:left;margin-left:0;margin-top:-.05pt;width:269.2pt;height:.05pt;z-index:-251649024;visibility:visible;mso-wrap-style:square;mso-wrap-distance-left:9pt;mso-wrap-distance-top:0;mso-wrap-distance-right:9pt;mso-wrap-distance-bottom:0;mso-position-horizontal:absolute;mso-position-horizontal-relative:text;mso-position-vertical:absolute;mso-position-vertical-relative:text;v-text-anchor:top" o:gfxdata="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" stroked="f">
+                <v:textbox style="mso-fit-shape-to-text:t" inset="0,0,0,0">
+                  <w:txbxContent>
+                    <w:p>
+                      <w:pPr>
+                        <w:pStyle w:val="Lgende"/>
+                        <w:jc w:val="both"/>
+                        <w:rPr>
+                          <w:b w:val="0"/>
+                          <w:bCs w:val="0"/>
+                          <w:sz w:val="22"/>
+                        </w:rPr>
+                      </w:pPr>
+                      <w:r>
+                        <w:t xml:space="preserve">Figure </w:t>
+                      </w:r>
+                      <w:r>
+                        <w:t>4</w:t>
+                      </w:r>
+                      <w:r>
+                        <w:t xml:space="preserve"> : </w:t>
+                      </w:r>
+                      <w:r>
+                        <w:rPr>
+                          <w:b w:val="0"/>
+                          <w:bCs w:val="0"/>
+                        </w:rPr>
+                        <w:t>Tests de DUNN sur sources COVID</w:t>
+                      </w:r>
+                    </w:p>
+                  </w:txbxContent>
+                </v:textbox>
+              </v:shape>
+            </w:pict>
+          </mc:Fallback>
+        </mc:AlternateContent>
+      </w:r>
+    </w:p>
+    <w:p>
+      <w:pPr>
+        <w:ind w:firstLine="0"/>
+      </w:pPr>
+    </w:p>
+    <w:p>
+      <w:pPr>
+        <w:ind w:firstLine="0"/>
+      </w:pPr>
+      <w:r>
+        <w:lastRenderedPageBreak/>
+        <w:t>Les trois tests de Kruskal-Wallis ressortent significatifs (p-value très inférieure à 5 %), confirmant l'existence d'une hétérogénéité entre sources dans les trois zones. Le test post-hoc de Dunn permet cependant d'affiner ce constat : dans la zone pulmonaire, seules 2 paires de sources sur 6 diffèrent réellement (différences modérées), alors que dans le fond de l'image, PadChest se distingue nettement de toutes les autres sources. L'essentiel du biais de source se concentre donc dans le fond plutôt que dans la zone pulmonaire elle-même — l'application des masques contribue ainsi déjà à atténuer une bonne partie du problème, même si une normalisation complémentaire de la luminosité reste recommandée, en particulier pour les images PadChest.</w:t>
+      </w:r>
+    </w:p>
+    <w:p>
+      <w:pPr>
+        <w:pStyle w:val="Titre1"/>
+      </w:pPr>
+      <w:bookmarkStart w:id="57" w:name="_Toc232692253"/>
       <w:r>
         <w:lastRenderedPageBreak/>
         <w:t>REFERENCES (à mettre en derniere place du sommaire)</w:t>
       </w:r>
-      <w:bookmarkEnd w:id="53"/>
+      <w:bookmarkEnd w:id="57"/>
     </w:p>
     <w:p>
       <w:pPr>
@@ -3536,7 +4155,7 @@
       <w:r>
         <w:t xml:space="preserve">, 2025, 5(1), 11. </w:t>
       </w:r>
-      <w:hyperlink r:id="rId21" w:tgtFrame="_new" w:history="1">
+      <w:hyperlink r:id="rId23" w:tgtFrame="_new" w:history="1">
         <w:r>
           <w:rPr>
             <w:rStyle w:val="Lienhypertexte"/>
@@ -3592,7 +4211,7 @@
       <w:r>
         <w:t xml:space="preserve">, 2020, 296(2), E115-E117. </w:t>
       </w:r>
-      <w:hyperlink r:id="rId22" w:tgtFrame="_new" w:history="1">
+      <w:hyperlink r:id="rId24" w:tgtFrame="_new" w:history="1">
         <w:r>
           <w:rPr>
             <w:rStyle w:val="Lienhypertexte"/>
@@ -3614,7 +4233,7 @@
 
 <file path=word/comments.xml><?xml version="1.0" encoding="utf-8"?>
 <w:comments xmlns:wpc="http://schemas.microsoft.com/office/word/2010/wordprocessingCanvas" xmlns:cx="http://schemas.microsoft.com/office/drawing/2014/chartex" xmlns:cx1="http://schemas.microsoft.com/office/drawing/2015/9/8/chartex" xmlns:cx2="http://schemas.microsoft.com/office/drawing/2015/10/21/chartex" xmlns:cx3="http://schemas.microsoft.com/office/drawing/2016/5/9/chartex" xmlns:cx4="http://schemas.microsoft.com/office/drawing/2016/5/10/chartex" xmlns:cx5="http://schemas.microsoft.com/office/drawing/2016/5/11/chartex" xmlns:cx6="http://schemas.microsoft.com/office/drawing/2016/5/12/chartex" xmlns:cx7="http://schemas.microsoft.com/office/drawing/2016/5/13/chartex" xmlns:cx8="http://schemas.microsoft.com/office/drawing/2016/5/14/chartex" xmlns:mc="http://schemas.openxmlformats.org/markup-compatibility/2006" xmlns:aink="http://schemas.microsoft.com/office/drawing/2016/ink" xmlns:am3d="http://schemas.microsoft.com/office/drawing/2017/model3d" xmlns:o="urn:schemas-microsoft-com:office:office" xmlns:oel="http://schemas.microsoft.com/office/2019/extlst" xmlns:r="http://schemas.openxmlformats.org/officeDocument/2006/relationships" xmlns:m="http://schemas.openxmlformats.org/officeDocument/2006/math" xmlns:v="urn:schemas-microsoft-com:vml" xmlns:wp14="http://schemas.microsoft.com/office/word/2010/wordprocessingDrawing" xmlns:wp="http://schemas.openxmlformats.org/drawingml/2006/wordprocessingDrawing" xmlns:w10="urn:schemas-microsoft-com:office:word" xmlns:w="http://schemas.openxmlformats.org/wordprocessingml/2006/main" xmlns:w14="http://schemas.microsoft.com/office/word/2010/wordml" xmlns:w15="http://schemas.microsoft.com/office/word/2012/wordml" xmlns:w16cex="http://schemas.microsoft.com/office/word/2018/wordml/cex" xmlns:w16cid="http://schemas.microsoft.com/office/word/2016/wordml/cid" xmlns:w16="http://schemas.microsoft.com/office/word/2018/wordml" xmlns:w16du="http://schemas.microsoft.com/office/word/2023/wordml/word16du" xmlns:w16sdtdh="http://schemas.microsoft.com/office/word/2020/wordml/sdtdatahash" xmlns:w16sdtfl="http://schemas.microsoft.com/office/word/2024/wordml/sdtformatlock" xmlns:w16se="http://schemas.microsoft.com/office/word/2015/wordml/symex" xmlns:wpg="http://schemas.microsoft.com/office/word/2010/wordprocessingGroup" xmlns:wpi="http://schemas.microsoft.com/office/word/2010/wordprocessingInk" xmlns:wne="http://schemas.microsoft.com/office/word/2006/wordml" xmlns:wps="http://schemas.microsoft.com/office/word/2010/wordprocessingShape" mc:Ignorable="w14 w15 w16se w16cid w16 w16cex w16sdtdh w16sdtfl w16du wp14">
-  <w:comment w:id="26" w:author="noura Romari" w:date="2026-06-17T06:38:00Z" w:initials="nR">
+  <w:comment w:id="28" w:author="noura Romari" w:date="2026-06-17T06:38:00Z" w:initials="nR">
     <w:p>
       <w:pPr>
         <w:pStyle w:val="Commentaire"/>

</xml_diff>